<commit_message>
Add journal review inputs and portable result reproduction
</commit_message>
<xml_diff>
--- a/manuscript/manuscript.docx
+++ b/manuscript/manuscript.docx
@@ -7152,7 +7152,7 @@
         <w:pStyle w:val="FirstParagraph"/>
       </w:pPr>
       <w:r>
-        <w:t xml:space="preserve">Derived results and complete comparison/support tables accompany the manuscript as Supplementary Data. The accompanying reproducibility materials contain analysis code, configuration, source identifiers, processing and label-revision provenance, and checksum manifests. Original water, climate and satellite products are available from their public providers identified in </w:t>
+        <w:t xml:space="preserve">Derived results and complete comparison/support tables accompany the manuscript as Supplementary Data. The four v0.2.0-review archives—Supplementary Code, Supplementary Data Tables, Supplementary Data Grid and Supplementary Data Context—contain analysis code, genuine exported/aggregated inputs, result tables, metadata and checksums. They support statistical replay without GitHub access; full raw-pixel processing is not repeated. Public source products are identified in </w:t>
       </w:r>
       <w:r>
         <w:fldChar w:fldCharType="begin"/>
@@ -7170,7 +7170,7 @@
         <w:fldChar w:fldCharType="end"/>
       </w:r>
       <w:r>
-        <w:t xml:space="preserve">; exact asset identifiers are retained in Supplementary Methods, Section S1. Large cached source rasters and image crops are not duplicated in the manuscript package. Analysis code, derived result tables and manuscript files are stored in the private GitHub repository </w:t>
+        <w:t xml:space="preserve">; exact assets are retained in Supplementary Methods, Section S1. The full source-raster history and dated image crops are not duplicated. Development materials are stored in the private GitHub repository </w:t>
       </w:r>
       <w:hyperlink r:id="rId19" w:history="1">
         <w:r>

</xml_diff>

<commit_message>
Revise water-change evidence and preserve unresolved validation limits
</commit_message>
<xml_diff>
--- a/manuscript/manuscript.docx
+++ b/manuscript/manuscript.docx
@@ -6,11 +6,9 @@
       <w:pPr>
         <w:pStyle w:val="Title"/>
       </w:pPr>
-      <w:bookmarkStart w:id="0" w:name="_b3818efec0fd2158bc007b2ed7b4528b6ade591"/>
-      <w:r>
-        <w:t>Seasonal surface-water decline and limits to drought assessment in northwestern Bangladesh</w:t>
-      </w:r>
-      <w:bookmarkEnd w:id="0"/>
+      <w:r>
+        <w:t>Mapped seasonal surface water decline under changing observation support in northwestern Bangladesh</w:t>
+      </w:r>
     </w:p>
     <w:p>
       <w:pPr>
@@ -188,7 +186,7 @@
         <w:pStyle w:val="BodyText"/>
       </w:pPr>
       <w:r>
-        <w:t>Main text: 6505 words | Figures: 12 | Tables: 3</w:t>
+        <w:t>Main text: 7933 words | Figures: 12 | Tables: 3</w:t>
       </w:r>
     </w:p>
     <w:p>
@@ -206,7 +204,7 @@
         <w:pStyle w:val="FirstParagraph"/>
       </w:pPr>
       <w:r>
-        <w:t>Surface-water monitoring can inform climate-resilient water management only when changes in mapped water are distinguished from changes in observation support. We assessed annual seasonal and permanent surface-water source classes in Naogaon, Chapainawabganj and Rajshahi, northwestern Bangladesh, using Joint Research Centre water histories and gridded climate data. The primary analysis covered 2000–2021 on a fixed, retrospectively selected, annually observed footprint of 1,276.41 km²; 2000–2024 results were retained as a source-version sensitivity. Separate 2015–2024 Sentinel-1 and Dynamic World analyses examined threshold sensitivity, paired support and drought-recovery identifiability. A stratified four-month comparison retained all 720 sampled pixel-months, including unresolved references. Seasonal source-class area declined from 938.53 to 699.91 km² between 2000 and 2021, a decrease of 25.42%. Negative seasonal time coefficients persisted in Naogaon and Rajshahi after adjustment for annual climate, observation effort and a 2016 processing-boundary indicator, whereas the corresponding Chapainawabganj interval included zero. Permanent source-class area increased by 41.04% between the endpoints, but its adjusted time-coefficient intervals included zero after the processing-boundary control. Increasing the Dynamic World confidence threshold from 0.5 to 0.7 raised conditional radar–optical agreement from 89.04% to 98.71%, while mean paired support fell from 11.07% to 3.29% of the separate analysis footprint. Assisted dated interpretation assigned comparison labels to 76.54% of design-weighted sampled area-time; conditional agreement was 98.56%, without establishing independent accuracy. Recovery duration remained unidentified in all nine support/reference specifications. These results support targeted investigation of declining seasonal water in the retained footprint and show why agreement, spatial support and temporal continuity should be reported together before using satellite products to assess drought resilience. The analysis does not estimate district-wide water storage, validate annual hydroperiod classes independently or attribute residual changes to groundwater abstraction.</w:t>
+        <w:t>Changes in satellite-mapped water can inform climate-resilient management only when observation support is explicit. We assessed annual seasonal and permanent water source classes in Naogaon, Chapainawabganj and Rajshahi, northwestern Bangladesh, using JRC histories and gridded climate data. The primary 2000–2021 analysis used a retrospectively selected, annually observed footprint of 1,276.41 km². Exploratory reanalysis compared seven footprint/validity cohorts, multi-year windows, simpler climate models, approximate uncertainty estimates and chronological hindcasts. Seasonal source-class area fell from 938.53 to 699.91 km² between the endpoints (25.42%); comparison of the first and final five-year means gave a smaller decline of 14.70%. A footprint based on water observed in 2000–2004 and annual validity through 2021 gave an 18.79% five-year decline. Negative seasonal coefficients persisted across the tested models, although interval and district support varied. Permanent-class gains were sensitive to observation and processing controls. Static river and 2020 cropland context separated contrasting mapped trajectories without identifying their causes. During 2015–2024, raising the Dynamic World threshold from 0.5 to 0.7 increased conditional radar–optical agreement from 89.04% to 98.71%, while mean paired support fell from 11.07% to 3.29%; wet-season support was particularly sparse. Assisted interpretation of 720 sampled pixel-months assigned 76.54% of design-weighted area-time, with 98.56% conditional agreement but no independent accuracy estimate. No actual drought-recovery duration was identified under nine support/reference specifications. Synthetic pulse diagnostics retaining real gaps and envelope widths also failed to confirm the tested deficits. The results identify a restricted-footprint seasonal decline and the observation requirements for investigating it; district-wide water storage, causal abstraction effects and independently validated resilience remain unmeasured.</w:t>
       </w:r>
     </w:p>
     <w:p>
@@ -450,9 +448,17 @@
     </w:p>
     <w:tbl>
       <w:tblPr>
-        <w:tblW w:w="5000" w:type="pct"/>
+        <w:tblW w:w="10205" w:type="dxa"/>
         <w:tblLayout w:type="fixed"/>
         <w:tblLook w:val="0020" w:firstRow="1" w:lastRow="0" w:firstColumn="0" w:lastColumn="0" w:noHBand="0" w:noVBand="0"/>
+        <w:tblBorders>
+          <w:top w:val="single" w:sz="4" w:color="D9D9D9"/>
+          <w:left w:val="single" w:sz="4" w:color="D9D9D9"/>
+          <w:bottom w:val="single" w:sz="4" w:color="D9D9D9"/>
+          <w:right w:val="single" w:sz="4" w:color="D9D9D9"/>
+          <w:insideH w:val="single" w:sz="4" w:color="D9D9D9"/>
+          <w:insideV w:val="single" w:sz="4" w:color="D9D9D9"/>
+        </w:tblBorders>
       </w:tblPr>
       <w:tblGrid>
         <w:gridCol w:w="1795"/>
@@ -469,16 +475,24 @@
           <w:tcPr>
             <w:tcW w:w="1757" w:type="dxa"/>
             <w:shd w:val="clear" w:color="auto" w:fill="EDF2F5"/>
+            <w:tcMar>
+              <w:top w:w="55" w:type="dxa"/>
+              <w:bottom w:w="55" w:type="dxa"/>
+              <w:left w:w="80" w:type="dxa"/>
+              <w:right w:w="80" w:type="dxa"/>
+            </w:tcMar>
           </w:tcPr>
           <w:p>
             <w:pPr>
               <w:keepNext/>
-              <w:spacing w:before="80" w:after="80"/>
+              <w:spacing w:before="0" w:after="40"/>
+              <w:ind w:left="0" w:right="0"/>
+              <w:jc w:val="left"/>
             </w:pPr>
             <w:r>
               <w:rPr>
                 <w:b/>
-                <w:sz w:val="20"/>
+                <w:sz w:val="18"/>
               </w:rPr>
               <w:t>Source</w:t>
             </w:r>
@@ -488,16 +502,24 @@
           <w:tcPr>
             <w:tcW w:w="1701" w:type="dxa"/>
             <w:shd w:val="clear" w:color="auto" w:fill="EDF2F5"/>
+            <w:tcMar>
+              <w:top w:w="55" w:type="dxa"/>
+              <w:bottom w:w="55" w:type="dxa"/>
+              <w:left w:w="80" w:type="dxa"/>
+              <w:right w:w="80" w:type="dxa"/>
+            </w:tcMar>
           </w:tcPr>
           <w:p>
             <w:pPr>
               <w:keepNext/>
-              <w:spacing w:before="80" w:after="80"/>
+              <w:spacing w:before="0" w:after="40"/>
+              <w:ind w:left="0" w:right="0"/>
+              <w:jc w:val="left"/>
             </w:pPr>
             <w:r>
               <w:rPr>
                 <w:b/>
-                <w:sz w:val="20"/>
+                <w:sz w:val="18"/>
               </w:rPr>
               <w:t>Period used</w:t>
             </w:r>
@@ -507,16 +529,24 @@
           <w:tcPr>
             <w:tcW w:w="1701" w:type="dxa"/>
             <w:shd w:val="clear" w:color="auto" w:fill="EDF2F5"/>
+            <w:tcMar>
+              <w:top w:w="55" w:type="dxa"/>
+              <w:bottom w:w="55" w:type="dxa"/>
+              <w:left w:w="80" w:type="dxa"/>
+              <w:right w:w="80" w:type="dxa"/>
+            </w:tcMar>
           </w:tcPr>
           <w:p>
             <w:pPr>
               <w:keepNext/>
-              <w:spacing w:before="80" w:after="80"/>
+              <w:spacing w:before="0" w:after="40"/>
+              <w:ind w:left="0" w:right="0"/>
+              <w:jc w:val="left"/>
             </w:pPr>
             <w:r>
               <w:rPr>
                 <w:b/>
-                <w:sz w:val="20"/>
+                <w:sz w:val="18"/>
               </w:rPr>
               <w:t>Product spacing</w:t>
             </w:r>
@@ -526,16 +556,24 @@
           <w:tcPr>
             <w:tcW w:w="5046" w:type="dxa"/>
             <w:shd w:val="clear" w:color="auto" w:fill="EDF2F5"/>
+            <w:tcMar>
+              <w:top w:w="55" w:type="dxa"/>
+              <w:bottom w:w="55" w:type="dxa"/>
+              <w:left w:w="80" w:type="dxa"/>
+              <w:right w:w="80" w:type="dxa"/>
+            </w:tcMar>
           </w:tcPr>
           <w:p>
             <w:pPr>
               <w:keepNext/>
-              <w:spacing w:before="80" w:after="80"/>
+              <w:spacing w:before="0" w:after="40"/>
+              <w:ind w:left="0" w:right="0"/>
+              <w:jc w:val="left"/>
             </w:pPr>
             <w:r>
               <w:rPr>
                 <w:b/>
-                <w:sz w:val="20"/>
+                <w:sz w:val="18"/>
               </w:rPr>
               <w:t>Purpose and limitation</w:t>
             </w:r>
@@ -549,15 +587,23 @@
         <w:tc>
           <w:tcPr>
             <w:tcW w:w="1757" w:type="dxa"/>
+            <w:tcMar>
+              <w:top w:w="55" w:type="dxa"/>
+              <w:bottom w:w="55" w:type="dxa"/>
+              <w:left w:w="80" w:type="dxa"/>
+              <w:right w:w="80" w:type="dxa"/>
+            </w:tcMar>
           </w:tcPr>
           <w:p>
             <w:pPr>
               <w:keepNext/>
-              <w:spacing w:before="80" w:after="80"/>
+              <w:spacing w:before="0" w:after="40"/>
+              <w:ind w:left="0" w:right="0"/>
+              <w:jc w:val="left"/>
             </w:pPr>
             <w:r>
               <w:rPr>
-                <w:sz w:val="20"/>
+                <w:sz w:val="18"/>
               </w:rPr>
               <w:t>JRC Global Surface Water</w:t>
             </w:r>
@@ -566,15 +612,23 @@
         <w:tc>
           <w:tcPr>
             <w:tcW w:w="1701" w:type="dxa"/>
+            <w:tcMar>
+              <w:top w:w="55" w:type="dxa"/>
+              <w:bottom w:w="55" w:type="dxa"/>
+              <w:left w:w="80" w:type="dxa"/>
+              <w:right w:w="80" w:type="dxa"/>
+            </w:tcMar>
           </w:tcPr>
           <w:p>
             <w:pPr>
               <w:keepNext/>
-              <w:spacing w:before="80" w:after="80"/>
+              <w:spacing w:before="0" w:after="40"/>
+              <w:ind w:left="0" w:right="0"/>
+              <w:jc w:val="left"/>
             </w:pPr>
             <w:r>
               <w:rPr>
-                <w:sz w:val="20"/>
+                <w:sz w:val="18"/>
               </w:rPr>
               <w:t>2000–2021 primary; 2022–2024 sensitivity</w:t>
             </w:r>
@@ -583,15 +637,23 @@
         <w:tc>
           <w:tcPr>
             <w:tcW w:w="1701" w:type="dxa"/>
+            <w:tcMar>
+              <w:top w:w="55" w:type="dxa"/>
+              <w:bottom w:w="55" w:type="dxa"/>
+              <w:left w:w="80" w:type="dxa"/>
+              <w:right w:w="80" w:type="dxa"/>
+            </w:tcMar>
           </w:tcPr>
           <w:p>
             <w:pPr>
               <w:keepNext/>
-              <w:spacing w:before="80" w:after="80"/>
+              <w:spacing w:before="0" w:after="40"/>
+              <w:ind w:left="0" w:right="0"/>
+              <w:jc w:val="left"/>
             </w:pPr>
             <w:r>
               <w:rPr>
-                <w:sz w:val="20"/>
+                <w:sz w:val="18"/>
               </w:rPr>
               <w:t>30 m</w:t>
             </w:r>
@@ -600,15 +662,23 @@
         <w:tc>
           <w:tcPr>
             <w:tcW w:w="5046" w:type="dxa"/>
+            <w:tcMar>
+              <w:top w:w="55" w:type="dxa"/>
+              <w:bottom w:w="55" w:type="dxa"/>
+              <w:left w:w="80" w:type="dxa"/>
+              <w:right w:w="80" w:type="dxa"/>
+            </w:tcMar>
           </w:tcPr>
           <w:p>
             <w:pPr>
               <w:keepNext/>
-              <w:spacing w:before="80" w:after="80"/>
+              <w:spacing w:before="0" w:after="40"/>
+              <w:ind w:left="0" w:right="0"/>
+              <w:jc w:val="left"/>
             </w:pPr>
             <w:r>
               <w:rPr>
-                <w:sz w:val="20"/>
+                <w:sz w:val="18"/>
               </w:rPr>
               <w:t>Annual source classes and monthly observations; corrected 2016–2021 assets and a collection change after 2021</w:t>
             </w:r>
@@ -622,15 +692,23 @@
         <w:tc>
           <w:tcPr>
             <w:tcW w:w="1757" w:type="dxa"/>
+            <w:tcMar>
+              <w:top w:w="55" w:type="dxa"/>
+              <w:bottom w:w="55" w:type="dxa"/>
+              <w:left w:w="80" w:type="dxa"/>
+              <w:right w:w="80" w:type="dxa"/>
+            </w:tcMar>
           </w:tcPr>
           <w:p>
             <w:pPr>
               <w:keepNext/>
-              <w:spacing w:before="80" w:after="80"/>
+              <w:spacing w:before="0" w:after="40"/>
+              <w:ind w:left="0" w:right="0"/>
+              <w:jc w:val="left"/>
             </w:pPr>
             <w:r>
               <w:rPr>
-                <w:sz w:val="20"/>
+                <w:sz w:val="18"/>
               </w:rPr>
               <w:t>CHIRPS version 3</w:t>
             </w:r>
@@ -639,15 +717,23 @@
         <w:tc>
           <w:tcPr>
             <w:tcW w:w="1701" w:type="dxa"/>
+            <w:tcMar>
+              <w:top w:w="55" w:type="dxa"/>
+              <w:bottom w:w="55" w:type="dxa"/>
+              <w:left w:w="80" w:type="dxa"/>
+              <w:right w:w="80" w:type="dxa"/>
+            </w:tcMar>
           </w:tcPr>
           <w:p>
             <w:pPr>
               <w:keepNext/>
-              <w:spacing w:before="80" w:after="80"/>
+              <w:spacing w:before="0" w:after="40"/>
+              <w:ind w:left="0" w:right="0"/>
+              <w:jc w:val="left"/>
             </w:pPr>
             <w:r>
               <w:rPr>
-                <w:sz w:val="20"/>
+                <w:sz w:val="18"/>
               </w:rPr>
               <w:t>1981–2024</w:t>
             </w:r>
@@ -656,15 +742,23 @@
         <w:tc>
           <w:tcPr>
             <w:tcW w:w="1701" w:type="dxa"/>
+            <w:tcMar>
+              <w:top w:w="55" w:type="dxa"/>
+              <w:bottom w:w="55" w:type="dxa"/>
+              <w:left w:w="80" w:type="dxa"/>
+              <w:right w:w="80" w:type="dxa"/>
+            </w:tcMar>
           </w:tcPr>
           <w:p>
             <w:pPr>
               <w:keepNext/>
-              <w:spacing w:before="80" w:after="80"/>
+              <w:spacing w:before="0" w:after="40"/>
+              <w:ind w:left="0" w:right="0"/>
+              <w:jc w:val="left"/>
             </w:pPr>
             <w:r>
               <w:rPr>
-                <w:sz w:val="20"/>
+                <w:sz w:val="18"/>
               </w:rPr>
               <w:t>0.05°</w:t>
             </w:r>
@@ -673,15 +767,23 @@
         <w:tc>
           <w:tcPr>
             <w:tcW w:w="5046" w:type="dxa"/>
+            <w:tcMar>
+              <w:top w:w="55" w:type="dxa"/>
+              <w:bottom w:w="55" w:type="dxa"/>
+              <w:left w:w="80" w:type="dxa"/>
+              <w:right w:w="80" w:type="dxa"/>
+            </w:tcMar>
           </w:tcPr>
           <w:p>
             <w:pPr>
               <w:keepNext/>
-              <w:spacing w:before="80" w:after="80"/>
+              <w:spacing w:before="0" w:after="40"/>
+              <w:ind w:left="0" w:right="0"/>
+              <w:jc w:val="left"/>
             </w:pPr>
             <w:r>
               <w:rPr>
-                <w:sz w:val="20"/>
+                <w:sz w:val="18"/>
               </w:rPr>
               <w:t>Rainfall and fixed-baseline SPI; complete six-pentad monthly sums</w:t>
             </w:r>
@@ -695,15 +797,23 @@
         <w:tc>
           <w:tcPr>
             <w:tcW w:w="1757" w:type="dxa"/>
+            <w:tcMar>
+              <w:top w:w="55" w:type="dxa"/>
+              <w:bottom w:w="55" w:type="dxa"/>
+              <w:left w:w="80" w:type="dxa"/>
+              <w:right w:w="80" w:type="dxa"/>
+            </w:tcMar>
           </w:tcPr>
           <w:p>
             <w:pPr>
               <w:keepNext/>
-              <w:spacing w:before="80" w:after="80"/>
+              <w:spacing w:before="0" w:after="40"/>
+              <w:ind w:left="0" w:right="0"/>
+              <w:jc w:val="left"/>
             </w:pPr>
             <w:r>
               <w:rPr>
-                <w:sz w:val="20"/>
+                <w:sz w:val="18"/>
               </w:rPr>
               <w:t>ERA5-Land monthly aggregated</w:t>
             </w:r>
@@ -712,15 +822,23 @@
         <w:tc>
           <w:tcPr>
             <w:tcW w:w="1701" w:type="dxa"/>
+            <w:tcMar>
+              <w:top w:w="55" w:type="dxa"/>
+              <w:bottom w:w="55" w:type="dxa"/>
+              <w:left w:w="80" w:type="dxa"/>
+              <w:right w:w="80" w:type="dxa"/>
+            </w:tcMar>
           </w:tcPr>
           <w:p>
             <w:pPr>
               <w:keepNext/>
-              <w:spacing w:before="80" w:after="80"/>
+              <w:spacing w:before="0" w:after="40"/>
+              <w:ind w:left="0" w:right="0"/>
+              <w:jc w:val="left"/>
             </w:pPr>
             <w:r>
               <w:rPr>
-                <w:sz w:val="20"/>
+                <w:sz w:val="18"/>
               </w:rPr>
               <w:t>2000–2024</w:t>
             </w:r>
@@ -729,15 +847,23 @@
         <w:tc>
           <w:tcPr>
             <w:tcW w:w="1701" w:type="dxa"/>
+            <w:tcMar>
+              <w:top w:w="55" w:type="dxa"/>
+              <w:bottom w:w="55" w:type="dxa"/>
+              <w:left w:w="80" w:type="dxa"/>
+              <w:right w:w="80" w:type="dxa"/>
+            </w:tcMar>
           </w:tcPr>
           <w:p>
             <w:pPr>
               <w:keepNext/>
-              <w:spacing w:before="80" w:after="80"/>
+              <w:spacing w:before="0" w:after="40"/>
+              <w:ind w:left="0" w:right="0"/>
+              <w:jc w:val="left"/>
             </w:pPr>
             <w:r>
               <w:rPr>
-                <w:sz w:val="20"/>
+                <w:sz w:val="18"/>
               </w:rPr>
               <w:t>Approximately 0.1° grid</w:t>
             </w:r>
@@ -746,15 +872,23 @@
         <w:tc>
           <w:tcPr>
             <w:tcW w:w="5046" w:type="dxa"/>
+            <w:tcMar>
+              <w:top w:w="55" w:type="dxa"/>
+              <w:bottom w:w="55" w:type="dxa"/>
+              <w:left w:w="80" w:type="dxa"/>
+              <w:right w:w="80" w:type="dxa"/>
+            </w:tcMar>
           </w:tcPr>
           <w:p>
             <w:pPr>
               <w:keepNext/>
-              <w:spacing w:before="80" w:after="80"/>
+              <w:spacing w:before="0" w:after="40"/>
+              <w:ind w:left="0" w:right="0"/>
+              <w:jc w:val="left"/>
             </w:pPr>
             <w:r>
               <w:rPr>
-                <w:sz w:val="20"/>
+                <w:sz w:val="18"/>
               </w:rPr>
               <w:t>Temperature and model-specific evaporation demand; no measured groundwater or reference ET₀</w:t>
             </w:r>
@@ -768,15 +902,23 @@
         <w:tc>
           <w:tcPr>
             <w:tcW w:w="1757" w:type="dxa"/>
+            <w:tcMar>
+              <w:top w:w="55" w:type="dxa"/>
+              <w:bottom w:w="55" w:type="dxa"/>
+              <w:left w:w="80" w:type="dxa"/>
+              <w:right w:w="80" w:type="dxa"/>
+            </w:tcMar>
           </w:tcPr>
           <w:p>
             <w:pPr>
               <w:keepNext/>
-              <w:spacing w:before="80" w:after="80"/>
+              <w:spacing w:before="0" w:after="40"/>
+              <w:ind w:left="0" w:right="0"/>
+              <w:jc w:val="left"/>
             </w:pPr>
             <w:r>
               <w:rPr>
-                <w:sz w:val="20"/>
+                <w:sz w:val="18"/>
               </w:rPr>
               <w:t>Sentinel-1 GRD</w:t>
             </w:r>
@@ -785,15 +927,23 @@
         <w:tc>
           <w:tcPr>
             <w:tcW w:w="1701" w:type="dxa"/>
+            <w:tcMar>
+              <w:top w:w="55" w:type="dxa"/>
+              <w:bottom w:w="55" w:type="dxa"/>
+              <w:left w:w="80" w:type="dxa"/>
+              <w:right w:w="80" w:type="dxa"/>
+            </w:tcMar>
           </w:tcPr>
           <w:p>
             <w:pPr>
               <w:keepNext/>
-              <w:spacing w:before="80" w:after="80"/>
+              <w:spacing w:before="0" w:after="40"/>
+              <w:ind w:left="0" w:right="0"/>
+              <w:jc w:val="left"/>
             </w:pPr>
             <w:r>
               <w:rPr>
-                <w:sz w:val="20"/>
+                <w:sz w:val="18"/>
               </w:rPr>
               <w:t>2015–2024</w:t>
             </w:r>
@@ -802,15 +952,23 @@
         <w:tc>
           <w:tcPr>
             <w:tcW w:w="1701" w:type="dxa"/>
+            <w:tcMar>
+              <w:top w:w="55" w:type="dxa"/>
+              <w:bottom w:w="55" w:type="dxa"/>
+              <w:left w:w="80" w:type="dxa"/>
+              <w:right w:w="80" w:type="dxa"/>
+            </w:tcMar>
           </w:tcPr>
           <w:p>
             <w:pPr>
               <w:keepNext/>
-              <w:spacing w:before="80" w:after="80"/>
+              <w:spacing w:before="0" w:after="40"/>
+              <w:ind w:left="0" w:right="0"/>
+              <w:jc w:val="left"/>
             </w:pPr>
             <w:r>
               <w:rPr>
-                <w:sz w:val="20"/>
+                <w:sz w:val="18"/>
               </w:rPr>
               <w:t>10 m nominal product grid</w:t>
             </w:r>
@@ -819,15 +977,23 @@
         <w:tc>
           <w:tcPr>
             <w:tcW w:w="5046" w:type="dxa"/>
+            <w:tcMar>
+              <w:top w:w="55" w:type="dxa"/>
+              <w:bottom w:w="55" w:type="dxa"/>
+              <w:left w:w="80" w:type="dxa"/>
+              <w:right w:w="80" w:type="dxa"/>
+            </w:tcMar>
           </w:tcPr>
           <w:p>
             <w:pPr>
               <w:keepNext/>
-              <w:spacing w:before="80" w:after="80"/>
+              <w:spacing w:before="0" w:after="40"/>
+              <w:ind w:left="0" w:right="0"/>
+              <w:jc w:val="left"/>
             </w:pPr>
             <w:r>
               <w:rPr>
-                <w:sz w:val="20"/>
+                <w:sz w:val="18"/>
               </w:rPr>
               <w:t>One descending orbit; monthly VV benchmark classes and method envelopes</w:t>
             </w:r>
@@ -841,15 +1007,23 @@
         <w:tc>
           <w:tcPr>
             <w:tcW w:w="1757" w:type="dxa"/>
+            <w:tcMar>
+              <w:top w:w="55" w:type="dxa"/>
+              <w:bottom w:w="55" w:type="dxa"/>
+              <w:left w:w="80" w:type="dxa"/>
+              <w:right w:w="80" w:type="dxa"/>
+            </w:tcMar>
           </w:tcPr>
           <w:p>
             <w:pPr>
               <w:keepNext/>
-              <w:spacing w:before="80" w:after="80"/>
+              <w:spacing w:before="0" w:after="40"/>
+              <w:ind w:left="0" w:right="0"/>
+              <w:jc w:val="left"/>
             </w:pPr>
             <w:r>
               <w:rPr>
-                <w:sz w:val="20"/>
+                <w:sz w:val="18"/>
               </w:rPr>
               <w:t>Dynamic World version 1</w:t>
             </w:r>
@@ -858,15 +1032,23 @@
         <w:tc>
           <w:tcPr>
             <w:tcW w:w="1701" w:type="dxa"/>
+            <w:tcMar>
+              <w:top w:w="55" w:type="dxa"/>
+              <w:bottom w:w="55" w:type="dxa"/>
+              <w:left w:w="80" w:type="dxa"/>
+              <w:right w:w="80" w:type="dxa"/>
+            </w:tcMar>
           </w:tcPr>
           <w:p>
             <w:pPr>
               <w:keepNext/>
-              <w:spacing w:before="80" w:after="80"/>
+              <w:spacing w:before="0" w:after="40"/>
+              <w:ind w:left="0" w:right="0"/>
+              <w:jc w:val="left"/>
             </w:pPr>
             <w:r>
               <w:rPr>
-                <w:sz w:val="20"/>
+                <w:sz w:val="18"/>
               </w:rPr>
               <w:t>2015–2024; availability from June 2015</w:t>
             </w:r>
@@ -875,15 +1057,23 @@
         <w:tc>
           <w:tcPr>
             <w:tcW w:w="1701" w:type="dxa"/>
+            <w:tcMar>
+              <w:top w:w="55" w:type="dxa"/>
+              <w:bottom w:w="55" w:type="dxa"/>
+              <w:left w:w="80" w:type="dxa"/>
+              <w:right w:w="80" w:type="dxa"/>
+            </w:tcMar>
           </w:tcPr>
           <w:p>
             <w:pPr>
               <w:keepNext/>
-              <w:spacing w:before="80" w:after="80"/>
+              <w:spacing w:before="0" w:after="40"/>
+              <w:ind w:left="0" w:right="0"/>
+              <w:jc w:val="left"/>
             </w:pPr>
             <w:r>
               <w:rPr>
-                <w:sz w:val="20"/>
+                <w:sz w:val="18"/>
               </w:rPr>
               <w:t>10 m</w:t>
             </w:r>
@@ -892,15 +1082,23 @@
         <w:tc>
           <w:tcPr>
             <w:tcW w:w="5046" w:type="dxa"/>
+            <w:tcMar>
+              <w:top w:w="55" w:type="dxa"/>
+              <w:bottom w:w="55" w:type="dxa"/>
+              <w:left w:w="80" w:type="dxa"/>
+              <w:right w:w="80" w:type="dxa"/>
+            </w:tcMar>
           </w:tcPr>
           <w:p>
             <w:pPr>
               <w:keepNext/>
-              <w:spacing w:before="80" w:after="80"/>
+              <w:spacing w:before="0" w:after="40"/>
+              <w:ind w:left="0" w:right="0"/>
+              <w:jc w:val="left"/>
             </w:pPr>
             <w:r>
               <w:rPr>
-                <w:sz w:val="20"/>
+                <w:sz w:val="18"/>
               </w:rPr>
               <w:t>Four confidence thresholds; unclassified support retained</w:t>
             </w:r>
@@ -914,15 +1112,23 @@
         <w:tc>
           <w:tcPr>
             <w:tcW w:w="1757" w:type="dxa"/>
+            <w:tcMar>
+              <w:top w:w="55" w:type="dxa"/>
+              <w:bottom w:w="55" w:type="dxa"/>
+              <w:left w:w="80" w:type="dxa"/>
+              <w:right w:w="80" w:type="dxa"/>
+            </w:tcMar>
           </w:tcPr>
           <w:p>
             <w:pPr>
               <w:keepNext/>
-              <w:spacing w:before="80" w:after="80"/>
+              <w:spacing w:before="0" w:after="40"/>
+              <w:ind w:left="0" w:right="0"/>
+              <w:jc w:val="left"/>
             </w:pPr>
             <w:r>
               <w:rPr>
-                <w:sz w:val="20"/>
+                <w:sz w:val="18"/>
               </w:rPr>
               <w:t>Sentinel-2 Level-2A</w:t>
             </w:r>
@@ -931,15 +1137,23 @@
         <w:tc>
           <w:tcPr>
             <w:tcW w:w="1701" w:type="dxa"/>
+            <w:tcMar>
+              <w:top w:w="55" w:type="dxa"/>
+              <w:bottom w:w="55" w:type="dxa"/>
+              <w:left w:w="80" w:type="dxa"/>
+              <w:right w:w="80" w:type="dxa"/>
+            </w:tcMar>
           </w:tcPr>
           <w:p>
             <w:pPr>
               <w:keepNext/>
-              <w:spacing w:before="80" w:after="80"/>
+              <w:spacing w:before="0" w:after="40"/>
+              <w:ind w:left="0" w:right="0"/>
+              <w:jc w:val="left"/>
             </w:pPr>
             <w:r>
               <w:rPr>
-                <w:sz w:val="20"/>
+                <w:sz w:val="18"/>
               </w:rPr>
               <w:t>Four sampled months</w:t>
             </w:r>
@@ -948,15 +1162,23 @@
         <w:tc>
           <w:tcPr>
             <w:tcW w:w="1701" w:type="dxa"/>
+            <w:tcMar>
+              <w:top w:w="55" w:type="dxa"/>
+              <w:bottom w:w="55" w:type="dxa"/>
+              <w:left w:w="80" w:type="dxa"/>
+              <w:right w:w="80" w:type="dxa"/>
+            </w:tcMar>
           </w:tcPr>
           <w:p>
             <w:pPr>
               <w:keepNext/>
-              <w:spacing w:before="80" w:after="80"/>
+              <w:spacing w:before="0" w:after="40"/>
+              <w:ind w:left="0" w:right="0"/>
+              <w:jc w:val="left"/>
             </w:pPr>
             <w:r>
               <w:rPr>
-                <w:sz w:val="20"/>
+                <w:sz w:val="18"/>
               </w:rPr>
               <w:t>10 m display; B11/SCL native 20 m</w:t>
             </w:r>
@@ -965,15 +1187,23 @@
         <w:tc>
           <w:tcPr>
             <w:tcW w:w="5046" w:type="dxa"/>
+            <w:tcMar>
+              <w:top w:w="55" w:type="dxa"/>
+              <w:bottom w:w="55" w:type="dxa"/>
+              <w:left w:w="80" w:type="dxa"/>
+              <w:right w:w="80" w:type="dxa"/>
+            </w:tcMar>
           </w:tcPr>
           <w:p>
             <w:pPr>
               <w:keepNext/>
-              <w:spacing w:before="80" w:after="80"/>
+              <w:spacing w:before="0" w:after="40"/>
+              <w:ind w:left="0" w:right="0"/>
+              <w:jc w:val="left"/>
             </w:pPr>
             <w:r>
               <w:rPr>
-                <w:sz w:val="20"/>
+                <w:sz w:val="18"/>
               </w:rPr>
               <w:t>Actual dated crop values and assisted interpretation; not independent ground truth</w:t>
             </w:r>
@@ -987,14 +1217,22 @@
         <w:tc>
           <w:tcPr>
             <w:tcW w:w="1757" w:type="dxa"/>
+            <w:tcMar>
+              <w:top w:w="55" w:type="dxa"/>
+              <w:bottom w:w="55" w:type="dxa"/>
+              <w:left w:w="80" w:type="dxa"/>
+              <w:right w:w="80" w:type="dxa"/>
+            </w:tcMar>
           </w:tcPr>
           <w:p>
             <w:pPr>
-              <w:spacing w:before="80" w:after="80"/>
+              <w:spacing w:before="0" w:after="40"/>
+              <w:ind w:left="0" w:right="0"/>
+              <w:jc w:val="left"/>
             </w:pPr>
             <w:r>
               <w:rPr>
-                <w:sz w:val="20"/>
+                <w:sz w:val="18"/>
               </w:rPr>
               <w:t>geoBoundaries gbOpen ADM2</w:t>
             </w:r>
@@ -1003,14 +1241,22 @@
         <w:tc>
           <w:tcPr>
             <w:tcW w:w="1701" w:type="dxa"/>
+            <w:tcMar>
+              <w:top w:w="55" w:type="dxa"/>
+              <w:bottom w:w="55" w:type="dxa"/>
+              <w:left w:w="80" w:type="dxa"/>
+              <w:right w:w="80" w:type="dxa"/>
+            </w:tcMar>
           </w:tcPr>
           <w:p>
             <w:pPr>
-              <w:spacing w:before="80" w:after="80"/>
+              <w:spacing w:before="0" w:after="40"/>
+              <w:ind w:left="0" w:right="0"/>
+              <w:jc w:val="left"/>
             </w:pPr>
             <w:r>
               <w:rPr>
-                <w:sz w:val="20"/>
+                <w:sz w:val="18"/>
               </w:rPr>
               <w:t>Represented year 2020</w:t>
             </w:r>
@@ -1019,14 +1265,22 @@
         <w:tc>
           <w:tcPr>
             <w:tcW w:w="1701" w:type="dxa"/>
+            <w:tcMar>
+              <w:top w:w="55" w:type="dxa"/>
+              <w:bottom w:w="55" w:type="dxa"/>
+              <w:left w:w="80" w:type="dxa"/>
+              <w:right w:w="80" w:type="dxa"/>
+            </w:tcMar>
           </w:tcPr>
           <w:p>
             <w:pPr>
-              <w:spacing w:before="80" w:after="80"/>
+              <w:spacing w:before="0" w:after="40"/>
+              <w:ind w:left="0" w:right="0"/>
+              <w:jc w:val="left"/>
             </w:pPr>
             <w:r>
               <w:rPr>
-                <w:sz w:val="20"/>
+                <w:sz w:val="18"/>
               </w:rPr>
               <w:t>Vector district polygons</w:t>
             </w:r>
@@ -1035,16 +1289,226 @@
         <w:tc>
           <w:tcPr>
             <w:tcW w:w="5046" w:type="dxa"/>
+            <w:tcMar>
+              <w:top w:w="55" w:type="dxa"/>
+              <w:bottom w:w="55" w:type="dxa"/>
+              <w:left w:w="80" w:type="dxa"/>
+              <w:right w:w="80" w:type="dxa"/>
+            </w:tcMar>
           </w:tcPr>
           <w:p>
             <w:pPr>
-              <w:spacing w:before="80" w:after="80"/>
+              <w:spacing w:before="0" w:after="40"/>
+              <w:ind w:left="0" w:right="0"/>
+              <w:jc w:val="left"/>
             </w:pPr>
             <w:r>
               <w:rPr>
-                <w:sz w:val="20"/>
+                <w:sz w:val="18"/>
               </w:rPr>
               <w:t>Fixed reporting boundaries; administrative districts are not catchments</w:t>
+            </w:r>
+          </w:p>
+        </w:tc>
+      </w:tr>
+      <w:tr>
+        <w:trPr>
+          <w:cantSplit/>
+        </w:trPr>
+        <w:tc>
+          <w:tcPr>
+            <w:tcW w:w="1757" w:type="dxa"/>
+            <w:tcMar>
+              <w:top w:w="55" w:type="dxa"/>
+              <w:bottom w:w="55" w:type="dxa"/>
+              <w:left w:w="80" w:type="dxa"/>
+              <w:right w:w="80" w:type="dxa"/>
+            </w:tcMar>
+          </w:tcPr>
+          <w:p>
+            <w:pPr>
+              <w:spacing w:before="0" w:after="40"/>
+              <w:ind w:left="0" w:right="0"/>
+              <w:jc w:val="left"/>
+            </w:pPr>
+            <w:r>
+              <w:rPr>
+                <w:sz w:val="18"/>
+              </w:rPr>
+              <w:t>HydroRIVERS Asia version 1</w:t>
+            </w:r>
+          </w:p>
+        </w:tc>
+        <w:tc>
+          <w:tcPr>
+            <w:tcW w:w="1701" w:type="dxa"/>
+            <w:tcMar>
+              <w:top w:w="55" w:type="dxa"/>
+              <w:bottom w:w="55" w:type="dxa"/>
+              <w:left w:w="80" w:type="dxa"/>
+              <w:right w:w="80" w:type="dxa"/>
+            </w:tcMar>
+          </w:tcPr>
+          <w:p>
+            <w:pPr>
+              <w:spacing w:before="0" w:after="40"/>
+              <w:ind w:left="0" w:right="0"/>
+              <w:jc w:val="left"/>
+            </w:pPr>
+            <w:r>
+              <w:rPr>
+                <w:sz w:val="18"/>
+              </w:rPr>
+              <w:t>Static network</w:t>
+            </w:r>
+          </w:p>
+        </w:tc>
+        <w:tc>
+          <w:tcPr>
+            <w:tcW w:w="1701" w:type="dxa"/>
+            <w:tcMar>
+              <w:top w:w="55" w:type="dxa"/>
+              <w:bottom w:w="55" w:type="dxa"/>
+              <w:left w:w="80" w:type="dxa"/>
+              <w:right w:w="80" w:type="dxa"/>
+            </w:tcMar>
+          </w:tcPr>
+          <w:p>
+            <w:pPr>
+              <w:spacing w:before="0" w:after="40"/>
+              <w:ind w:left="0" w:right="0"/>
+              <w:jc w:val="left"/>
+            </w:pPr>
+            <w:r>
+              <w:rPr>
+                <w:sz w:val="18"/>
+              </w:rPr>
+              <w:t>15 arc-second source hydrography</w:t>
+            </w:r>
+          </w:p>
+        </w:tc>
+        <w:tc>
+          <w:tcPr>
+            <w:tcW w:w="5046" w:type="dxa"/>
+            <w:tcMar>
+              <w:top w:w="55" w:type="dxa"/>
+              <w:bottom w:w="55" w:type="dxa"/>
+              <w:left w:w="80" w:type="dxa"/>
+              <w:right w:w="80" w:type="dxa"/>
+            </w:tcMar>
+          </w:tcPr>
+          <w:p>
+            <w:pPr>
+              <w:spacing w:before="0" w:after="40"/>
+              <w:ind w:left="0" w:right="0"/>
+              <w:jc w:val="left"/>
+            </w:pPr>
+            <w:r>
+              <w:rPr>
+                <w:sz w:val="18"/>
+              </w:rPr>
+              <w:t>River-proximity context; not measured channel width or discharge</w:t>
+            </w:r>
+          </w:p>
+        </w:tc>
+      </w:tr>
+      <w:tr>
+        <w:trPr>
+          <w:cantSplit/>
+        </w:trPr>
+        <w:tc>
+          <w:tcPr>
+            <w:tcW w:w="1757" w:type="dxa"/>
+            <w:tcMar>
+              <w:top w:w="55" w:type="dxa"/>
+              <w:bottom w:w="55" w:type="dxa"/>
+              <w:left w:w="80" w:type="dxa"/>
+              <w:right w:w="80" w:type="dxa"/>
+            </w:tcMar>
+          </w:tcPr>
+          <w:p>
+            <w:pPr>
+              <w:spacing w:before="0" w:after="40"/>
+              <w:ind w:left="0" w:right="0"/>
+              <w:jc w:val="left"/>
+            </w:pPr>
+            <w:r>
+              <w:rPr>
+                <w:sz w:val="18"/>
+              </w:rPr>
+              <w:t>ESA WorldCover 2020 version 100</w:t>
+            </w:r>
+          </w:p>
+        </w:tc>
+        <w:tc>
+          <w:tcPr>
+            <w:tcW w:w="1701" w:type="dxa"/>
+            <w:tcMar>
+              <w:top w:w="55" w:type="dxa"/>
+              <w:bottom w:w="55" w:type="dxa"/>
+              <w:left w:w="80" w:type="dxa"/>
+              <w:right w:w="80" w:type="dxa"/>
+            </w:tcMar>
+          </w:tcPr>
+          <w:p>
+            <w:pPr>
+              <w:spacing w:before="0" w:after="40"/>
+              <w:ind w:left="0" w:right="0"/>
+              <w:jc w:val="left"/>
+            </w:pPr>
+            <w:r>
+              <w:rPr>
+                <w:sz w:val="18"/>
+              </w:rPr>
+              <w:t>2020</w:t>
+            </w:r>
+          </w:p>
+        </w:tc>
+        <w:tc>
+          <w:tcPr>
+            <w:tcW w:w="1701" w:type="dxa"/>
+            <w:tcMar>
+              <w:top w:w="55" w:type="dxa"/>
+              <w:bottom w:w="55" w:type="dxa"/>
+              <w:left w:w="80" w:type="dxa"/>
+              <w:right w:w="80" w:type="dxa"/>
+            </w:tcMar>
+          </w:tcPr>
+          <w:p>
+            <w:pPr>
+              <w:spacing w:before="0" w:after="40"/>
+              <w:ind w:left="0" w:right="0"/>
+              <w:jc w:val="left"/>
+            </w:pPr>
+            <w:r>
+              <w:rPr>
+                <w:sz w:val="18"/>
+              </w:rPr>
+              <w:t>10 m</w:t>
+            </w:r>
+          </w:p>
+        </w:tc>
+        <w:tc>
+          <w:tcPr>
+            <w:tcW w:w="5046" w:type="dxa"/>
+            <w:tcMar>
+              <w:top w:w="55" w:type="dxa"/>
+              <w:bottom w:w="55" w:type="dxa"/>
+              <w:left w:w="80" w:type="dxa"/>
+              <w:right w:w="80" w:type="dxa"/>
+            </w:tcMar>
+          </w:tcPr>
+          <w:p>
+            <w:pPr>
+              <w:spacing w:before="0" w:after="40"/>
+              <w:ind w:left="0" w:right="0"/>
+              <w:jc w:val="left"/>
+            </w:pPr>
+            <w:r>
+              <w:rPr>
+                <w:sz w:val="18"/>
+              </w:rPr>
+              <w:t>Static cropland context; modal class on JRC grid; not historical land-use change</w:t>
             </w:r>
           </w:p>
         </w:tc>
@@ -3640,33 +4104,79 @@
         <w:pStyle w:val="FirstParagraph"/>
       </w:pPr>
       <w:r>
-        <w:t>This range permits arbitrary agreement or disagreement for unresolved labels. It bounds completion of the proxy comparison, not physical-water accuracy. Approximate sampling intervals used 2,000 pixel-month bootstrap replicates within the original strata, with seed 20261016. These intervals omit reference, timing, radiometric, registration and spatial-clustering errors. Degenerate conditional bootstrap intervals were left unavailable rather than presented as certainty.</w:t>
+        <w:t>This range permits arbitrary agreement or disagreement for unresolved labels. It bounds completion of the proxy comparison, not physical-water accuracy. Approximate sampling intervals used 2,000 pixel-month percentile bootstrap replicates within the original strata, with seed 20261016. No finite-population correction or spatial-cluster model was used. These intervals exclude reference, timing, radiometric, registration and spatial-clustering errors and do not resolve nonrandom reference failure. Degenerate conditional bootstrap intervals remained unavailable rather than being presented as certainty.</w:t>
       </w:r>
     </w:p>
     <w:p>
       <w:pPr>
-        <w:pStyle w:val="BodyText"/>
-      </w:pPr>
-      <w:r>
-        <w:t>The stratified percentile bootstrap did not use a finite-population correction or a spatial-cluster model. Its intervals concern approximate pixel-month sampling variation and exclude reference error, temporal misalignment and nonrandom missingness. A conditional bootstrap with no empirical variation remained unavailable instead of being presented as a zero-width accuracy interval.</w:t>
+        <w:pStyle w:val="Heading2"/>
+      </w:pPr>
+      <w:r>
+        <w:t>2.8 Exploratory robustness and landscape context</w:t>
       </w:r>
     </w:p>
     <w:p>
       <w:pPr>
-        <w:pStyle w:val="Heading2"/>
-      </w:pPr>
-      <w:bookmarkStart w:id="13" w:name="_c0fc269caafa166524286e87381ea2ab590d1a7"/>
-      <w:r>
-        <w:t>2.8 Reproducibility and analytical scope</w:t>
-      </w:r>
-      <w:bookmarkEnd w:id="13"/>
+        <w:pStyle w:val="BodyText"/>
+      </w:pPr>
+      <w:r>
+        <w:t>A revision protocol was frozen before the new sensitivity outputs were examined; the original study results were already known. Seven overlapping cohorts were retained: C1, the original 2000–2024 ever-water footprint with all 25 annual classes valid; C2, the same ever-water condition with validity required only through 2021; C3, ever-water and complete annual validity during 2000–2021; C4, any seasonal/permanent class in 2000–2004, all five baseline classes valid, and complete annual validity through 2021; C5, the same baseline-water condition with available observations each year; C6, 2000–2021 ever-water with at least twenty valid annual classes; and C7, all annually valid pixels through 2021 within the district boundaries, without an ever-water restriction. C7 is still an observed subset, not full-district coverage. C1–C7 union areas were 1,276.41, 1,276.41, 1,271.76, 1,196.72, 1,252.36, 1,472.73 and 1,299.60 km², respectively. Available-support analyses required at least 95% annual coverage; missing-area bounds were retained rather than classifying gaps as nonwater.</w:t>
+      </w:r>
     </w:p>
     <w:p>
       <w:pPr>
+        <w:pStyle w:val="BodyText"/>
+      </w:pPr>
+      <w:r>
+        <w:t>For each cohort, first-to-final one-, three- and five-year windows complemented whole-series trends. A multi-year comparison required every year in both windows to pass its support rule. A separate monthly diagnostic intersected valid observations for each calendar month across all 22 primary years within the baseline-water footprint; a trend required retention of at least 20% of that footprint. This diagnostic measures the cost of equal calendar-month support and cannot reconstruct missing seasons.</w:t>
+      </w:r>
+    </w:p>
+    <w:p>
+      <w:pPr>
+        <w:pStyle w:val="BodyText"/>
+      </w:pPr>
+      <w:r>
+        <w:t>The annual model sequence included time alone; time plus June–September rainfall; those terms plus annual observed months, wet-season observed months and the 2016 indicator; an additional preceding October–May rainfall term; and the original annual-climate control specification in Equation (1). Each class was modeled separately. Fits required at least five residual degrees of freedom. Calendar-distance HAC lags zero and two, all leave-one-year-out fits, and a short 2013–2021 time/monsoon analysis were retained. Approximate fixed-design circular residual block bootstrap intervals used lengths two, three and four, 2,000 replicates and seed 20261019. Bootstrap intervals were unavailable for nonconsecutive selected years; gaps were not compressed. District BY families comprised six district-by-class tests per cohort/model. These overlapping sensitivities are not independent confirmations.</w:t>
+      </w:r>
+    </w:p>
+    <w:p>
+      <w:pPr>
+        <w:pStyle w:val="BodyText"/>
+      </w:pPr>
+      <w:r>
+        <w:t>New chronological checks used two-year tests starting in 2013, 2017 and 2020, with at least twelve earlier training observations. Mean and trend-only benchmarks were fitted on the same accepted training/test folds as each candidate. Pooled RMSE was the square root of total test squared error divided by test count. A constant processing indicator invalidated earlier training designs, leaving only two folds/four test years for controlled models, compared with three folds/six years for the monsoon model. These retrospective conditional hindcasts neither validate water classification nor establish operational forecasting performance.</w:t>
+      </w:r>
+    </w:p>
+    <w:p>
+      <w:pPr>
+        <w:pStyle w:val="BodyText"/>
+      </w:pPr>
+      <w:r>
+        <w:t>HydroRIVERS Asia version 1 centerlines supplied static river context (Lehner and Grill, 2013), and ESA WorldCover 2020 version 100 supplied a static 10 m cropland class (Zanaga et al., 2021). River buffers were formed in EPSG:32645 at 200, 500 and 1,000 m; 500 m was the designated central setting. WorldCover classes were transferred by modal aggregation to the native JRC grid. Within each cohort, river proximity and, away from rivers, 2020 cropland versus other cover formed exhaustive groups. Buffer ranges are sensitivity ranges, not confidence intervals. This context does not identify individual ponds, historical cultivation, irrigation abstraction or river discharge.</w:t>
+      </w:r>
+    </w:p>
+    <w:p>
+      <w:pPr>
+        <w:pStyle w:val="BodyText"/>
+      </w:pPr>
+      <w:r>
+        <w:t>A missingness-aware synthetic diagnostic placed rectangular deficits of zero, 0.01, 0.02, 0.05, 0.10 and 0.20 of cohort area at every monthly onset during 2015–2024, for durations of one, three and six months. A zero anomaly baseline returned abruptly at the pulse end, so the imposed recovery time was zero months. The diagnostic retained actual observation gaps, anomaly-envelope half-widths and calendar-reference eligibility, requiring three pre-event observations and two recovery confirmations. It tested detectability under those widths, not a physical drought model or empirical recovery distribution. No actual missing water observations or reference labels were filled.</w:t>
+      </w:r>
+    </w:p>
+    <w:p>
+      <w:pPr>
+        <w:pStyle w:val="Heading2"/>
+      </w:pPr>
+      <w:r>
+        <w:t>2.9 Reproducibility and analytical scope</w:t>
+      </w:r>
+    </w:p>
+    <w:p>
+      <w:pPr>
         <w:pStyle w:val="FirstParagraph"/>
       </w:pPr>
       <w:r>
-        <w:t>The completed computational audit verified 9,393 source-file checksums and reconciled the downloaded export inventories and reported numerical tables. The active analysis retains the corrected dated-label version and its history. Manuscript preparation read these frozen results without refitting the scientific models. Figure inputs, table copies and their SHA-256 hashes are recorded separately. The analysis environment used Python 3.12, NumPy 2.3.5, pandas 2.3.3, statsmodels 0.14.5 and rasterio 1.5.0. Software checks establish reproducibility properties; they do not establish environmental accuracy. The overall design is exploratory, and results were known when the final restricted scope was documented.</w:t>
+        <w:t>The original computational audit verified 9,393 source-file checksums and reconciled export inventories. The revision additionally rechecked all fifty annual/monthly source rasters, reconstructed the original annual summaries to within 10⁻⁶ km², and reran the explicitly frozen exploratory models. The corrected dated-label version and its history were unchanged. Protocols, source versions, output tables, failed fits and SHA-256 manifests accompany the code. An initial calendar-gap bootstrap implementation was corrected before the reported outputs were frozen; superseded intervals are excluded. The environment used Python 3.12, NumPy 2.3.5, pandas 2.3.3, statsmodels 0.14.5 and rasterio 1.5.0. Computational checks do not establish environmental accuracy or confirmatory inference.</w:t>
       </w:r>
     </w:p>
     <w:p>
@@ -3829,9 +4339,17 @@
     </w:p>
     <w:tbl>
       <w:tblPr>
-        <w:tblW w:w="5000" w:type="pct"/>
+        <w:tblW w:w="10205" w:type="dxa"/>
         <w:tblLayout w:type="fixed"/>
         <w:tblLook w:val="0020" w:firstRow="1" w:lastRow="0" w:firstColumn="0" w:lastColumn="0" w:noHBand="0" w:noVBand="0"/>
+        <w:tblBorders>
+          <w:top w:val="single" w:sz="4" w:color="D9D9D9"/>
+          <w:left w:val="single" w:sz="4" w:color="D9D9D9"/>
+          <w:bottom w:val="single" w:sz="4" w:color="D9D9D9"/>
+          <w:right w:val="single" w:sz="4" w:color="D9D9D9"/>
+          <w:insideH w:val="single" w:sz="4" w:color="D9D9D9"/>
+          <w:insideV w:val="single" w:sz="4" w:color="D9D9D9"/>
+        </w:tblBorders>
       </w:tblPr>
       <w:tblGrid>
         <w:gridCol w:w="2317"/>
@@ -3850,16 +4368,24 @@
           <w:tcPr>
             <w:tcW w:w="2268" w:type="dxa"/>
             <w:shd w:val="clear" w:color="auto" w:fill="EDF2F5"/>
+            <w:tcMar>
+              <w:top w:w="55" w:type="dxa"/>
+              <w:bottom w:w="55" w:type="dxa"/>
+              <w:left w:w="80" w:type="dxa"/>
+              <w:right w:w="80" w:type="dxa"/>
+            </w:tcMar>
           </w:tcPr>
           <w:p>
             <w:pPr>
               <w:keepNext/>
-              <w:spacing w:before="80" w:after="80"/>
+              <w:spacing w:before="0" w:after="40"/>
+              <w:ind w:left="0" w:right="0"/>
+              <w:jc w:val="left"/>
             </w:pPr>
             <w:r>
               <w:rPr>
                 <w:b/>
-                <w:sz w:val="20"/>
+                <w:sz w:val="18"/>
               </w:rPr>
               <w:t>Region</w:t>
             </w:r>
@@ -3869,16 +4395,24 @@
           <w:tcPr>
             <w:tcW w:w="1474" w:type="dxa"/>
             <w:shd w:val="clear" w:color="auto" w:fill="EDF2F5"/>
+            <w:tcMar>
+              <w:top w:w="55" w:type="dxa"/>
+              <w:bottom w:w="55" w:type="dxa"/>
+              <w:left w:w="80" w:type="dxa"/>
+              <w:right w:w="80" w:type="dxa"/>
+            </w:tcMar>
           </w:tcPr>
           <w:p>
             <w:pPr>
               <w:keepNext/>
-              <w:spacing w:before="80" w:after="80"/>
+              <w:spacing w:before="0" w:after="40"/>
+              <w:ind w:left="0" w:right="0"/>
+              <w:jc w:val="left"/>
             </w:pPr>
             <w:r>
               <w:rPr>
                 <w:b/>
-                <w:sz w:val="20"/>
+                <w:sz w:val="18"/>
               </w:rPr>
               <w:t>Source class</w:t>
             </w:r>
@@ -3888,17 +4422,24 @@
           <w:tcPr>
             <w:tcW w:w="1587" w:type="dxa"/>
             <w:shd w:val="clear" w:color="auto" w:fill="EDF2F5"/>
+            <w:tcMar>
+              <w:top w:w="55" w:type="dxa"/>
+              <w:bottom w:w="55" w:type="dxa"/>
+              <w:left w:w="80" w:type="dxa"/>
+              <w:right w:w="80" w:type="dxa"/>
+            </w:tcMar>
           </w:tcPr>
           <w:p>
             <w:pPr>
               <w:keepNext/>
-              <w:spacing w:before="80" w:after="80"/>
+              <w:spacing w:before="0" w:after="40"/>
+              <w:ind w:left="0" w:right="0"/>
               <w:jc w:val="right"/>
             </w:pPr>
             <w:r>
               <w:rPr>
                 <w:b/>
-                <w:sz w:val="20"/>
+                <w:sz w:val="18"/>
               </w:rPr>
               <w:t>2000 (km²)</w:t>
             </w:r>
@@ -3908,17 +4449,24 @@
           <w:tcPr>
             <w:tcW w:w="1587" w:type="dxa"/>
             <w:shd w:val="clear" w:color="auto" w:fill="EDF2F5"/>
+            <w:tcMar>
+              <w:top w:w="55" w:type="dxa"/>
+              <w:bottom w:w="55" w:type="dxa"/>
+              <w:left w:w="80" w:type="dxa"/>
+              <w:right w:w="80" w:type="dxa"/>
+            </w:tcMar>
           </w:tcPr>
           <w:p>
             <w:pPr>
               <w:keepNext/>
-              <w:spacing w:before="80" w:after="80"/>
+              <w:spacing w:before="0" w:after="40"/>
+              <w:ind w:left="0" w:right="0"/>
               <w:jc w:val="right"/>
             </w:pPr>
             <w:r>
               <w:rPr>
                 <w:b/>
-                <w:sz w:val="20"/>
+                <w:sz w:val="18"/>
               </w:rPr>
               <w:t>2021 (km²)</w:t>
             </w:r>
@@ -3928,17 +4476,24 @@
           <w:tcPr>
             <w:tcW w:w="1644" w:type="dxa"/>
             <w:shd w:val="clear" w:color="auto" w:fill="EDF2F5"/>
+            <w:tcMar>
+              <w:top w:w="55" w:type="dxa"/>
+              <w:bottom w:w="55" w:type="dxa"/>
+              <w:left w:w="80" w:type="dxa"/>
+              <w:right w:w="80" w:type="dxa"/>
+            </w:tcMar>
           </w:tcPr>
           <w:p>
             <w:pPr>
               <w:keepNext/>
-              <w:spacing w:before="80" w:after="80"/>
+              <w:spacing w:before="0" w:after="40"/>
+              <w:ind w:left="0" w:right="0"/>
               <w:jc w:val="right"/>
             </w:pPr>
             <w:r>
               <w:rPr>
                 <w:b/>
-                <w:sz w:val="20"/>
+                <w:sz w:val="18"/>
               </w:rPr>
               <w:t>Change (km²)</w:t>
             </w:r>
@@ -3948,17 +4503,24 @@
           <w:tcPr>
             <w:tcW w:w="1644" w:type="dxa"/>
             <w:shd w:val="clear" w:color="auto" w:fill="EDF2F5"/>
+            <w:tcMar>
+              <w:top w:w="55" w:type="dxa"/>
+              <w:bottom w:w="55" w:type="dxa"/>
+              <w:left w:w="80" w:type="dxa"/>
+              <w:right w:w="80" w:type="dxa"/>
+            </w:tcMar>
           </w:tcPr>
           <w:p>
             <w:pPr>
               <w:keepNext/>
-              <w:spacing w:before="80" w:after="80"/>
+              <w:spacing w:before="0" w:after="40"/>
+              <w:ind w:left="0" w:right="0"/>
               <w:jc w:val="right"/>
             </w:pPr>
             <w:r>
               <w:rPr>
                 <w:b/>
-                <w:sz w:val="20"/>
+                <w:sz w:val="18"/>
               </w:rPr>
               <w:t>Change (%)</w:t>
             </w:r>
@@ -3972,15 +4534,23 @@
         <w:tc>
           <w:tcPr>
             <w:tcW w:w="2268" w:type="dxa"/>
+            <w:tcMar>
+              <w:top w:w="55" w:type="dxa"/>
+              <w:bottom w:w="55" w:type="dxa"/>
+              <w:left w:w="80" w:type="dxa"/>
+              <w:right w:w="80" w:type="dxa"/>
+            </w:tcMar>
           </w:tcPr>
           <w:p>
             <w:pPr>
               <w:keepNext/>
-              <w:spacing w:before="80" w:after="80"/>
+              <w:spacing w:before="0" w:after="40"/>
+              <w:ind w:left="0" w:right="0"/>
+              <w:jc w:val="left"/>
             </w:pPr>
             <w:r>
               <w:rPr>
-                <w:sz w:val="20"/>
+                <w:sz w:val="18"/>
               </w:rPr>
               <w:t>Union</w:t>
             </w:r>
@@ -3989,15 +4559,23 @@
         <w:tc>
           <w:tcPr>
             <w:tcW w:w="1474" w:type="dxa"/>
+            <w:tcMar>
+              <w:top w:w="55" w:type="dxa"/>
+              <w:bottom w:w="55" w:type="dxa"/>
+              <w:left w:w="80" w:type="dxa"/>
+              <w:right w:w="80" w:type="dxa"/>
+            </w:tcMar>
           </w:tcPr>
           <w:p>
             <w:pPr>
               <w:keepNext/>
-              <w:spacing w:before="80" w:after="80"/>
+              <w:spacing w:before="0" w:after="40"/>
+              <w:ind w:left="0" w:right="0"/>
+              <w:jc w:val="left"/>
             </w:pPr>
             <w:r>
               <w:rPr>
-                <w:sz w:val="20"/>
+                <w:sz w:val="18"/>
               </w:rPr>
               <w:t>Seasonal</w:t>
             </w:r>
@@ -4006,16 +4584,23 @@
         <w:tc>
           <w:tcPr>
             <w:tcW w:w="1587" w:type="dxa"/>
+            <w:tcMar>
+              <w:top w:w="55" w:type="dxa"/>
+              <w:bottom w:w="55" w:type="dxa"/>
+              <w:left w:w="80" w:type="dxa"/>
+              <w:right w:w="80" w:type="dxa"/>
+            </w:tcMar>
           </w:tcPr>
           <w:p>
             <w:pPr>
               <w:keepNext/>
-              <w:spacing w:before="80" w:after="80"/>
+              <w:spacing w:before="0" w:after="40"/>
+              <w:ind w:left="0" w:right="0"/>
               <w:jc w:val="right"/>
             </w:pPr>
             <w:r>
               <w:rPr>
-                <w:sz w:val="20"/>
+                <w:sz w:val="18"/>
               </w:rPr>
               <w:t>938.53</w:t>
             </w:r>
@@ -4024,16 +4609,23 @@
         <w:tc>
           <w:tcPr>
             <w:tcW w:w="1587" w:type="dxa"/>
+            <w:tcMar>
+              <w:top w:w="55" w:type="dxa"/>
+              <w:bottom w:w="55" w:type="dxa"/>
+              <w:left w:w="80" w:type="dxa"/>
+              <w:right w:w="80" w:type="dxa"/>
+            </w:tcMar>
           </w:tcPr>
           <w:p>
             <w:pPr>
               <w:keepNext/>
-              <w:spacing w:before="80" w:after="80"/>
+              <w:spacing w:before="0" w:after="40"/>
+              <w:ind w:left="0" w:right="0"/>
               <w:jc w:val="right"/>
             </w:pPr>
             <w:r>
               <w:rPr>
-                <w:sz w:val="20"/>
+                <w:sz w:val="18"/>
               </w:rPr>
               <w:t>699.91</w:t>
             </w:r>
@@ -4042,16 +4634,23 @@
         <w:tc>
           <w:tcPr>
             <w:tcW w:w="1644" w:type="dxa"/>
+            <w:tcMar>
+              <w:top w:w="55" w:type="dxa"/>
+              <w:bottom w:w="55" w:type="dxa"/>
+              <w:left w:w="80" w:type="dxa"/>
+              <w:right w:w="80" w:type="dxa"/>
+            </w:tcMar>
           </w:tcPr>
           <w:p>
             <w:pPr>
               <w:keepNext/>
-              <w:spacing w:before="80" w:after="80"/>
+              <w:spacing w:before="0" w:after="40"/>
+              <w:ind w:left="0" w:right="0"/>
               <w:jc w:val="right"/>
             </w:pPr>
             <w:r>
               <w:rPr>
-                <w:sz w:val="20"/>
+                <w:sz w:val="18"/>
               </w:rPr>
               <w:t>-238.62</w:t>
             </w:r>
@@ -4060,16 +4659,23 @@
         <w:tc>
           <w:tcPr>
             <w:tcW w:w="1644" w:type="dxa"/>
+            <w:tcMar>
+              <w:top w:w="55" w:type="dxa"/>
+              <w:bottom w:w="55" w:type="dxa"/>
+              <w:left w:w="80" w:type="dxa"/>
+              <w:right w:w="80" w:type="dxa"/>
+            </w:tcMar>
           </w:tcPr>
           <w:p>
             <w:pPr>
               <w:keepNext/>
-              <w:spacing w:before="80" w:after="80"/>
+              <w:spacing w:before="0" w:after="40"/>
+              <w:ind w:left="0" w:right="0"/>
               <w:jc w:val="right"/>
             </w:pPr>
             <w:r>
               <w:rPr>
-                <w:sz w:val="20"/>
+                <w:sz w:val="18"/>
               </w:rPr>
               <w:t>-25.42</w:t>
             </w:r>
@@ -4083,15 +4689,23 @@
         <w:tc>
           <w:tcPr>
             <w:tcW w:w="2268" w:type="dxa"/>
+            <w:tcMar>
+              <w:top w:w="55" w:type="dxa"/>
+              <w:bottom w:w="55" w:type="dxa"/>
+              <w:left w:w="80" w:type="dxa"/>
+              <w:right w:w="80" w:type="dxa"/>
+            </w:tcMar>
           </w:tcPr>
           <w:p>
             <w:pPr>
               <w:keepNext/>
-              <w:spacing w:before="80" w:after="80"/>
+              <w:spacing w:before="0" w:after="40"/>
+              <w:ind w:left="0" w:right="0"/>
+              <w:jc w:val="left"/>
             </w:pPr>
             <w:r>
               <w:rPr>
-                <w:sz w:val="20"/>
+                <w:sz w:val="18"/>
               </w:rPr>
               <w:t>Union</w:t>
             </w:r>
@@ -4100,15 +4714,23 @@
         <w:tc>
           <w:tcPr>
             <w:tcW w:w="1474" w:type="dxa"/>
+            <w:tcMar>
+              <w:top w:w="55" w:type="dxa"/>
+              <w:bottom w:w="55" w:type="dxa"/>
+              <w:left w:w="80" w:type="dxa"/>
+              <w:right w:w="80" w:type="dxa"/>
+            </w:tcMar>
           </w:tcPr>
           <w:p>
             <w:pPr>
               <w:keepNext/>
-              <w:spacing w:before="80" w:after="80"/>
+              <w:spacing w:before="0" w:after="40"/>
+              <w:ind w:left="0" w:right="0"/>
+              <w:jc w:val="left"/>
             </w:pPr>
             <w:r>
               <w:rPr>
-                <w:sz w:val="20"/>
+                <w:sz w:val="18"/>
               </w:rPr>
               <w:t>Permanent</w:t>
             </w:r>
@@ -4117,16 +4739,23 @@
         <w:tc>
           <w:tcPr>
             <w:tcW w:w="1587" w:type="dxa"/>
+            <w:tcMar>
+              <w:top w:w="55" w:type="dxa"/>
+              <w:bottom w:w="55" w:type="dxa"/>
+              <w:left w:w="80" w:type="dxa"/>
+              <w:right w:w="80" w:type="dxa"/>
+            </w:tcMar>
           </w:tcPr>
           <w:p>
             <w:pPr>
               <w:keepNext/>
-              <w:spacing w:before="80" w:after="80"/>
+              <w:spacing w:before="0" w:after="40"/>
+              <w:ind w:left="0" w:right="0"/>
               <w:jc w:val="right"/>
             </w:pPr>
             <w:r>
               <w:rPr>
-                <w:sz w:val="20"/>
+                <w:sz w:val="18"/>
               </w:rPr>
               <w:t>65.49</w:t>
             </w:r>
@@ -4135,16 +4764,23 @@
         <w:tc>
           <w:tcPr>
             <w:tcW w:w="1587" w:type="dxa"/>
+            <w:tcMar>
+              <w:top w:w="55" w:type="dxa"/>
+              <w:bottom w:w="55" w:type="dxa"/>
+              <w:left w:w="80" w:type="dxa"/>
+              <w:right w:w="80" w:type="dxa"/>
+            </w:tcMar>
           </w:tcPr>
           <w:p>
             <w:pPr>
               <w:keepNext/>
-              <w:spacing w:before="80" w:after="80"/>
+              <w:spacing w:before="0" w:after="40"/>
+              <w:ind w:left="0" w:right="0"/>
               <w:jc w:val="right"/>
             </w:pPr>
             <w:r>
               <w:rPr>
-                <w:sz w:val="20"/>
+                <w:sz w:val="18"/>
               </w:rPr>
               <w:t>92.37</w:t>
             </w:r>
@@ -4153,16 +4789,23 @@
         <w:tc>
           <w:tcPr>
             <w:tcW w:w="1644" w:type="dxa"/>
+            <w:tcMar>
+              <w:top w:w="55" w:type="dxa"/>
+              <w:bottom w:w="55" w:type="dxa"/>
+              <w:left w:w="80" w:type="dxa"/>
+              <w:right w:w="80" w:type="dxa"/>
+            </w:tcMar>
           </w:tcPr>
           <w:p>
             <w:pPr>
               <w:keepNext/>
-              <w:spacing w:before="80" w:after="80"/>
+              <w:spacing w:before="0" w:after="40"/>
+              <w:ind w:left="0" w:right="0"/>
               <w:jc w:val="right"/>
             </w:pPr>
             <w:r>
               <w:rPr>
-                <w:sz w:val="20"/>
+                <w:sz w:val="18"/>
               </w:rPr>
               <w:t>+26.88</w:t>
             </w:r>
@@ -4171,16 +4814,23 @@
         <w:tc>
           <w:tcPr>
             <w:tcW w:w="1644" w:type="dxa"/>
+            <w:tcMar>
+              <w:top w:w="55" w:type="dxa"/>
+              <w:bottom w:w="55" w:type="dxa"/>
+              <w:left w:w="80" w:type="dxa"/>
+              <w:right w:w="80" w:type="dxa"/>
+            </w:tcMar>
           </w:tcPr>
           <w:p>
             <w:pPr>
               <w:keepNext/>
-              <w:spacing w:before="80" w:after="80"/>
+              <w:spacing w:before="0" w:after="40"/>
+              <w:ind w:left="0" w:right="0"/>
               <w:jc w:val="right"/>
             </w:pPr>
             <w:r>
               <w:rPr>
-                <w:sz w:val="20"/>
+                <w:sz w:val="18"/>
               </w:rPr>
               <w:t>+41.04</w:t>
             </w:r>
@@ -4194,15 +4844,23 @@
         <w:tc>
           <w:tcPr>
             <w:tcW w:w="2268" w:type="dxa"/>
+            <w:tcMar>
+              <w:top w:w="55" w:type="dxa"/>
+              <w:bottom w:w="55" w:type="dxa"/>
+              <w:left w:w="80" w:type="dxa"/>
+              <w:right w:w="80" w:type="dxa"/>
+            </w:tcMar>
           </w:tcPr>
           <w:p>
             <w:pPr>
               <w:keepNext/>
-              <w:spacing w:before="80" w:after="80"/>
+              <w:spacing w:before="0" w:after="40"/>
+              <w:ind w:left="0" w:right="0"/>
+              <w:jc w:val="left"/>
             </w:pPr>
             <w:r>
               <w:rPr>
-                <w:sz w:val="20"/>
+                <w:sz w:val="18"/>
               </w:rPr>
               <w:t>Naogaon</w:t>
             </w:r>
@@ -4211,15 +4869,23 @@
         <w:tc>
           <w:tcPr>
             <w:tcW w:w="1474" w:type="dxa"/>
+            <w:tcMar>
+              <w:top w:w="55" w:type="dxa"/>
+              <w:bottom w:w="55" w:type="dxa"/>
+              <w:left w:w="80" w:type="dxa"/>
+              <w:right w:w="80" w:type="dxa"/>
+            </w:tcMar>
           </w:tcPr>
           <w:p>
             <w:pPr>
               <w:keepNext/>
-              <w:spacing w:before="80" w:after="80"/>
+              <w:spacing w:before="0" w:after="40"/>
+              <w:ind w:left="0" w:right="0"/>
+              <w:jc w:val="left"/>
             </w:pPr>
             <w:r>
               <w:rPr>
-                <w:sz w:val="20"/>
+                <w:sz w:val="18"/>
               </w:rPr>
               <w:t>Seasonal</w:t>
             </w:r>
@@ -4228,16 +4894,23 @@
         <w:tc>
           <w:tcPr>
             <w:tcW w:w="1587" w:type="dxa"/>
+            <w:tcMar>
+              <w:top w:w="55" w:type="dxa"/>
+              <w:bottom w:w="55" w:type="dxa"/>
+              <w:left w:w="80" w:type="dxa"/>
+              <w:right w:w="80" w:type="dxa"/>
+            </w:tcMar>
           </w:tcPr>
           <w:p>
             <w:pPr>
               <w:keepNext/>
-              <w:spacing w:before="80" w:after="80"/>
+              <w:spacing w:before="0" w:after="40"/>
+              <w:ind w:left="0" w:right="0"/>
               <w:jc w:val="right"/>
             </w:pPr>
             <w:r>
               <w:rPr>
-                <w:sz w:val="20"/>
+                <w:sz w:val="18"/>
               </w:rPr>
               <w:t>385.72</w:t>
             </w:r>
@@ -4246,16 +4919,23 @@
         <w:tc>
           <w:tcPr>
             <w:tcW w:w="1587" w:type="dxa"/>
+            <w:tcMar>
+              <w:top w:w="55" w:type="dxa"/>
+              <w:bottom w:w="55" w:type="dxa"/>
+              <w:left w:w="80" w:type="dxa"/>
+              <w:right w:w="80" w:type="dxa"/>
+            </w:tcMar>
           </w:tcPr>
           <w:p>
             <w:pPr>
               <w:keepNext/>
-              <w:spacing w:before="80" w:after="80"/>
+              <w:spacing w:before="0" w:after="40"/>
+              <w:ind w:left="0" w:right="0"/>
               <w:jc w:val="right"/>
             </w:pPr>
             <w:r>
               <w:rPr>
-                <w:sz w:val="20"/>
+                <w:sz w:val="18"/>
               </w:rPr>
               <w:t>239.76</w:t>
             </w:r>
@@ -4264,16 +4944,23 @@
         <w:tc>
           <w:tcPr>
             <w:tcW w:w="1644" w:type="dxa"/>
+            <w:tcMar>
+              <w:top w:w="55" w:type="dxa"/>
+              <w:bottom w:w="55" w:type="dxa"/>
+              <w:left w:w="80" w:type="dxa"/>
+              <w:right w:w="80" w:type="dxa"/>
+            </w:tcMar>
           </w:tcPr>
           <w:p>
             <w:pPr>
               <w:keepNext/>
-              <w:spacing w:before="80" w:after="80"/>
+              <w:spacing w:before="0" w:after="40"/>
+              <w:ind w:left="0" w:right="0"/>
               <w:jc w:val="right"/>
             </w:pPr>
             <w:r>
               <w:rPr>
-                <w:sz w:val="20"/>
+                <w:sz w:val="18"/>
               </w:rPr>
               <w:t>-145.96</w:t>
             </w:r>
@@ -4282,16 +4969,23 @@
         <w:tc>
           <w:tcPr>
             <w:tcW w:w="1644" w:type="dxa"/>
+            <w:tcMar>
+              <w:top w:w="55" w:type="dxa"/>
+              <w:bottom w:w="55" w:type="dxa"/>
+              <w:left w:w="80" w:type="dxa"/>
+              <w:right w:w="80" w:type="dxa"/>
+            </w:tcMar>
           </w:tcPr>
           <w:p>
             <w:pPr>
               <w:keepNext/>
-              <w:spacing w:before="80" w:after="80"/>
+              <w:spacing w:before="0" w:after="40"/>
+              <w:ind w:left="0" w:right="0"/>
               <w:jc w:val="right"/>
             </w:pPr>
             <w:r>
               <w:rPr>
-                <w:sz w:val="20"/>
+                <w:sz w:val="18"/>
               </w:rPr>
               <w:t>-37.84</w:t>
             </w:r>
@@ -4305,15 +4999,23 @@
         <w:tc>
           <w:tcPr>
             <w:tcW w:w="2268" w:type="dxa"/>
+            <w:tcMar>
+              <w:top w:w="55" w:type="dxa"/>
+              <w:bottom w:w="55" w:type="dxa"/>
+              <w:left w:w="80" w:type="dxa"/>
+              <w:right w:w="80" w:type="dxa"/>
+            </w:tcMar>
           </w:tcPr>
           <w:p>
             <w:pPr>
               <w:keepNext/>
-              <w:spacing w:before="80" w:after="80"/>
+              <w:spacing w:before="0" w:after="40"/>
+              <w:ind w:left="0" w:right="0"/>
+              <w:jc w:val="left"/>
             </w:pPr>
             <w:r>
               <w:rPr>
-                <w:sz w:val="20"/>
+                <w:sz w:val="18"/>
               </w:rPr>
               <w:t>Naogaon</w:t>
             </w:r>
@@ -4322,15 +5024,23 @@
         <w:tc>
           <w:tcPr>
             <w:tcW w:w="1474" w:type="dxa"/>
+            <w:tcMar>
+              <w:top w:w="55" w:type="dxa"/>
+              <w:bottom w:w="55" w:type="dxa"/>
+              <w:left w:w="80" w:type="dxa"/>
+              <w:right w:w="80" w:type="dxa"/>
+            </w:tcMar>
           </w:tcPr>
           <w:p>
             <w:pPr>
               <w:keepNext/>
-              <w:spacing w:before="80" w:after="80"/>
+              <w:spacing w:before="0" w:after="40"/>
+              <w:ind w:left="0" w:right="0"/>
+              <w:jc w:val="left"/>
             </w:pPr>
             <w:r>
               <w:rPr>
-                <w:sz w:val="20"/>
+                <w:sz w:val="18"/>
               </w:rPr>
               <w:t>Permanent</w:t>
             </w:r>
@@ -4339,16 +5049,23 @@
         <w:tc>
           <w:tcPr>
             <w:tcW w:w="1587" w:type="dxa"/>
+            <w:tcMar>
+              <w:top w:w="55" w:type="dxa"/>
+              <w:bottom w:w="55" w:type="dxa"/>
+              <w:left w:w="80" w:type="dxa"/>
+              <w:right w:w="80" w:type="dxa"/>
+            </w:tcMar>
           </w:tcPr>
           <w:p>
             <w:pPr>
               <w:keepNext/>
-              <w:spacing w:before="80" w:after="80"/>
+              <w:spacing w:before="0" w:after="40"/>
+              <w:ind w:left="0" w:right="0"/>
               <w:jc w:val="right"/>
             </w:pPr>
             <w:r>
               <w:rPr>
-                <w:sz w:val="20"/>
+                <w:sz w:val="18"/>
               </w:rPr>
               <w:t>4.52</w:t>
             </w:r>
@@ -4357,16 +5074,23 @@
         <w:tc>
           <w:tcPr>
             <w:tcW w:w="1587" w:type="dxa"/>
+            <w:tcMar>
+              <w:top w:w="55" w:type="dxa"/>
+              <w:bottom w:w="55" w:type="dxa"/>
+              <w:left w:w="80" w:type="dxa"/>
+              <w:right w:w="80" w:type="dxa"/>
+            </w:tcMar>
           </w:tcPr>
           <w:p>
             <w:pPr>
               <w:keepNext/>
-              <w:spacing w:before="80" w:after="80"/>
+              <w:spacing w:before="0" w:after="40"/>
+              <w:ind w:left="0" w:right="0"/>
               <w:jc w:val="right"/>
             </w:pPr>
             <w:r>
               <w:rPr>
-                <w:sz w:val="20"/>
+                <w:sz w:val="18"/>
               </w:rPr>
               <w:t>4.66</w:t>
             </w:r>
@@ -4375,16 +5099,23 @@
         <w:tc>
           <w:tcPr>
             <w:tcW w:w="1644" w:type="dxa"/>
+            <w:tcMar>
+              <w:top w:w="55" w:type="dxa"/>
+              <w:bottom w:w="55" w:type="dxa"/>
+              <w:left w:w="80" w:type="dxa"/>
+              <w:right w:w="80" w:type="dxa"/>
+            </w:tcMar>
           </w:tcPr>
           <w:p>
             <w:pPr>
               <w:keepNext/>
-              <w:spacing w:before="80" w:after="80"/>
+              <w:spacing w:before="0" w:after="40"/>
+              <w:ind w:left="0" w:right="0"/>
               <w:jc w:val="right"/>
             </w:pPr>
             <w:r>
               <w:rPr>
-                <w:sz w:val="20"/>
+                <w:sz w:val="18"/>
               </w:rPr>
               <w:t>+0.14</w:t>
             </w:r>
@@ -4393,16 +5124,23 @@
         <w:tc>
           <w:tcPr>
             <w:tcW w:w="1644" w:type="dxa"/>
+            <w:tcMar>
+              <w:top w:w="55" w:type="dxa"/>
+              <w:bottom w:w="55" w:type="dxa"/>
+              <w:left w:w="80" w:type="dxa"/>
+              <w:right w:w="80" w:type="dxa"/>
+            </w:tcMar>
           </w:tcPr>
           <w:p>
             <w:pPr>
               <w:keepNext/>
-              <w:spacing w:before="80" w:after="80"/>
+              <w:spacing w:before="0" w:after="40"/>
+              <w:ind w:left="0" w:right="0"/>
               <w:jc w:val="right"/>
             </w:pPr>
             <w:r>
               <w:rPr>
-                <w:sz w:val="20"/>
+                <w:sz w:val="18"/>
               </w:rPr>
               <w:t>+3.08</w:t>
             </w:r>
@@ -4416,15 +5154,23 @@
         <w:tc>
           <w:tcPr>
             <w:tcW w:w="2268" w:type="dxa"/>
+            <w:tcMar>
+              <w:top w:w="55" w:type="dxa"/>
+              <w:bottom w:w="55" w:type="dxa"/>
+              <w:left w:w="80" w:type="dxa"/>
+              <w:right w:w="80" w:type="dxa"/>
+            </w:tcMar>
           </w:tcPr>
           <w:p>
             <w:pPr>
               <w:keepNext/>
-              <w:spacing w:before="80" w:after="80"/>
+              <w:spacing w:before="0" w:after="40"/>
+              <w:ind w:left="0" w:right="0"/>
+              <w:jc w:val="left"/>
             </w:pPr>
             <w:r>
               <w:rPr>
-                <w:sz w:val="20"/>
+                <w:sz w:val="18"/>
               </w:rPr>
               <w:t>Chapainawabganj</w:t>
             </w:r>
@@ -4433,15 +5179,23 @@
         <w:tc>
           <w:tcPr>
             <w:tcW w:w="1474" w:type="dxa"/>
+            <w:tcMar>
+              <w:top w:w="55" w:type="dxa"/>
+              <w:bottom w:w="55" w:type="dxa"/>
+              <w:left w:w="80" w:type="dxa"/>
+              <w:right w:w="80" w:type="dxa"/>
+            </w:tcMar>
           </w:tcPr>
           <w:p>
             <w:pPr>
               <w:keepNext/>
-              <w:spacing w:before="80" w:after="80"/>
+              <w:spacing w:before="0" w:after="40"/>
+              <w:ind w:left="0" w:right="0"/>
+              <w:jc w:val="left"/>
             </w:pPr>
             <w:r>
               <w:rPr>
-                <w:sz w:val="20"/>
+                <w:sz w:val="18"/>
               </w:rPr>
               <w:t>Seasonal</w:t>
             </w:r>
@@ -4450,16 +5204,23 @@
         <w:tc>
           <w:tcPr>
             <w:tcW w:w="1587" w:type="dxa"/>
+            <w:tcMar>
+              <w:top w:w="55" w:type="dxa"/>
+              <w:bottom w:w="55" w:type="dxa"/>
+              <w:left w:w="80" w:type="dxa"/>
+              <w:right w:w="80" w:type="dxa"/>
+            </w:tcMar>
           </w:tcPr>
           <w:p>
             <w:pPr>
               <w:keepNext/>
-              <w:spacing w:before="80" w:after="80"/>
+              <w:spacing w:before="0" w:after="40"/>
+              <w:ind w:left="0" w:right="0"/>
               <w:jc w:val="right"/>
             </w:pPr>
             <w:r>
               <w:rPr>
-                <w:sz w:val="20"/>
+                <w:sz w:val="18"/>
               </w:rPr>
               <w:t>252.84</w:t>
             </w:r>
@@ -4468,16 +5229,23 @@
         <w:tc>
           <w:tcPr>
             <w:tcW w:w="1587" w:type="dxa"/>
+            <w:tcMar>
+              <w:top w:w="55" w:type="dxa"/>
+              <w:bottom w:w="55" w:type="dxa"/>
+              <w:left w:w="80" w:type="dxa"/>
+              <w:right w:w="80" w:type="dxa"/>
+            </w:tcMar>
           </w:tcPr>
           <w:p>
             <w:pPr>
               <w:keepNext/>
-              <w:spacing w:before="80" w:after="80"/>
+              <w:spacing w:before="0" w:after="40"/>
+              <w:ind w:left="0" w:right="0"/>
               <w:jc w:val="right"/>
             </w:pPr>
             <w:r>
               <w:rPr>
-                <w:sz w:val="20"/>
+                <w:sz w:val="18"/>
               </w:rPr>
               <w:t>233.56</w:t>
             </w:r>
@@ -4486,16 +5254,23 @@
         <w:tc>
           <w:tcPr>
             <w:tcW w:w="1644" w:type="dxa"/>
+            <w:tcMar>
+              <w:top w:w="55" w:type="dxa"/>
+              <w:bottom w:w="55" w:type="dxa"/>
+              <w:left w:w="80" w:type="dxa"/>
+              <w:right w:w="80" w:type="dxa"/>
+            </w:tcMar>
           </w:tcPr>
           <w:p>
             <w:pPr>
               <w:keepNext/>
-              <w:spacing w:before="80" w:after="80"/>
+              <w:spacing w:before="0" w:after="40"/>
+              <w:ind w:left="0" w:right="0"/>
               <w:jc w:val="right"/>
             </w:pPr>
             <w:r>
               <w:rPr>
-                <w:sz w:val="20"/>
+                <w:sz w:val="18"/>
               </w:rPr>
               <w:t>-19.28</w:t>
             </w:r>
@@ -4504,16 +5279,23 @@
         <w:tc>
           <w:tcPr>
             <w:tcW w:w="1644" w:type="dxa"/>
+            <w:tcMar>
+              <w:top w:w="55" w:type="dxa"/>
+              <w:bottom w:w="55" w:type="dxa"/>
+              <w:left w:w="80" w:type="dxa"/>
+              <w:right w:w="80" w:type="dxa"/>
+            </w:tcMar>
           </w:tcPr>
           <w:p>
             <w:pPr>
               <w:keepNext/>
-              <w:spacing w:before="80" w:after="80"/>
+              <w:spacing w:before="0" w:after="40"/>
+              <w:ind w:left="0" w:right="0"/>
               <w:jc w:val="right"/>
             </w:pPr>
             <w:r>
               <w:rPr>
-                <w:sz w:val="20"/>
+                <w:sz w:val="18"/>
               </w:rPr>
               <w:t>-7.62</w:t>
             </w:r>
@@ -4527,15 +5309,23 @@
         <w:tc>
           <w:tcPr>
             <w:tcW w:w="2268" w:type="dxa"/>
+            <w:tcMar>
+              <w:top w:w="55" w:type="dxa"/>
+              <w:bottom w:w="55" w:type="dxa"/>
+              <w:left w:w="80" w:type="dxa"/>
+              <w:right w:w="80" w:type="dxa"/>
+            </w:tcMar>
           </w:tcPr>
           <w:p>
             <w:pPr>
               <w:keepNext/>
-              <w:spacing w:before="80" w:after="80"/>
+              <w:spacing w:before="0" w:after="40"/>
+              <w:ind w:left="0" w:right="0"/>
+              <w:jc w:val="left"/>
             </w:pPr>
             <w:r>
               <w:rPr>
-                <w:sz w:val="20"/>
+                <w:sz w:val="18"/>
               </w:rPr>
               <w:t>Chapainawabganj</w:t>
             </w:r>
@@ -4544,15 +5334,23 @@
         <w:tc>
           <w:tcPr>
             <w:tcW w:w="1474" w:type="dxa"/>
+            <w:tcMar>
+              <w:top w:w="55" w:type="dxa"/>
+              <w:bottom w:w="55" w:type="dxa"/>
+              <w:left w:w="80" w:type="dxa"/>
+              <w:right w:w="80" w:type="dxa"/>
+            </w:tcMar>
           </w:tcPr>
           <w:p>
             <w:pPr>
               <w:keepNext/>
-              <w:spacing w:before="80" w:after="80"/>
+              <w:spacing w:before="0" w:after="40"/>
+              <w:ind w:left="0" w:right="0"/>
+              <w:jc w:val="left"/>
             </w:pPr>
             <w:r>
               <w:rPr>
-                <w:sz w:val="20"/>
+                <w:sz w:val="18"/>
               </w:rPr>
               <w:t>Permanent</w:t>
             </w:r>
@@ -4561,16 +5359,23 @@
         <w:tc>
           <w:tcPr>
             <w:tcW w:w="1587" w:type="dxa"/>
+            <w:tcMar>
+              <w:top w:w="55" w:type="dxa"/>
+              <w:bottom w:w="55" w:type="dxa"/>
+              <w:left w:w="80" w:type="dxa"/>
+              <w:right w:w="80" w:type="dxa"/>
+            </w:tcMar>
           </w:tcPr>
           <w:p>
             <w:pPr>
               <w:keepNext/>
-              <w:spacing w:before="80" w:after="80"/>
+              <w:spacing w:before="0" w:after="40"/>
+              <w:ind w:left="0" w:right="0"/>
               <w:jc w:val="right"/>
             </w:pPr>
             <w:r>
               <w:rPr>
-                <w:sz w:val="20"/>
+                <w:sz w:val="18"/>
               </w:rPr>
               <w:t>22.81</w:t>
             </w:r>
@@ -4579,16 +5384,23 @@
         <w:tc>
           <w:tcPr>
             <w:tcW w:w="1587" w:type="dxa"/>
+            <w:tcMar>
+              <w:top w:w="55" w:type="dxa"/>
+              <w:bottom w:w="55" w:type="dxa"/>
+              <w:left w:w="80" w:type="dxa"/>
+              <w:right w:w="80" w:type="dxa"/>
+            </w:tcMar>
           </w:tcPr>
           <w:p>
             <w:pPr>
               <w:keepNext/>
-              <w:spacing w:before="80" w:after="80"/>
+              <w:spacing w:before="0" w:after="40"/>
+              <w:ind w:left="0" w:right="0"/>
               <w:jc w:val="right"/>
             </w:pPr>
             <w:r>
               <w:rPr>
-                <w:sz w:val="20"/>
+                <w:sz w:val="18"/>
               </w:rPr>
               <w:t>32.80</w:t>
             </w:r>
@@ -4597,16 +5409,23 @@
         <w:tc>
           <w:tcPr>
             <w:tcW w:w="1644" w:type="dxa"/>
+            <w:tcMar>
+              <w:top w:w="55" w:type="dxa"/>
+              <w:bottom w:w="55" w:type="dxa"/>
+              <w:left w:w="80" w:type="dxa"/>
+              <w:right w:w="80" w:type="dxa"/>
+            </w:tcMar>
           </w:tcPr>
           <w:p>
             <w:pPr>
               <w:keepNext/>
-              <w:spacing w:before="80" w:after="80"/>
+              <w:spacing w:before="0" w:after="40"/>
+              <w:ind w:left="0" w:right="0"/>
               <w:jc w:val="right"/>
             </w:pPr>
             <w:r>
               <w:rPr>
-                <w:sz w:val="20"/>
+                <w:sz w:val="18"/>
               </w:rPr>
               <w:t>+9.99</w:t>
             </w:r>
@@ -4615,16 +5434,23 @@
         <w:tc>
           <w:tcPr>
             <w:tcW w:w="1644" w:type="dxa"/>
+            <w:tcMar>
+              <w:top w:w="55" w:type="dxa"/>
+              <w:bottom w:w="55" w:type="dxa"/>
+              <w:left w:w="80" w:type="dxa"/>
+              <w:right w:w="80" w:type="dxa"/>
+            </w:tcMar>
           </w:tcPr>
           <w:p>
             <w:pPr>
               <w:keepNext/>
-              <w:spacing w:before="80" w:after="80"/>
+              <w:spacing w:before="0" w:after="40"/>
+              <w:ind w:left="0" w:right="0"/>
               <w:jc w:val="right"/>
             </w:pPr>
             <w:r>
               <w:rPr>
-                <w:sz w:val="20"/>
+                <w:sz w:val="18"/>
               </w:rPr>
               <w:t>+43.79</w:t>
             </w:r>
@@ -4638,15 +5464,23 @@
         <w:tc>
           <w:tcPr>
             <w:tcW w:w="2268" w:type="dxa"/>
+            <w:tcMar>
+              <w:top w:w="55" w:type="dxa"/>
+              <w:bottom w:w="55" w:type="dxa"/>
+              <w:left w:w="80" w:type="dxa"/>
+              <w:right w:w="80" w:type="dxa"/>
+            </w:tcMar>
           </w:tcPr>
           <w:p>
             <w:pPr>
               <w:keepNext/>
-              <w:spacing w:before="80" w:after="80"/>
+              <w:spacing w:before="0" w:after="40"/>
+              <w:ind w:left="0" w:right="0"/>
+              <w:jc w:val="left"/>
             </w:pPr>
             <w:r>
               <w:rPr>
-                <w:sz w:val="20"/>
+                <w:sz w:val="18"/>
               </w:rPr>
               <w:t>Rajshahi</w:t>
             </w:r>
@@ -4655,15 +5489,23 @@
         <w:tc>
           <w:tcPr>
             <w:tcW w:w="1474" w:type="dxa"/>
+            <w:tcMar>
+              <w:top w:w="55" w:type="dxa"/>
+              <w:bottom w:w="55" w:type="dxa"/>
+              <w:left w:w="80" w:type="dxa"/>
+              <w:right w:w="80" w:type="dxa"/>
+            </w:tcMar>
           </w:tcPr>
           <w:p>
             <w:pPr>
               <w:keepNext/>
-              <w:spacing w:before="80" w:after="80"/>
+              <w:spacing w:before="0" w:after="40"/>
+              <w:ind w:left="0" w:right="0"/>
+              <w:jc w:val="left"/>
             </w:pPr>
             <w:r>
               <w:rPr>
-                <w:sz w:val="20"/>
+                <w:sz w:val="18"/>
               </w:rPr>
               <w:t>Seasonal</w:t>
             </w:r>
@@ -4672,16 +5514,23 @@
         <w:tc>
           <w:tcPr>
             <w:tcW w:w="1587" w:type="dxa"/>
+            <w:tcMar>
+              <w:top w:w="55" w:type="dxa"/>
+              <w:bottom w:w="55" w:type="dxa"/>
+              <w:left w:w="80" w:type="dxa"/>
+              <w:right w:w="80" w:type="dxa"/>
+            </w:tcMar>
           </w:tcPr>
           <w:p>
             <w:pPr>
               <w:keepNext/>
-              <w:spacing w:before="80" w:after="80"/>
+              <w:spacing w:before="0" w:after="40"/>
+              <w:ind w:left="0" w:right="0"/>
               <w:jc w:val="right"/>
             </w:pPr>
             <w:r>
               <w:rPr>
-                <w:sz w:val="20"/>
+                <w:sz w:val="18"/>
               </w:rPr>
               <w:t>299.98</w:t>
             </w:r>
@@ -4690,16 +5539,23 @@
         <w:tc>
           <w:tcPr>
             <w:tcW w:w="1587" w:type="dxa"/>
+            <w:tcMar>
+              <w:top w:w="55" w:type="dxa"/>
+              <w:bottom w:w="55" w:type="dxa"/>
+              <w:left w:w="80" w:type="dxa"/>
+              <w:right w:w="80" w:type="dxa"/>
+            </w:tcMar>
           </w:tcPr>
           <w:p>
             <w:pPr>
               <w:keepNext/>
-              <w:spacing w:before="80" w:after="80"/>
+              <w:spacing w:before="0" w:after="40"/>
+              <w:ind w:left="0" w:right="0"/>
               <w:jc w:val="right"/>
             </w:pPr>
             <w:r>
               <w:rPr>
-                <w:sz w:val="20"/>
+                <w:sz w:val="18"/>
               </w:rPr>
               <w:t>226.60</w:t>
             </w:r>
@@ -4708,16 +5564,23 @@
         <w:tc>
           <w:tcPr>
             <w:tcW w:w="1644" w:type="dxa"/>
+            <w:tcMar>
+              <w:top w:w="55" w:type="dxa"/>
+              <w:bottom w:w="55" w:type="dxa"/>
+              <w:left w:w="80" w:type="dxa"/>
+              <w:right w:w="80" w:type="dxa"/>
+            </w:tcMar>
           </w:tcPr>
           <w:p>
             <w:pPr>
               <w:keepNext/>
-              <w:spacing w:before="80" w:after="80"/>
+              <w:spacing w:before="0" w:after="40"/>
+              <w:ind w:left="0" w:right="0"/>
               <w:jc w:val="right"/>
             </w:pPr>
             <w:r>
               <w:rPr>
-                <w:sz w:val="20"/>
+                <w:sz w:val="18"/>
               </w:rPr>
               <w:t>-73.38</w:t>
             </w:r>
@@ -4726,16 +5589,23 @@
         <w:tc>
           <w:tcPr>
             <w:tcW w:w="1644" w:type="dxa"/>
+            <w:tcMar>
+              <w:top w:w="55" w:type="dxa"/>
+              <w:bottom w:w="55" w:type="dxa"/>
+              <w:left w:w="80" w:type="dxa"/>
+              <w:right w:w="80" w:type="dxa"/>
+            </w:tcMar>
           </w:tcPr>
           <w:p>
             <w:pPr>
               <w:keepNext/>
-              <w:spacing w:before="80" w:after="80"/>
+              <w:spacing w:before="0" w:after="40"/>
+              <w:ind w:left="0" w:right="0"/>
               <w:jc w:val="right"/>
             </w:pPr>
             <w:r>
               <w:rPr>
-                <w:sz w:val="20"/>
+                <w:sz w:val="18"/>
               </w:rPr>
               <w:t>-24.46</w:t>
             </w:r>
@@ -4749,14 +5619,22 @@
         <w:tc>
           <w:tcPr>
             <w:tcW w:w="2268" w:type="dxa"/>
+            <w:tcMar>
+              <w:top w:w="55" w:type="dxa"/>
+              <w:bottom w:w="55" w:type="dxa"/>
+              <w:left w:w="80" w:type="dxa"/>
+              <w:right w:w="80" w:type="dxa"/>
+            </w:tcMar>
           </w:tcPr>
           <w:p>
             <w:pPr>
-              <w:spacing w:before="80" w:after="80"/>
+              <w:spacing w:before="0" w:after="40"/>
+              <w:ind w:left="0" w:right="0"/>
+              <w:jc w:val="left"/>
             </w:pPr>
             <w:r>
               <w:rPr>
-                <w:sz w:val="20"/>
+                <w:sz w:val="18"/>
               </w:rPr>
               <w:t>Rajshahi</w:t>
             </w:r>
@@ -4765,14 +5643,22 @@
         <w:tc>
           <w:tcPr>
             <w:tcW w:w="1474" w:type="dxa"/>
+            <w:tcMar>
+              <w:top w:w="55" w:type="dxa"/>
+              <w:bottom w:w="55" w:type="dxa"/>
+              <w:left w:w="80" w:type="dxa"/>
+              <w:right w:w="80" w:type="dxa"/>
+            </w:tcMar>
           </w:tcPr>
           <w:p>
             <w:pPr>
-              <w:spacing w:before="80" w:after="80"/>
+              <w:spacing w:before="0" w:after="40"/>
+              <w:ind w:left="0" w:right="0"/>
+              <w:jc w:val="left"/>
             </w:pPr>
             <w:r>
               <w:rPr>
-                <w:sz w:val="20"/>
+                <w:sz w:val="18"/>
               </w:rPr>
               <w:t>Permanent</w:t>
             </w:r>
@@ -4781,15 +5667,22 @@
         <w:tc>
           <w:tcPr>
             <w:tcW w:w="1587" w:type="dxa"/>
+            <w:tcMar>
+              <w:top w:w="55" w:type="dxa"/>
+              <w:bottom w:w="55" w:type="dxa"/>
+              <w:left w:w="80" w:type="dxa"/>
+              <w:right w:w="80" w:type="dxa"/>
+            </w:tcMar>
           </w:tcPr>
           <w:p>
             <w:pPr>
-              <w:spacing w:before="80" w:after="80"/>
+              <w:spacing w:before="0" w:after="40"/>
+              <w:ind w:left="0" w:right="0"/>
               <w:jc w:val="right"/>
             </w:pPr>
             <w:r>
               <w:rPr>
-                <w:sz w:val="20"/>
+                <w:sz w:val="18"/>
               </w:rPr>
               <w:t>38.16</w:t>
             </w:r>
@@ -4798,15 +5691,22 @@
         <w:tc>
           <w:tcPr>
             <w:tcW w:w="1587" w:type="dxa"/>
+            <w:tcMar>
+              <w:top w:w="55" w:type="dxa"/>
+              <w:bottom w:w="55" w:type="dxa"/>
+              <w:left w:w="80" w:type="dxa"/>
+              <w:right w:w="80" w:type="dxa"/>
+            </w:tcMar>
           </w:tcPr>
           <w:p>
             <w:pPr>
-              <w:spacing w:before="80" w:after="80"/>
+              <w:spacing w:before="0" w:after="40"/>
+              <w:ind w:left="0" w:right="0"/>
               <w:jc w:val="right"/>
             </w:pPr>
             <w:r>
               <w:rPr>
-                <w:sz w:val="20"/>
+                <w:sz w:val="18"/>
               </w:rPr>
               <w:t>54.91</w:t>
             </w:r>
@@ -4815,15 +5715,22 @@
         <w:tc>
           <w:tcPr>
             <w:tcW w:w="1644" w:type="dxa"/>
+            <w:tcMar>
+              <w:top w:w="55" w:type="dxa"/>
+              <w:bottom w:w="55" w:type="dxa"/>
+              <w:left w:w="80" w:type="dxa"/>
+              <w:right w:w="80" w:type="dxa"/>
+            </w:tcMar>
           </w:tcPr>
           <w:p>
             <w:pPr>
-              <w:spacing w:before="80" w:after="80"/>
+              <w:spacing w:before="0" w:after="40"/>
+              <w:ind w:left="0" w:right="0"/>
               <w:jc w:val="right"/>
             </w:pPr>
             <w:r>
               <w:rPr>
-                <w:sz w:val="20"/>
+                <w:sz w:val="18"/>
               </w:rPr>
               <w:t>+16.75</w:t>
             </w:r>
@@ -4832,15 +5739,22 @@
         <w:tc>
           <w:tcPr>
             <w:tcW w:w="1644" w:type="dxa"/>
+            <w:tcMar>
+              <w:top w:w="55" w:type="dxa"/>
+              <w:bottom w:w="55" w:type="dxa"/>
+              <w:left w:w="80" w:type="dxa"/>
+              <w:right w:w="80" w:type="dxa"/>
+            </w:tcMar>
           </w:tcPr>
           <w:p>
             <w:pPr>
-              <w:spacing w:before="80" w:after="80"/>
+              <w:spacing w:before="0" w:after="40"/>
+              <w:ind w:left="0" w:right="0"/>
               <w:jc w:val="right"/>
             </w:pPr>
             <w:r>
               <w:rPr>
-                <w:sz w:val="20"/>
+                <w:sz w:val="18"/>
               </w:rPr>
               <w:t>+43.90</w:t>
             </w:r>
@@ -4879,26 +5793,13 @@
       <w:pPr>
         <w:pStyle w:val="BodyText"/>
       </w:pPr>
-      <w:r>
-        <w:t xml:space="preserve">The corresponding strict-majority transition map is shown in </w:t>
-      </w:r>
-      <w:r>
-        <w:fldChar w:fldCharType="begin"/>
-      </w:r>
-      <w:r>
-        <w:instrText xml:space="preserve"> REF fig_03 \h </w:instrText>
-      </w:r>
-      <w:r>
-        <w:fldChar w:fldCharType="separate"/>
-      </w:r>
-      <w:r>
-        <w:t>Figure 3</w:t>
-      </w:r>
-      <w:r>
-        <w:fldChar w:fldCharType="end"/>
-      </w:r>
-      <w:r>
-        <w:t>. It distinguishes stable classes, gains, losses and seasonal/permanent transitions while preserving ambiguous windows; the mapped classes do not establish a physical mechanism.</w:t>
+      <w:fldSimple w:instr=" REF fig_03 \h ">
+        <w:r>
+          <w:t>Figure 3</w:t>
+        </w:r>
+      </w:fldSimple>
+      <w:r>
+        <w:t xml:space="preserve"> separates gross majority-class transitions from static landscape context. Among pixels with a majority in both windows, 264.1 km² moved from seasonal to nonwater and 110.1 km² from nonwater to seasonal; seasonal-to-permanent and permanent-to-seasonal transitions were 29.2 and 32.8 km². A further 11.04 km² lacked a strict majority in at least one window. At the 500 m river buffer, the change in five-year mean seasonal area was −64.49 km² near mapped rivers, −89.74 km² in more distant 2020 cropland and +19.84 km² in the remaining distant area. Their initial seasonal-area changes were −15.46%, −26.91% and +12.12%. Across the 200–1,000 m buffers, the respective percentage ranges were −15.54 to −15.25, −27.82 to −26.12 and +7.22 to +20.62. The partition changes with buffer distance; neither these ranges nor source-class transitions establish causes.</w:t>
       </w:r>
     </w:p>
     <w:p>
@@ -4913,9 +5814,9 @@
         </w:rPr>
         <w:drawing>
           <wp:inline distT="0" distB="0" distL="0" distR="0" wp14:anchorId="1CC90A4E" wp14:editId="679D26B4">
-            <wp:extent cx="5528034" cy="6839999"/>
+            <wp:extent cx="6192000" cy="3488450"/>
             <wp:effectExtent l="0" t="0" r="0" b="0"/>
-            <wp:docPr id="3" name="Picture 3" descr="Figure 3. Source-class transitions between strict five-year majority classes in 2000–2004 and 2017–2021, on the fixed annual footprint. Source: EC JRC/Google. Class transitions are not independently validated land-use or storage changes." title="Figure 3"/>
+            <wp:docPr id="3" name="Picture 3" descr="Figure 3. Gross source-class transitions and static landscape context on the original annual footprint. (A) Area in km² between strict five-year majority classes in 2000–2004 and 2017–2021; 11.04 km² without a majority in either window are excluded from the matrix. (B) Change between first and final five-year mean seasonal areas. Blue dots use a 500 m HydroRIVERS buffer; grey extents cover 200–1,000 m buffer settings and are sensitivity ranges, not uncertainty intervals. Away from the river buffer, groups use static WorldCover 2020 cropland or other cover. Context and class transitions do not establish historical land conversion or causal drivers." title="Figure 3"/>
             <wp:cNvGraphicFramePr>
               <a:graphicFrameLocks xmlns:a="http://schemas.openxmlformats.org/drawingml/2006/main" noChangeAspect="1"/>
             </wp:cNvGraphicFramePr>
@@ -4935,7 +5836,7 @@
                   <pic:spPr>
                     <a:xfrm>
                       <a:off x="0" y="0"/>
-                      <a:ext cx="5528034" cy="6839999"/>
+                      <a:ext cx="6192000" cy="3488450"/>
                     </a:xfrm>
                     <a:prstGeom prst="rect">
                       <a:avLst/>
@@ -4953,13 +5854,13 @@
         <w:pStyle w:val="Caption"/>
         <w:spacing w:after="180"/>
       </w:pPr>
-      <w:bookmarkStart w:id="18" w:name="fig_03"/>
+      <w:bookmarkStart w:id="7003" w:name="fig_03"/>
       <w:r>
         <w:t>Figure 3</w:t>
       </w:r>
-      <w:bookmarkEnd w:id="18"/>
-      <w:r>
-        <w:t>. Source-class transitions between strict five-year majority classes in 2000–2004 and 2017–2021, on the fixed annual footprint. Source: EC JRC/Google. Class transitions are not independently validated land-use or storage changes.</w:t>
+      <w:bookmarkEnd w:id="7003"/>
+      <w:r>
+        <w:t>. Gross source-class transitions and static landscape context on the original annual footprint. (A) Area in km² between strict five-year majority classes in 2000–2004 and 2017–2021; 11.04 km² without a majority in either window are excluded from the matrix. (B) Change between first and final five-year mean seasonal areas. Blue dots use a 500 m HydroRIVERS buffer; grey extents cover 200–1,000 m buffer settings and are sensitivity ranges, not uncertainty intervals. Away from the river buffer, groups use static WorldCover 2020 cropland or other cover. Context and class transitions do not establish historical land conversion or causal drivers.</w:t>
       </w:r>
     </w:p>
     <w:p>
@@ -5046,9 +5947,9 @@
         </w:rPr>
         <w:drawing>
           <wp:inline distT="0" distB="0" distL="0" distR="0" wp14:anchorId="12E2B577" wp14:editId="1E584331">
-            <wp:extent cx="6192000" cy="3853953"/>
+            <wp:extent cx="6192000" cy="3924507"/>
             <wp:effectExtent l="0" t="0" r="0" b="0"/>
-            <wp:docPr id="4" name="Picture 4" descr="Figure 4. Sensitivity of annual climate-adjusted time coefficients to observation effort and the 2016 corrected-asset boundary. (A) Seasonal class. (B) Permanent class. Points and bars show coefficients and pointwise 95% calendar-distance HAC intervals from 22 annual observations. All specifications contain annual rainfall, temperature and evaporation demand. Additional terms are identified in the legend. District multiplicity-adjusted p-values are reported in the text and underlying table. A processing indicator can also absorb a genuine physical discontinuity." title="Figure 4"/>
+            <wp:docPr id="4" name="Picture 4" descr="Figure 4. Annual time-coefficient sensitivity to simpler climate and observation controls on the original footprint, 2000–2021. (A) Seasonal class. (B) Permanent class. Models use June–September rainfall alone with time; rainfall plus annual/wet-season observation counts and a 2016 indicator; or the original annual rainfall, temperature, evaporation, observation and processing specification. Solid bars are pointwise 95% calendar-distance HAC lag-two intervals; dotted bars are approximate 95% fixed-design circular residual block bootstrap intervals of length three. Each fit uses 22 annual observations. The union overlaps districts; district multiplicity is reported separately in the text and tables." title="Figure 4"/>
             <wp:cNvGraphicFramePr>
               <a:graphicFrameLocks xmlns:a="http://schemas.openxmlformats.org/drawingml/2006/main" noChangeAspect="1"/>
             </wp:cNvGraphicFramePr>
@@ -5068,7 +5969,7 @@
                   <pic:spPr>
                     <a:xfrm>
                       <a:off x="0" y="0"/>
-                      <a:ext cx="6192000" cy="3853953"/>
+                      <a:ext cx="6192000" cy="3924507"/>
                     </a:xfrm>
                     <a:prstGeom prst="rect">
                       <a:avLst/>
@@ -5086,13 +5987,13 @@
         <w:pStyle w:val="Caption"/>
         <w:spacing w:after="180"/>
       </w:pPr>
-      <w:bookmarkStart w:id="20" w:name="fig_04"/>
+      <w:bookmarkStart w:id="7004" w:name="fig_04"/>
       <w:r>
         <w:t>Figure 4</w:t>
       </w:r>
-      <w:bookmarkEnd w:id="20"/>
-      <w:r>
-        <w:t>. Sensitivity of annual climate-adjusted time coefficients to observation effort and the 2016 corrected-asset boundary. (A) Seasonal class. (B) Permanent class. Points and bars show coefficients and pointwise 95% calendar-distance HAC intervals from 22 annual observations. All specifications contain annual rainfall, temperature and evaporation demand. Additional terms are identified in the legend. District multiplicity-adjusted p-values are reported in the text and underlying table. A processing indicator can also absorb a genuine physical discontinuity.</w:t>
+      <w:bookmarkEnd w:id="7004"/>
+      <w:r>
+        <w:t>. Annual time-coefficient sensitivity to simpler climate and observation controls on the original footprint, 2000–2021. (A) Seasonal class. (B) Permanent class. Models use June–September rainfall alone with time; rainfall plus annual/wet-season observation counts and a 2016 indicator; or the original annual rainfall, temperature, evaporation, observation and processing specification. Solid bars are pointwise 95% calendar-distance HAC lag-two intervals; dotted bars are approximate 95% fixed-design circular residual block bootstrap intervals of length three. Each fit uses 22 annual observations. The union overlaps districts; district multiplicity is reported separately in the text and tables.</w:t>
       </w:r>
     </w:p>
     <w:p>
@@ -5117,11 +6018,7 @@
         <w:pStyle w:val="BodyText"/>
       </w:pPr>
       <w:r>
-        <w:t xml:space="preserve">The annual seasonal climate model also had limited predictive benefit. Mean fold RMSE was higher than the training-only mean benchmark in every district and the union. For the union, model RMSE was 0.0898 of footprint fraction, compared with 0.0862 for the benchmark. Permanent-class mean fold errors were lower than the corresponding benchmarks, but only three annual folds were available in each case. Climate-adjusted associations should therefore be interpreted without a general claim of improved </w:t>
-      </w:r>
-      <w:r>
-        <w:lastRenderedPageBreak/>
-        <w:t>prediction. Full coefficients, fold summaries and the separate 2000–2024 sensitivity are provided in Supplementary Data.</w:t>
+        <w:t>Simpler models retained the direction of the seasonal association. In the union, the monsoon-rainfall model gave −0.0341 logit share year⁻¹ (95% HAC interval −0.0541 to −0.0140); adding both observation terms and the 2016 indicator gave −0.0691 (−0.0875 to −0.0507). Its residual block intervals were −0.0855 to −0.0528, −0.0850 to −0.0541 and −0.0835 to −0.0555 for lengths two, three and four. District BY-adjusted p-values for this reduced controlled model were 0.000407 in Naogaon, 0.0734 in Chapainawabganj and 0.000407 in Rajshahi. A pointwise interval excluding zero in Chapainawabganj did not imply significance in that adjusted family. The 2013–2021 trend-only union seasonal interval included zero (−0.0431; −0.0887 to 0.0025); adding monsoon rainfall gave −0.0896 (−0.1608 to −0.0183). Short-series and overlapping-cohort results are sensitivities, not independent replication.</w:t>
       </w:r>
     </w:p>
     <w:p>
@@ -5129,40 +6026,20 @@
         <w:pStyle w:val="BodyText"/>
       </w:pPr>
       <w:r>
-        <w:fldChar w:fldCharType="begin"/>
-      </w:r>
-      <w:r>
-        <w:instrText xml:space="preserve"> REF fig_05 \h </w:instrText>
-      </w:r>
-      <w:r>
-        <w:fldChar w:fldCharType="separate"/>
-      </w:r>
-      <w:r>
-        <w:t>Figure 5</w:t>
-      </w:r>
-      <w:r>
-        <w:fldChar w:fldCharType="end"/>
-      </w:r>
-      <w:r>
-        <w:t xml:space="preserve"> places the observed class areas beside the baseline fixed-climate model expectations. The smooth expected curves are model-derived summaries, not replacement observations or validation of the class assignments. Their interpretation remains subject to the processing and observation sensitivities in </w:t>
-      </w:r>
-      <w:r>
-        <w:fldChar w:fldCharType="begin"/>
-      </w:r>
-      <w:r>
-        <w:instrText xml:space="preserve"> REF fig_04 \h </w:instrText>
-      </w:r>
-      <w:r>
-        <w:fldChar w:fldCharType="separate"/>
-      </w:r>
-      <w:r>
-        <w:t>Figure 4</w:t>
-      </w:r>
-      <w:r>
-        <w:fldChar w:fldCharType="end"/>
-      </w:r>
-      <w:r>
-        <w:t>.</w:t>
+        <w:t>The new models and matched-fold aggregation changed the hindcast comparison. Union seasonal pooled RMSE was 0.0745 for the monsoon model versus 0.0899 for the mean and 0.0628 for the trend benchmark on six test years. The reduced controlled model gave 0.0486 versus matched mean/trend errors of 0.1039/0.0726 on four years. Adding antecedent rainfall gave 0.0458, while the original full-control specification gave 0.0691 on those four years. These small, differing test sets limit generalization. The original climate-only analysis and its mean-of-fold-RMSE summaries remain archived and are distinct from this matched-fold pooled comparison.</w:t>
+      </w:r>
+    </w:p>
+    <w:p>
+      <w:pPr>
+        <w:pStyle w:val="BodyText"/>
+      </w:pPr>
+      <w:fldSimple w:instr=" REF fig_05 \h ">
+        <w:r>
+          <w:t>Figure 5</w:t>
+        </w:r>
+      </w:fldSimple>
+      <w:r>
+        <w:t xml:space="preserve"> compares the footprint, time-window, equal-calendar support and hindcast sensitivities. On C1, the first-to-final three- and five-year seasonal changes were −14.28% and −14.70%, compared with −25.42% for endpoints. The five-year decrease was −18.79% on C4 and −19.72% on C5; C6 lacked sufficient coverage for a five-year comparison. All accepted primary seasonal point coefficients were negative across the tested cohorts/models, but their intervals and dependence preclude treating them as independent confirmations. Only November retained at least 20% of the union baseline-water footprint under the 22-year same-calendar rule (25.35%); June–October retained none. Equalizing calendar-month support therefore did not yield a representative complete annual cycle.</w:t>
       </w:r>
     </w:p>
     <w:p>
@@ -5177,9 +6054,9 @@
         </w:rPr>
         <w:drawing>
           <wp:inline distT="0" distB="0" distL="0" distR="0" wp14:anchorId="3B1661AD" wp14:editId="64AE107F">
-            <wp:extent cx="6182409" cy="6840000"/>
+            <wp:extent cx="6192000" cy="5668732"/>
             <wp:effectExtent l="0" t="0" r="0" b="0"/>
-            <wp:docPr id="5" name="Picture 5" descr="Figure 5. Primary annual fixed-climate expectations, 2000–2021, from separate class-share models. These baseline climate-model curves should be read alongside the observation/processing sensitivities in Figure 4. Model-derived curves are not missing-observation replacements." title="Figure 5"/>
+            <wp:docPr id="5" name="Picture 5" descr="Figure 5. Sensitivity to comparison windows, footprint definition and temporal validation. (A) Union seasonal changes for one-, three- and five-year windows, 2000–2021. C1–C7 are defined in Section 2.8; a missing symbol indicates an unavailable comparison. (B) Baseline-water footprint retained by identical calendar-month observations across all 22 years; crosses show zero support and the dashed line is the 20% fitting gate. (C) Seasonal coefficients and pointwise 95% HAC lag-two intervals for the monsoon/observation/processing model across cohorts. (D) Pooled chronological test RMSE divided by the training-only mean benchmark on exactly the same accepted folds; test-year counts are in parentheses. A ratio below one indicates lower error than that benchmark, not water-classification accuracy." title="Figure 5"/>
             <wp:cNvGraphicFramePr>
               <a:graphicFrameLocks xmlns:a="http://schemas.openxmlformats.org/drawingml/2006/main" noChangeAspect="1"/>
             </wp:cNvGraphicFramePr>
@@ -5199,7 +6076,7 @@
                   <pic:spPr>
                     <a:xfrm>
                       <a:off x="0" y="0"/>
-                      <a:ext cx="6182409" cy="6840000"/>
+                      <a:ext cx="6192000" cy="5668732"/>
                     </a:xfrm>
                     <a:prstGeom prst="rect">
                       <a:avLst/>
@@ -5217,13 +6094,13 @@
         <w:pStyle w:val="Caption"/>
         <w:spacing w:after="180"/>
       </w:pPr>
-      <w:bookmarkStart w:id="21" w:name="fig_05"/>
+      <w:bookmarkStart w:id="7005" w:name="fig_05"/>
       <w:r>
         <w:t>Figure 5</w:t>
       </w:r>
-      <w:bookmarkEnd w:id="21"/>
-      <w:r>
-        <w:t>. Primary annual fixed-climate expectations, 2000–2021, from separate class-share models. These baseline climate-model curves should be read alongside the observation/processing sensitivities in Figure 4. Model-derived curves are not missing-observation replacements.</w:t>
+      <w:bookmarkEnd w:id="7005"/>
+      <w:r>
+        <w:t>. Sensitivity to comparison windows, footprint definition and temporal validation. (A) Union seasonal changes for one-, three- and five-year windows, 2000–2021. C1–C7 are defined in Section 2.8; a missing symbol indicates an unavailable comparison. (B) Baseline-water footprint retained by identical calendar-month observations across all 22 years; crosses show zero support and the dashed line is the 20% fitting gate. (C) Seasonal coefficients and pointwise 95% HAC lag-two intervals for the monsoon/observation/processing model across cohorts. (D) Pooled chronological test RMSE divided by the training-only mean benchmark on exactly the same accepted folds; test-year counts are in parentheses. A ratio below one indicates lower error than that benchmark, not water-classification accuracy.</w:t>
       </w:r>
     </w:p>
     <w:p>
@@ -5453,22 +6330,15 @@
         <w:pStyle w:val="BodyText"/>
       </w:pPr>
       <w:r>
-        <w:fldChar w:fldCharType="begin"/>
-      </w:r>
-      <w:r>
-        <w:instrText xml:space="preserve"> REF fig_08 \h </w:instrText>
-      </w:r>
-      <w:r>
-        <w:fldChar w:fldCharType="separate"/>
-      </w:r>
-      <w:r>
-        <w:t>Figure 8</w:t>
-      </w:r>
-      <w:r>
-        <w:fldChar w:fldCharType="end"/>
-      </w:r>
-      <w:r>
-        <w:t xml:space="preserve"> shows both endpoints for all three districts and all three historical cohorts, including intervals crossing zero. This retains the unsupported combinations alongside the highlighted Rajshahi result.</w:t>
+        <w:t xml:space="preserve">Seasonal support and class-specific diagnostics are shown in </w:t>
+      </w:r>
+      <w:fldSimple w:instr=" REF fig_08 \h ">
+        <w:r>
+          <w:t>Figure 8</w:t>
+        </w:r>
+      </w:fldSimple>
+      <w:r>
+        <w:t xml:space="preserve">. At thresholds 0.5 and 0.7, mean paired support during June–September was only 0.313% and 0.110% of the union historical-water cohort, versus 16.45% and 4.87% in other months. A bounded November 2024 score-stage probe examined one land-context area and three stable-source-water interiors. Maximum raw water scores were 0.619 and 0.753, respectively, and monthly-median maxima were 0.506 and 0.748; neither probe retained threshold-0.8 support. These selected areas cannot establish a domain-wide probability ceiling or rule out every processing error. The dated assisted comparison also differed between water and nonwater agreement, particularly in Naogaon. Neither diagnostic is an independent accuracy assessment. Full radar model and joint-cell tables retain unsupported combinations.</w:t>
       </w:r>
     </w:p>
     <w:p>
@@ -5484,9 +6354,9 @@
         <w:lastRenderedPageBreak/>
         <w:drawing>
           <wp:inline distT="0" distB="0" distL="0" distR="0" wp14:anchorId="6B194FF1" wp14:editId="451CBED8">
-            <wp:extent cx="6192000" cy="5629587"/>
+            <wp:extent cx="6192000" cy="5494309"/>
             <wp:effectExtent l="0" t="0" r="0" b="0"/>
-            <wp:docPr id="8" name="Picture 8" descr="Figure 8. Exploratory radar envelope time coefficients for the three districts, all three cohorts and both endpoints. Filled markers indicate district-family BY-adjusted p &lt; 0.05. These 2015–2024 cohort outcomes differ from annual JRC class areas; nulls are retained." title="Figure 8"/>
+            <wp:docPr id="8" name="Picture 8" descr="Figure 8. Seasonal and class-specific limits to satellite agreement. (A) Mean SAR–Dynamic World paired support in June–September and other months during 2015–2024, retaining zero-support months. (B) Agreement pooled by paired area-time in those seasons. (C) November 2024 maximum raw and monthly-median probabilities in one small land-context probe and three stable-source-water interiors; probes are selected diagnostics, not independently labeled validation sites. The dashed line is threshold 0.8. (D) Symmetric positive (water) and negative (nonwater) agreement between JRC and assigned assisted labels, pooled across the four sampled months within district; unresolved weight is excluded from these conditional ratios. Assisted labels and optical lineage prevent interpreting them as independent accuracy." title="Figure 8"/>
             <wp:cNvGraphicFramePr>
               <a:graphicFrameLocks xmlns:a="http://schemas.openxmlformats.org/drawingml/2006/main" noChangeAspect="1"/>
             </wp:cNvGraphicFramePr>
@@ -5506,7 +6376,7 @@
                   <pic:spPr>
                     <a:xfrm>
                       <a:off x="0" y="0"/>
-                      <a:ext cx="6192000" cy="5629587"/>
+                      <a:ext cx="6192000" cy="5494309"/>
                     </a:xfrm>
                     <a:prstGeom prst="rect">
                       <a:avLst/>
@@ -5524,13 +6394,13 @@
         <w:pStyle w:val="Caption"/>
         <w:spacing w:after="180"/>
       </w:pPr>
-      <w:bookmarkStart w:id="25" w:name="fig_08"/>
+      <w:bookmarkStart w:id="7008" w:name="fig_08"/>
       <w:r>
         <w:t>Figure 8</w:t>
       </w:r>
-      <w:bookmarkEnd w:id="25"/>
-      <w:r>
-        <w:t>. Exploratory radar envelope time coefficients for the three districts, all three cohorts and both endpoints. Filled markers indicate district-family BY-adjusted p &lt; 0.05. These 2015–2024 cohort outcomes differ from annual JRC class areas; nulls are retained.</w:t>
+      <w:bookmarkEnd w:id="7008"/>
+      <w:r>
+        <w:t>. Seasonal and class-specific limits to satellite agreement. (A) Mean SAR–Dynamic World paired support in June–September and other months during 2015–2024, retaining zero-support months. (B) Agreement pooled by paired area-time in those seasons. (C) November 2024 maximum raw and monthly-median probabilities in one small land-context probe and three stable-source-water interiors; probes are selected diagnostics, not independently labeled validation sites. The dashed line is threshold 0.8. (D) Symmetric positive (water) and negative (nonwater) agreement between JRC and assigned assisted labels, pooled across the four sampled months within district; unresolved weight is excluded from these conditional ratios. Assisted labels and optical lineage prevent interpreting them as independent accuracy.</w:t>
       </w:r>
     </w:p>
     <w:p>
@@ -5666,9 +6536,17 @@
     </w:p>
     <w:tbl>
       <w:tblPr>
-        <w:tblW w:w="5000" w:type="pct"/>
+        <w:tblW w:w="10205" w:type="dxa"/>
         <w:tblLayout w:type="fixed"/>
         <w:tblLook w:val="0020" w:firstRow="1" w:lastRow="0" w:firstColumn="0" w:lastColumn="0" w:noHBand="0" w:noVBand="0"/>
+        <w:tblBorders>
+          <w:top w:val="single" w:sz="4" w:color="D9D9D9"/>
+          <w:left w:val="single" w:sz="4" w:color="D9D9D9"/>
+          <w:bottom w:val="single" w:sz="4" w:color="D9D9D9"/>
+          <w:right w:val="single" w:sz="4" w:color="D9D9D9"/>
+          <w:insideH w:val="single" w:sz="4" w:color="D9D9D9"/>
+          <w:insideV w:val="single" w:sz="4" w:color="D9D9D9"/>
+        </w:tblBorders>
       </w:tblPr>
       <w:tblGrid>
         <w:gridCol w:w="4632"/>
@@ -5686,16 +6564,24 @@
           <w:tcPr>
             <w:tcW w:w="4535" w:type="dxa"/>
             <w:shd w:val="clear" w:color="auto" w:fill="EDF2F5"/>
+            <w:tcMar>
+              <w:top w:w="55" w:type="dxa"/>
+              <w:bottom w:w="55" w:type="dxa"/>
+              <w:left w:w="80" w:type="dxa"/>
+              <w:right w:w="80" w:type="dxa"/>
+            </w:tcMar>
           </w:tcPr>
           <w:p>
             <w:pPr>
               <w:keepNext/>
-              <w:spacing w:before="80" w:after="80"/>
+              <w:spacing w:before="0" w:after="40"/>
+              <w:ind w:left="0" w:right="0"/>
+              <w:jc w:val="left"/>
             </w:pPr>
             <w:r>
               <w:rPr>
                 <w:b/>
-                <w:sz w:val="20"/>
+                <w:sz w:val="18"/>
               </w:rPr>
               <w:t>Outcome or comparison route</w:t>
             </w:r>
@@ -5705,17 +6591,24 @@
           <w:tcPr>
             <w:tcW w:w="1361" w:type="dxa"/>
             <w:shd w:val="clear" w:color="auto" w:fill="EDF2F5"/>
+            <w:tcMar>
+              <w:top w:w="55" w:type="dxa"/>
+              <w:bottom w:w="55" w:type="dxa"/>
+              <w:left w:w="80" w:type="dxa"/>
+              <w:right w:w="80" w:type="dxa"/>
+            </w:tcMar>
           </w:tcPr>
           <w:p>
             <w:pPr>
               <w:keepNext/>
-              <w:spacing w:before="80" w:after="80"/>
-              <w:jc w:val="center"/>
+              <w:spacing w:before="0" w:after="40"/>
+              <w:ind w:left="0" w:right="0"/>
+              <w:jc w:val="left"/>
             </w:pPr>
             <w:r>
               <w:rPr>
                 <w:b/>
-                <w:sz w:val="20"/>
+                <w:sz w:val="18"/>
               </w:rPr>
               <w:t>Pixel-months (n)</w:t>
             </w:r>
@@ -5725,17 +6618,24 @@
           <w:tcPr>
             <w:tcW w:w="1134" w:type="dxa"/>
             <w:shd w:val="clear" w:color="auto" w:fill="EDF2F5"/>
+            <w:tcMar>
+              <w:top w:w="55" w:type="dxa"/>
+              <w:bottom w:w="55" w:type="dxa"/>
+              <w:left w:w="80" w:type="dxa"/>
+              <w:right w:w="80" w:type="dxa"/>
+            </w:tcMar>
           </w:tcPr>
           <w:p>
             <w:pPr>
               <w:keepNext/>
-              <w:spacing w:before="80" w:after="80"/>
-              <w:jc w:val="center"/>
+              <w:spacing w:before="0" w:after="40"/>
+              <w:ind w:left="0" w:right="0"/>
+              <w:jc w:val="right"/>
             </w:pPr>
             <w:r>
               <w:rPr>
                 <w:b/>
-                <w:sz w:val="20"/>
+                <w:sz w:val="18"/>
               </w:rPr>
               <w:t>Weight (%)</w:t>
             </w:r>
@@ -5745,17 +6645,24 @@
           <w:tcPr>
             <w:tcW w:w="1417" w:type="dxa"/>
             <w:shd w:val="clear" w:color="auto" w:fill="EDF2F5"/>
+            <w:tcMar>
+              <w:top w:w="55" w:type="dxa"/>
+              <w:bottom w:w="55" w:type="dxa"/>
+              <w:left w:w="80" w:type="dxa"/>
+              <w:right w:w="80" w:type="dxa"/>
+            </w:tcMar>
           </w:tcPr>
           <w:p>
             <w:pPr>
               <w:keepNext/>
-              <w:spacing w:before="80" w:after="80"/>
-              <w:jc w:val="center"/>
+              <w:spacing w:before="0" w:after="40"/>
+              <w:ind w:left="0" w:right="0"/>
+              <w:jc w:val="right"/>
             </w:pPr>
             <w:r>
               <w:rPr>
                 <w:b/>
-                <w:sz w:val="20"/>
+                <w:sz w:val="18"/>
               </w:rPr>
               <w:t>Agreement (%)</w:t>
             </w:r>
@@ -5765,17 +6672,24 @@
           <w:tcPr>
             <w:tcW w:w="1757" w:type="dxa"/>
             <w:shd w:val="clear" w:color="auto" w:fill="EDF2F5"/>
+            <w:tcMar>
+              <w:top w:w="55" w:type="dxa"/>
+              <w:bottom w:w="55" w:type="dxa"/>
+              <w:left w:w="80" w:type="dxa"/>
+              <w:right w:w="80" w:type="dxa"/>
+            </w:tcMar>
           </w:tcPr>
           <w:p>
             <w:pPr>
               <w:keepNext/>
-              <w:spacing w:before="80" w:after="80"/>
-              <w:jc w:val="center"/>
+              <w:spacing w:before="0" w:after="40"/>
+              <w:ind w:left="0" w:right="0"/>
+              <w:jc w:val="right"/>
             </w:pPr>
             <w:r>
               <w:rPr>
                 <w:b/>
-                <w:sz w:val="20"/>
+                <w:sz w:val="18"/>
               </w:rPr>
               <w:t>Completion range (%)</w:t>
             </w:r>
@@ -5790,16 +6704,24 @@
           <w:tcPr>
             <w:tcW w:w="10204" w:type="dxa"/>
             <w:gridSpan w:val="5"/>
+            <w:tcMar>
+              <w:top w:w="55" w:type="dxa"/>
+              <w:bottom w:w="55" w:type="dxa"/>
+              <w:left w:w="80" w:type="dxa"/>
+              <w:right w:w="80" w:type="dxa"/>
+            </w:tcMar>
           </w:tcPr>
           <w:p>
             <w:pPr>
               <w:keepNext/>
-              <w:spacing w:before="80" w:after="80"/>
+              <w:spacing w:before="0" w:after="40"/>
+              <w:ind w:left="0" w:right="0"/>
+              <w:jc w:val="left"/>
             </w:pPr>
             <w:r>
               <w:rPr>
                 <w:b/>
-                <w:sz w:val="20"/>
+                <w:sz w:val="18"/>
               </w:rPr>
               <w:t>A. Outcomes for all sampled pixel-months</w:t>
             </w:r>
@@ -5813,15 +6735,23 @@
         <w:tc>
           <w:tcPr>
             <w:tcW w:w="4535" w:type="dxa"/>
+            <w:tcMar>
+              <w:top w:w="55" w:type="dxa"/>
+              <w:bottom w:w="55" w:type="dxa"/>
+              <w:left w:w="80" w:type="dxa"/>
+              <w:right w:w="80" w:type="dxa"/>
+            </w:tcMar>
           </w:tcPr>
           <w:p>
             <w:pPr>
               <w:keepNext/>
-              <w:spacing w:before="80" w:after="80"/>
+              <w:spacing w:before="0" w:after="40"/>
+              <w:ind w:left="0" w:right="0"/>
+              <w:jc w:val="left"/>
             </w:pPr>
             <w:r>
               <w:rPr>
-                <w:sz w:val="20"/>
+                <w:sz w:val="18"/>
               </w:rPr>
               <w:t>Automatic proxy assigned</w:t>
             </w:r>
@@ -5830,16 +6760,23 @@
         <w:tc>
           <w:tcPr>
             <w:tcW w:w="1361" w:type="dxa"/>
+            <w:tcMar>
+              <w:top w:w="55" w:type="dxa"/>
+              <w:bottom w:w="55" w:type="dxa"/>
+              <w:left w:w="80" w:type="dxa"/>
+              <w:right w:w="80" w:type="dxa"/>
+            </w:tcMar>
           </w:tcPr>
           <w:p>
             <w:pPr>
               <w:keepNext/>
-              <w:spacing w:before="80" w:after="80"/>
-              <w:jc w:val="center"/>
+              <w:spacing w:before="0" w:after="40"/>
+              <w:ind w:left="0" w:right="0"/>
+              <w:jc w:val="left"/>
             </w:pPr>
             <w:r>
               <w:rPr>
-                <w:sz w:val="20"/>
+                <w:sz w:val="18"/>
               </w:rPr>
               <w:t>337</w:t>
             </w:r>
@@ -5848,16 +6785,23 @@
         <w:tc>
           <w:tcPr>
             <w:tcW w:w="1134" w:type="dxa"/>
+            <w:tcMar>
+              <w:top w:w="55" w:type="dxa"/>
+              <w:bottom w:w="55" w:type="dxa"/>
+              <w:left w:w="80" w:type="dxa"/>
+              <w:right w:w="80" w:type="dxa"/>
+            </w:tcMar>
           </w:tcPr>
           <w:p>
             <w:pPr>
               <w:keepNext/>
-              <w:spacing w:before="80" w:after="80"/>
-              <w:jc w:val="center"/>
+              <w:spacing w:before="0" w:after="40"/>
+              <w:ind w:left="0" w:right="0"/>
+              <w:jc w:val="right"/>
             </w:pPr>
             <w:r>
               <w:rPr>
-                <w:sz w:val="20"/>
+                <w:sz w:val="18"/>
               </w:rPr>
               <w:t>58.43</w:t>
             </w:r>
@@ -5866,16 +6810,23 @@
         <w:tc>
           <w:tcPr>
             <w:tcW w:w="1417" w:type="dxa"/>
+            <w:tcMar>
+              <w:top w:w="55" w:type="dxa"/>
+              <w:bottom w:w="55" w:type="dxa"/>
+              <w:left w:w="80" w:type="dxa"/>
+              <w:right w:w="80" w:type="dxa"/>
+            </w:tcMar>
           </w:tcPr>
           <w:p>
             <w:pPr>
               <w:keepNext/>
-              <w:spacing w:before="80" w:after="80"/>
-              <w:jc w:val="center"/>
+              <w:spacing w:before="0" w:after="40"/>
+              <w:ind w:left="0" w:right="0"/>
+              <w:jc w:val="right"/>
             </w:pPr>
             <w:r>
               <w:rPr>
-                <w:sz w:val="20"/>
+                <w:sz w:val="18"/>
               </w:rPr>
               <w:t>—</w:t>
             </w:r>
@@ -5884,16 +6835,23 @@
         <w:tc>
           <w:tcPr>
             <w:tcW w:w="1757" w:type="dxa"/>
+            <w:tcMar>
+              <w:top w:w="55" w:type="dxa"/>
+              <w:bottom w:w="55" w:type="dxa"/>
+              <w:left w:w="80" w:type="dxa"/>
+              <w:right w:w="80" w:type="dxa"/>
+            </w:tcMar>
           </w:tcPr>
           <w:p>
             <w:pPr>
               <w:keepNext/>
-              <w:spacing w:before="80" w:after="80"/>
-              <w:jc w:val="center"/>
+              <w:spacing w:before="0" w:after="40"/>
+              <w:ind w:left="0" w:right="0"/>
+              <w:jc w:val="right"/>
             </w:pPr>
             <w:r>
               <w:rPr>
-                <w:sz w:val="20"/>
+                <w:sz w:val="18"/>
               </w:rPr>
               <w:t>—</w:t>
             </w:r>
@@ -5907,15 +6865,23 @@
         <w:tc>
           <w:tcPr>
             <w:tcW w:w="4535" w:type="dxa"/>
+            <w:tcMar>
+              <w:top w:w="55" w:type="dxa"/>
+              <w:bottom w:w="55" w:type="dxa"/>
+              <w:left w:w="80" w:type="dxa"/>
+              <w:right w:w="80" w:type="dxa"/>
+            </w:tcMar>
           </w:tcPr>
           <w:p>
             <w:pPr>
               <w:keepNext/>
-              <w:spacing w:before="80" w:after="80"/>
+              <w:spacing w:before="0" w:after="40"/>
+              <w:ind w:left="0" w:right="0"/>
+              <w:jc w:val="left"/>
             </w:pPr>
             <w:r>
               <w:rPr>
-                <w:sz w:val="20"/>
+                <w:sz w:val="18"/>
               </w:rPr>
               <w:t>Consistent human dates assigned</w:t>
             </w:r>
@@ -5924,16 +6890,23 @@
         <w:tc>
           <w:tcPr>
             <w:tcW w:w="1361" w:type="dxa"/>
+            <w:tcMar>
+              <w:top w:w="55" w:type="dxa"/>
+              <w:bottom w:w="55" w:type="dxa"/>
+              <w:left w:w="80" w:type="dxa"/>
+              <w:right w:w="80" w:type="dxa"/>
+            </w:tcMar>
           </w:tcPr>
           <w:p>
             <w:pPr>
               <w:keepNext/>
-              <w:spacing w:before="80" w:after="80"/>
-              <w:jc w:val="center"/>
+              <w:spacing w:before="0" w:after="40"/>
+              <w:ind w:left="0" w:right="0"/>
+              <w:jc w:val="left"/>
             </w:pPr>
             <w:r>
               <w:rPr>
-                <w:sz w:val="20"/>
+                <w:sz w:val="18"/>
               </w:rPr>
               <w:t>194</w:t>
             </w:r>
@@ -5942,16 +6915,23 @@
         <w:tc>
           <w:tcPr>
             <w:tcW w:w="1134" w:type="dxa"/>
+            <w:tcMar>
+              <w:top w:w="55" w:type="dxa"/>
+              <w:bottom w:w="55" w:type="dxa"/>
+              <w:left w:w="80" w:type="dxa"/>
+              <w:right w:w="80" w:type="dxa"/>
+            </w:tcMar>
           </w:tcPr>
           <w:p>
             <w:pPr>
               <w:keepNext/>
-              <w:spacing w:before="80" w:after="80"/>
-              <w:jc w:val="center"/>
+              <w:spacing w:before="0" w:after="40"/>
+              <w:ind w:left="0" w:right="0"/>
+              <w:jc w:val="right"/>
             </w:pPr>
             <w:r>
               <w:rPr>
-                <w:sz w:val="20"/>
+                <w:sz w:val="18"/>
               </w:rPr>
               <w:t>18.11</w:t>
             </w:r>
@@ -5960,16 +6940,23 @@
         <w:tc>
           <w:tcPr>
             <w:tcW w:w="1417" w:type="dxa"/>
+            <w:tcMar>
+              <w:top w:w="55" w:type="dxa"/>
+              <w:bottom w:w="55" w:type="dxa"/>
+              <w:left w:w="80" w:type="dxa"/>
+              <w:right w:w="80" w:type="dxa"/>
+            </w:tcMar>
           </w:tcPr>
           <w:p>
             <w:pPr>
               <w:keepNext/>
-              <w:spacing w:before="80" w:after="80"/>
-              <w:jc w:val="center"/>
+              <w:spacing w:before="0" w:after="40"/>
+              <w:ind w:left="0" w:right="0"/>
+              <w:jc w:val="right"/>
             </w:pPr>
             <w:r>
               <w:rPr>
-                <w:sz w:val="20"/>
+                <w:sz w:val="18"/>
               </w:rPr>
               <w:t>—</w:t>
             </w:r>
@@ -5978,16 +6965,23 @@
         <w:tc>
           <w:tcPr>
             <w:tcW w:w="1757" w:type="dxa"/>
+            <w:tcMar>
+              <w:top w:w="55" w:type="dxa"/>
+              <w:bottom w:w="55" w:type="dxa"/>
+              <w:left w:w="80" w:type="dxa"/>
+              <w:right w:w="80" w:type="dxa"/>
+            </w:tcMar>
           </w:tcPr>
           <w:p>
             <w:pPr>
               <w:keepNext/>
-              <w:spacing w:before="80" w:after="80"/>
-              <w:jc w:val="center"/>
+              <w:spacing w:before="0" w:after="40"/>
+              <w:ind w:left="0" w:right="0"/>
+              <w:jc w:val="right"/>
             </w:pPr>
             <w:r>
               <w:rPr>
-                <w:sz w:val="20"/>
+                <w:sz w:val="18"/>
               </w:rPr>
               <w:t>—</w:t>
             </w:r>
@@ -6001,15 +6995,23 @@
         <w:tc>
           <w:tcPr>
             <w:tcW w:w="4535" w:type="dxa"/>
+            <w:tcMar>
+              <w:top w:w="55" w:type="dxa"/>
+              <w:bottom w:w="55" w:type="dxa"/>
+              <w:left w:w="80" w:type="dxa"/>
+              <w:right w:w="80" w:type="dxa"/>
+            </w:tcMar>
           </w:tcPr>
           <w:p>
             <w:pPr>
               <w:keepNext/>
-              <w:spacing w:before="80" w:after="80"/>
+              <w:spacing w:before="0" w:after="40"/>
+              <w:ind w:left="0" w:right="0"/>
+              <w:jc w:val="left"/>
             </w:pPr>
             <w:r>
               <w:rPr>
-                <w:sz w:val="20"/>
+                <w:sz w:val="18"/>
               </w:rPr>
               <w:t>Temporal change: unresolved</w:t>
             </w:r>
@@ -6018,16 +7020,23 @@
         <w:tc>
           <w:tcPr>
             <w:tcW w:w="1361" w:type="dxa"/>
+            <w:tcMar>
+              <w:top w:w="55" w:type="dxa"/>
+              <w:bottom w:w="55" w:type="dxa"/>
+              <w:left w:w="80" w:type="dxa"/>
+              <w:right w:w="80" w:type="dxa"/>
+            </w:tcMar>
           </w:tcPr>
           <w:p>
             <w:pPr>
               <w:keepNext/>
-              <w:spacing w:before="80" w:after="80"/>
-              <w:jc w:val="center"/>
+              <w:spacing w:before="0" w:after="40"/>
+              <w:ind w:left="0" w:right="0"/>
+              <w:jc w:val="left"/>
             </w:pPr>
             <w:r>
               <w:rPr>
-                <w:sz w:val="20"/>
+                <w:sz w:val="18"/>
               </w:rPr>
               <w:t>35</w:t>
             </w:r>
@@ -6036,16 +7045,23 @@
         <w:tc>
           <w:tcPr>
             <w:tcW w:w="1134" w:type="dxa"/>
+            <w:tcMar>
+              <w:top w:w="55" w:type="dxa"/>
+              <w:bottom w:w="55" w:type="dxa"/>
+              <w:left w:w="80" w:type="dxa"/>
+              <w:right w:w="80" w:type="dxa"/>
+            </w:tcMar>
           </w:tcPr>
           <w:p>
             <w:pPr>
               <w:keepNext/>
-              <w:spacing w:before="80" w:after="80"/>
-              <w:jc w:val="center"/>
+              <w:spacing w:before="0" w:after="40"/>
+              <w:ind w:left="0" w:right="0"/>
+              <w:jc w:val="right"/>
             </w:pPr>
             <w:r>
               <w:rPr>
-                <w:sz w:val="20"/>
+                <w:sz w:val="18"/>
               </w:rPr>
               <w:t>1.38</w:t>
             </w:r>
@@ -6054,16 +7070,23 @@
         <w:tc>
           <w:tcPr>
             <w:tcW w:w="1417" w:type="dxa"/>
+            <w:tcMar>
+              <w:top w:w="55" w:type="dxa"/>
+              <w:bottom w:w="55" w:type="dxa"/>
+              <w:left w:w="80" w:type="dxa"/>
+              <w:right w:w="80" w:type="dxa"/>
+            </w:tcMar>
           </w:tcPr>
           <w:p>
             <w:pPr>
               <w:keepNext/>
-              <w:spacing w:before="80" w:after="80"/>
-              <w:jc w:val="center"/>
+              <w:spacing w:before="0" w:after="40"/>
+              <w:ind w:left="0" w:right="0"/>
+              <w:jc w:val="right"/>
             </w:pPr>
             <w:r>
               <w:rPr>
-                <w:sz w:val="20"/>
+                <w:sz w:val="18"/>
               </w:rPr>
               <w:t>—</w:t>
             </w:r>
@@ -6072,16 +7095,23 @@
         <w:tc>
           <w:tcPr>
             <w:tcW w:w="1757" w:type="dxa"/>
+            <w:tcMar>
+              <w:top w:w="55" w:type="dxa"/>
+              <w:bottom w:w="55" w:type="dxa"/>
+              <w:left w:w="80" w:type="dxa"/>
+              <w:right w:w="80" w:type="dxa"/>
+            </w:tcMar>
           </w:tcPr>
           <w:p>
             <w:pPr>
               <w:keepNext/>
-              <w:spacing w:before="80" w:after="80"/>
-              <w:jc w:val="center"/>
+              <w:spacing w:before="0" w:after="40"/>
+              <w:ind w:left="0" w:right="0"/>
+              <w:jc w:val="right"/>
             </w:pPr>
             <w:r>
               <w:rPr>
-                <w:sz w:val="20"/>
+                <w:sz w:val="18"/>
               </w:rPr>
               <w:t>—</w:t>
             </w:r>
@@ -6095,15 +7125,23 @@
         <w:tc>
           <w:tcPr>
             <w:tcW w:w="4535" w:type="dxa"/>
+            <w:tcMar>
+              <w:top w:w="55" w:type="dxa"/>
+              <w:bottom w:w="55" w:type="dxa"/>
+              <w:left w:w="80" w:type="dxa"/>
+              <w:right w:w="80" w:type="dxa"/>
+            </w:tcMar>
           </w:tcPr>
           <w:p>
             <w:pPr>
               <w:keepNext/>
-              <w:spacing w:before="80" w:after="80"/>
+              <w:spacing w:before="0" w:after="40"/>
+              <w:ind w:left="0" w:right="0"/>
+              <w:jc w:val="left"/>
             </w:pPr>
             <w:r>
               <w:rPr>
-                <w:sz w:val="20"/>
+                <w:sz w:val="18"/>
               </w:rPr>
               <w:t>Uncertain dates: unresolved</w:t>
             </w:r>
@@ -6112,16 +7150,23 @@
         <w:tc>
           <w:tcPr>
             <w:tcW w:w="1361" w:type="dxa"/>
+            <w:tcMar>
+              <w:top w:w="55" w:type="dxa"/>
+              <w:bottom w:w="55" w:type="dxa"/>
+              <w:left w:w="80" w:type="dxa"/>
+              <w:right w:w="80" w:type="dxa"/>
+            </w:tcMar>
           </w:tcPr>
           <w:p>
             <w:pPr>
               <w:keepNext/>
-              <w:spacing w:before="80" w:after="80"/>
-              <w:jc w:val="center"/>
+              <w:spacing w:before="0" w:after="40"/>
+              <w:ind w:left="0" w:right="0"/>
+              <w:jc w:val="left"/>
             </w:pPr>
             <w:r>
               <w:rPr>
-                <w:sz w:val="20"/>
+                <w:sz w:val="18"/>
               </w:rPr>
               <w:t>16</w:t>
             </w:r>
@@ -6130,16 +7175,23 @@
         <w:tc>
           <w:tcPr>
             <w:tcW w:w="1134" w:type="dxa"/>
+            <w:tcMar>
+              <w:top w:w="55" w:type="dxa"/>
+              <w:bottom w:w="55" w:type="dxa"/>
+              <w:left w:w="80" w:type="dxa"/>
+              <w:right w:w="80" w:type="dxa"/>
+            </w:tcMar>
           </w:tcPr>
           <w:p>
             <w:pPr>
               <w:keepNext/>
-              <w:spacing w:before="80" w:after="80"/>
-              <w:jc w:val="center"/>
+              <w:spacing w:before="0" w:after="40"/>
+              <w:ind w:left="0" w:right="0"/>
+              <w:jc w:val="right"/>
             </w:pPr>
             <w:r>
               <w:rPr>
-                <w:sz w:val="20"/>
+                <w:sz w:val="18"/>
               </w:rPr>
               <w:t>1.80</w:t>
             </w:r>
@@ -6148,16 +7200,23 @@
         <w:tc>
           <w:tcPr>
             <w:tcW w:w="1417" w:type="dxa"/>
+            <w:tcMar>
+              <w:top w:w="55" w:type="dxa"/>
+              <w:bottom w:w="55" w:type="dxa"/>
+              <w:left w:w="80" w:type="dxa"/>
+              <w:right w:w="80" w:type="dxa"/>
+            </w:tcMar>
           </w:tcPr>
           <w:p>
             <w:pPr>
               <w:keepNext/>
-              <w:spacing w:before="80" w:after="80"/>
-              <w:jc w:val="center"/>
+              <w:spacing w:before="0" w:after="40"/>
+              <w:ind w:left="0" w:right="0"/>
+              <w:jc w:val="right"/>
             </w:pPr>
             <w:r>
               <w:rPr>
-                <w:sz w:val="20"/>
+                <w:sz w:val="18"/>
               </w:rPr>
               <w:t>—</w:t>
             </w:r>
@@ -6166,16 +7225,23 @@
         <w:tc>
           <w:tcPr>
             <w:tcW w:w="1757" w:type="dxa"/>
+            <w:tcMar>
+              <w:top w:w="55" w:type="dxa"/>
+              <w:bottom w:w="55" w:type="dxa"/>
+              <w:left w:w="80" w:type="dxa"/>
+              <w:right w:w="80" w:type="dxa"/>
+            </w:tcMar>
           </w:tcPr>
           <w:p>
             <w:pPr>
               <w:keepNext/>
-              <w:spacing w:before="80" w:after="80"/>
-              <w:jc w:val="center"/>
+              <w:spacing w:before="0" w:after="40"/>
+              <w:ind w:left="0" w:right="0"/>
+              <w:jc w:val="right"/>
             </w:pPr>
             <w:r>
               <w:rPr>
-                <w:sz w:val="20"/>
+                <w:sz w:val="18"/>
               </w:rPr>
               <w:t>—</w:t>
             </w:r>
@@ -6189,15 +7255,23 @@
         <w:tc>
           <w:tcPr>
             <w:tcW w:w="4535" w:type="dxa"/>
+            <w:tcMar>
+              <w:top w:w="55" w:type="dxa"/>
+              <w:bottom w:w="55" w:type="dxa"/>
+              <w:left w:w="80" w:type="dxa"/>
+              <w:right w:w="80" w:type="dxa"/>
+            </w:tcMar>
           </w:tcPr>
           <w:p>
             <w:pPr>
               <w:keepNext/>
-              <w:spacing w:before="80" w:after="80"/>
+              <w:spacing w:before="0" w:after="40"/>
+              <w:ind w:left="0" w:right="0"/>
+              <w:jc w:val="left"/>
             </w:pPr>
             <w:r>
               <w:rPr>
-                <w:sz w:val="20"/>
+                <w:sz w:val="18"/>
               </w:rPr>
               <w:t>Insufficient dated support: unresolved</w:t>
             </w:r>
@@ -6206,16 +7280,23 @@
         <w:tc>
           <w:tcPr>
             <w:tcW w:w="1361" w:type="dxa"/>
+            <w:tcMar>
+              <w:top w:w="55" w:type="dxa"/>
+              <w:bottom w:w="55" w:type="dxa"/>
+              <w:left w:w="80" w:type="dxa"/>
+              <w:right w:w="80" w:type="dxa"/>
+            </w:tcMar>
           </w:tcPr>
           <w:p>
             <w:pPr>
               <w:keepNext/>
-              <w:spacing w:before="80" w:after="80"/>
-              <w:jc w:val="center"/>
+              <w:spacing w:before="0" w:after="40"/>
+              <w:ind w:left="0" w:right="0"/>
+              <w:jc w:val="left"/>
             </w:pPr>
             <w:r>
               <w:rPr>
-                <w:sz w:val="20"/>
+                <w:sz w:val="18"/>
               </w:rPr>
               <w:t>138</w:t>
             </w:r>
@@ -6224,16 +7305,23 @@
         <w:tc>
           <w:tcPr>
             <w:tcW w:w="1134" w:type="dxa"/>
+            <w:tcMar>
+              <w:top w:w="55" w:type="dxa"/>
+              <w:bottom w:w="55" w:type="dxa"/>
+              <w:left w:w="80" w:type="dxa"/>
+              <w:right w:w="80" w:type="dxa"/>
+            </w:tcMar>
           </w:tcPr>
           <w:p>
             <w:pPr>
               <w:keepNext/>
-              <w:spacing w:before="80" w:after="80"/>
-              <w:jc w:val="center"/>
+              <w:spacing w:before="0" w:after="40"/>
+              <w:ind w:left="0" w:right="0"/>
+              <w:jc w:val="right"/>
             </w:pPr>
             <w:r>
               <w:rPr>
-                <w:sz w:val="20"/>
+                <w:sz w:val="18"/>
               </w:rPr>
               <w:t>20.28</w:t>
             </w:r>
@@ -6242,16 +7330,23 @@
         <w:tc>
           <w:tcPr>
             <w:tcW w:w="1417" w:type="dxa"/>
+            <w:tcMar>
+              <w:top w:w="55" w:type="dxa"/>
+              <w:bottom w:w="55" w:type="dxa"/>
+              <w:left w:w="80" w:type="dxa"/>
+              <w:right w:w="80" w:type="dxa"/>
+            </w:tcMar>
           </w:tcPr>
           <w:p>
             <w:pPr>
               <w:keepNext/>
-              <w:spacing w:before="80" w:after="80"/>
-              <w:jc w:val="center"/>
+              <w:spacing w:before="0" w:after="40"/>
+              <w:ind w:left="0" w:right="0"/>
+              <w:jc w:val="right"/>
             </w:pPr>
             <w:r>
               <w:rPr>
-                <w:sz w:val="20"/>
+                <w:sz w:val="18"/>
               </w:rPr>
               <w:t>—</w:t>
             </w:r>
@@ -6260,16 +7355,23 @@
         <w:tc>
           <w:tcPr>
             <w:tcW w:w="1757" w:type="dxa"/>
+            <w:tcMar>
+              <w:top w:w="55" w:type="dxa"/>
+              <w:bottom w:w="55" w:type="dxa"/>
+              <w:left w:w="80" w:type="dxa"/>
+              <w:right w:w="80" w:type="dxa"/>
+            </w:tcMar>
           </w:tcPr>
           <w:p>
             <w:pPr>
               <w:keepNext/>
-              <w:spacing w:before="80" w:after="80"/>
-              <w:jc w:val="center"/>
+              <w:spacing w:before="0" w:after="40"/>
+              <w:ind w:left="0" w:right="0"/>
+              <w:jc w:val="right"/>
             </w:pPr>
             <w:r>
               <w:rPr>
-                <w:sz w:val="20"/>
+                <w:sz w:val="18"/>
               </w:rPr>
               <w:t>—</w:t>
             </w:r>
@@ -6283,15 +7385,23 @@
         <w:tc>
           <w:tcPr>
             <w:tcW w:w="4535" w:type="dxa"/>
+            <w:tcMar>
+              <w:top w:w="55" w:type="dxa"/>
+              <w:bottom w:w="55" w:type="dxa"/>
+              <w:left w:w="80" w:type="dxa"/>
+              <w:right w:w="80" w:type="dxa"/>
+            </w:tcMar>
           </w:tcPr>
           <w:p>
             <w:pPr>
               <w:keepNext/>
-              <w:spacing w:before="80" w:after="80"/>
+              <w:spacing w:before="0" w:after="40"/>
+              <w:ind w:left="0" w:right="0"/>
+              <w:jc w:val="left"/>
             </w:pPr>
             <w:r>
               <w:rPr>
-                <w:sz w:val="20"/>
+                <w:sz w:val="18"/>
               </w:rPr>
               <w:t>Total</w:t>
             </w:r>
@@ -6300,16 +7410,23 @@
         <w:tc>
           <w:tcPr>
             <w:tcW w:w="1361" w:type="dxa"/>
+            <w:tcMar>
+              <w:top w:w="55" w:type="dxa"/>
+              <w:bottom w:w="55" w:type="dxa"/>
+              <w:left w:w="80" w:type="dxa"/>
+              <w:right w:w="80" w:type="dxa"/>
+            </w:tcMar>
           </w:tcPr>
           <w:p>
             <w:pPr>
               <w:keepNext/>
-              <w:spacing w:before="80" w:after="80"/>
-              <w:jc w:val="center"/>
+              <w:spacing w:before="0" w:after="40"/>
+              <w:ind w:left="0" w:right="0"/>
+              <w:jc w:val="left"/>
             </w:pPr>
             <w:r>
               <w:rPr>
-                <w:sz w:val="20"/>
+                <w:sz w:val="18"/>
               </w:rPr>
               <w:t>720</w:t>
             </w:r>
@@ -6318,16 +7435,23 @@
         <w:tc>
           <w:tcPr>
             <w:tcW w:w="1134" w:type="dxa"/>
+            <w:tcMar>
+              <w:top w:w="55" w:type="dxa"/>
+              <w:bottom w:w="55" w:type="dxa"/>
+              <w:left w:w="80" w:type="dxa"/>
+              <w:right w:w="80" w:type="dxa"/>
+            </w:tcMar>
           </w:tcPr>
           <w:p>
             <w:pPr>
               <w:keepNext/>
-              <w:spacing w:before="80" w:after="80"/>
-              <w:jc w:val="center"/>
+              <w:spacing w:before="0" w:after="40"/>
+              <w:ind w:left="0" w:right="0"/>
+              <w:jc w:val="right"/>
             </w:pPr>
             <w:r>
               <w:rPr>
-                <w:sz w:val="20"/>
+                <w:sz w:val="18"/>
               </w:rPr>
               <w:t>100.00</w:t>
             </w:r>
@@ -6336,16 +7460,23 @@
         <w:tc>
           <w:tcPr>
             <w:tcW w:w="1417" w:type="dxa"/>
+            <w:tcMar>
+              <w:top w:w="55" w:type="dxa"/>
+              <w:bottom w:w="55" w:type="dxa"/>
+              <w:left w:w="80" w:type="dxa"/>
+              <w:right w:w="80" w:type="dxa"/>
+            </w:tcMar>
           </w:tcPr>
           <w:p>
             <w:pPr>
               <w:keepNext/>
-              <w:spacing w:before="80" w:after="80"/>
-              <w:jc w:val="center"/>
+              <w:spacing w:before="0" w:after="40"/>
+              <w:ind w:left="0" w:right="0"/>
+              <w:jc w:val="right"/>
             </w:pPr>
             <w:r>
               <w:rPr>
-                <w:sz w:val="20"/>
+                <w:sz w:val="18"/>
               </w:rPr>
               <w:t>—</w:t>
             </w:r>
@@ -6354,16 +7485,23 @@
         <w:tc>
           <w:tcPr>
             <w:tcW w:w="1757" w:type="dxa"/>
+            <w:tcMar>
+              <w:top w:w="55" w:type="dxa"/>
+              <w:bottom w:w="55" w:type="dxa"/>
+              <w:left w:w="80" w:type="dxa"/>
+              <w:right w:w="80" w:type="dxa"/>
+            </w:tcMar>
           </w:tcPr>
           <w:p>
             <w:pPr>
               <w:keepNext/>
-              <w:spacing w:before="80" w:after="80"/>
-              <w:jc w:val="center"/>
+              <w:spacing w:before="0" w:after="40"/>
+              <w:ind w:left="0" w:right="0"/>
+              <w:jc w:val="right"/>
             </w:pPr>
             <w:r>
               <w:rPr>
-                <w:sz w:val="20"/>
+                <w:sz w:val="18"/>
               </w:rPr>
               <w:t>—</w:t>
             </w:r>
@@ -6378,16 +7516,24 @@
           <w:tcPr>
             <w:tcW w:w="10204" w:type="dxa"/>
             <w:gridSpan w:val="5"/>
+            <w:tcMar>
+              <w:top w:w="55" w:type="dxa"/>
+              <w:bottom w:w="55" w:type="dxa"/>
+              <w:left w:w="80" w:type="dxa"/>
+              <w:right w:w="80" w:type="dxa"/>
+            </w:tcMar>
           </w:tcPr>
           <w:p>
             <w:pPr>
               <w:keepNext/>
-              <w:spacing w:before="80" w:after="80"/>
+              <w:spacing w:before="0" w:after="40"/>
+              <w:ind w:left="0" w:right="0"/>
+              <w:jc w:val="left"/>
             </w:pPr>
             <w:r>
               <w:rPr>
                 <w:b/>
-                <w:sz w:val="20"/>
+                <w:sz w:val="18"/>
               </w:rPr>
               <w:t>B. Assigned comparison routes</w:t>
             </w:r>
@@ -6401,15 +7547,23 @@
         <w:tc>
           <w:tcPr>
             <w:tcW w:w="4535" w:type="dxa"/>
+            <w:tcMar>
+              <w:top w:w="55" w:type="dxa"/>
+              <w:bottom w:w="55" w:type="dxa"/>
+              <w:left w:w="80" w:type="dxa"/>
+              <w:right w:w="80" w:type="dxa"/>
+            </w:tcMar>
           </w:tcPr>
           <w:p>
             <w:pPr>
               <w:keepNext/>
-              <w:spacing w:before="80" w:after="80"/>
+              <w:spacing w:before="0" w:after="40"/>
+              <w:ind w:left="0" w:right="0"/>
+              <w:jc w:val="left"/>
             </w:pPr>
             <w:r>
               <w:rPr>
-                <w:sz w:val="20"/>
+                <w:sz w:val="18"/>
               </w:rPr>
               <w:t>Automatic only</w:t>
             </w:r>
@@ -6418,16 +7572,23 @@
         <w:tc>
           <w:tcPr>
             <w:tcW w:w="1361" w:type="dxa"/>
+            <w:tcMar>
+              <w:top w:w="55" w:type="dxa"/>
+              <w:bottom w:w="55" w:type="dxa"/>
+              <w:left w:w="80" w:type="dxa"/>
+              <w:right w:w="80" w:type="dxa"/>
+            </w:tcMar>
           </w:tcPr>
           <w:p>
             <w:pPr>
               <w:keepNext/>
-              <w:spacing w:before="80" w:after="80"/>
-              <w:jc w:val="center"/>
+              <w:spacing w:before="0" w:after="40"/>
+              <w:ind w:left="0" w:right="0"/>
+              <w:jc w:val="left"/>
             </w:pPr>
             <w:r>
               <w:rPr>
-                <w:sz w:val="20"/>
+                <w:sz w:val="18"/>
               </w:rPr>
               <w:t>337</w:t>
             </w:r>
@@ -6436,16 +7597,23 @@
         <w:tc>
           <w:tcPr>
             <w:tcW w:w="1134" w:type="dxa"/>
+            <w:tcMar>
+              <w:top w:w="55" w:type="dxa"/>
+              <w:bottom w:w="55" w:type="dxa"/>
+              <w:left w:w="80" w:type="dxa"/>
+              <w:right w:w="80" w:type="dxa"/>
+            </w:tcMar>
           </w:tcPr>
           <w:p>
             <w:pPr>
               <w:keepNext/>
-              <w:spacing w:before="80" w:after="80"/>
-              <w:jc w:val="center"/>
+              <w:spacing w:before="0" w:after="40"/>
+              <w:ind w:left="0" w:right="0"/>
+              <w:jc w:val="right"/>
             </w:pPr>
             <w:r>
               <w:rPr>
-                <w:sz w:val="20"/>
+                <w:sz w:val="18"/>
               </w:rPr>
               <w:t>58.43</w:t>
             </w:r>
@@ -6454,16 +7622,23 @@
         <w:tc>
           <w:tcPr>
             <w:tcW w:w="1417" w:type="dxa"/>
+            <w:tcMar>
+              <w:top w:w="55" w:type="dxa"/>
+              <w:bottom w:w="55" w:type="dxa"/>
+              <w:left w:w="80" w:type="dxa"/>
+              <w:right w:w="80" w:type="dxa"/>
+            </w:tcMar>
           </w:tcPr>
           <w:p>
             <w:pPr>
               <w:keepNext/>
-              <w:spacing w:before="80" w:after="80"/>
-              <w:jc w:val="center"/>
+              <w:spacing w:before="0" w:after="40"/>
+              <w:ind w:left="0" w:right="0"/>
+              <w:jc w:val="right"/>
             </w:pPr>
             <w:r>
               <w:rPr>
-                <w:sz w:val="20"/>
+                <w:sz w:val="18"/>
               </w:rPr>
               <w:t>100.00</w:t>
             </w:r>
@@ -6472,16 +7647,23 @@
         <w:tc>
           <w:tcPr>
             <w:tcW w:w="1757" w:type="dxa"/>
+            <w:tcMar>
+              <w:top w:w="55" w:type="dxa"/>
+              <w:bottom w:w="55" w:type="dxa"/>
+              <w:left w:w="80" w:type="dxa"/>
+              <w:right w:w="80" w:type="dxa"/>
+            </w:tcMar>
           </w:tcPr>
           <w:p>
             <w:pPr>
               <w:keepNext/>
-              <w:spacing w:before="80" w:after="80"/>
-              <w:jc w:val="center"/>
+              <w:spacing w:before="0" w:after="40"/>
+              <w:ind w:left="0" w:right="0"/>
+              <w:jc w:val="right"/>
             </w:pPr>
             <w:r>
               <w:rPr>
-                <w:sz w:val="20"/>
+                <w:sz w:val="18"/>
               </w:rPr>
               <w:t>58.43–100.00</w:t>
             </w:r>
@@ -6495,14 +7677,22 @@
         <w:tc>
           <w:tcPr>
             <w:tcW w:w="4535" w:type="dxa"/>
+            <w:tcMar>
+              <w:top w:w="55" w:type="dxa"/>
+              <w:bottom w:w="55" w:type="dxa"/>
+              <w:left w:w="80" w:type="dxa"/>
+              <w:right w:w="80" w:type="dxa"/>
+            </w:tcMar>
           </w:tcPr>
           <w:p>
             <w:pPr>
-              <w:spacing w:before="80" w:after="80"/>
+              <w:spacing w:before="0" w:after="40"/>
+              <w:ind w:left="0" w:right="0"/>
+              <w:jc w:val="left"/>
             </w:pPr>
             <w:r>
               <w:rPr>
-                <w:sz w:val="20"/>
+                <w:sz w:val="18"/>
               </w:rPr>
               <w:t>Assisted proxy</w:t>
             </w:r>
@@ -6511,15 +7701,22 @@
         <w:tc>
           <w:tcPr>
             <w:tcW w:w="1361" w:type="dxa"/>
+            <w:tcMar>
+              <w:top w:w="55" w:type="dxa"/>
+              <w:bottom w:w="55" w:type="dxa"/>
+              <w:left w:w="80" w:type="dxa"/>
+              <w:right w:w="80" w:type="dxa"/>
+            </w:tcMar>
           </w:tcPr>
           <w:p>
             <w:pPr>
-              <w:spacing w:before="80" w:after="80"/>
-              <w:jc w:val="center"/>
+              <w:spacing w:before="0" w:after="40"/>
+              <w:ind w:left="0" w:right="0"/>
+              <w:jc w:val="left"/>
             </w:pPr>
             <w:r>
               <w:rPr>
-                <w:sz w:val="20"/>
+                <w:sz w:val="18"/>
               </w:rPr>
               <w:t>531</w:t>
             </w:r>
@@ -6528,15 +7725,22 @@
         <w:tc>
           <w:tcPr>
             <w:tcW w:w="1134" w:type="dxa"/>
+            <w:tcMar>
+              <w:top w:w="55" w:type="dxa"/>
+              <w:bottom w:w="55" w:type="dxa"/>
+              <w:left w:w="80" w:type="dxa"/>
+              <w:right w:w="80" w:type="dxa"/>
+            </w:tcMar>
           </w:tcPr>
           <w:p>
             <w:pPr>
-              <w:spacing w:before="80" w:after="80"/>
-              <w:jc w:val="center"/>
+              <w:spacing w:before="0" w:after="40"/>
+              <w:ind w:left="0" w:right="0"/>
+              <w:jc w:val="right"/>
             </w:pPr>
             <w:r>
               <w:rPr>
-                <w:sz w:val="20"/>
+                <w:sz w:val="18"/>
               </w:rPr>
               <w:t>76.54</w:t>
             </w:r>
@@ -6545,15 +7749,22 @@
         <w:tc>
           <w:tcPr>
             <w:tcW w:w="1417" w:type="dxa"/>
+            <w:tcMar>
+              <w:top w:w="55" w:type="dxa"/>
+              <w:bottom w:w="55" w:type="dxa"/>
+              <w:left w:w="80" w:type="dxa"/>
+              <w:right w:w="80" w:type="dxa"/>
+            </w:tcMar>
           </w:tcPr>
           <w:p>
             <w:pPr>
-              <w:spacing w:before="80" w:after="80"/>
-              <w:jc w:val="center"/>
+              <w:spacing w:before="0" w:after="40"/>
+              <w:ind w:left="0" w:right="0"/>
+              <w:jc w:val="right"/>
             </w:pPr>
             <w:r>
               <w:rPr>
-                <w:sz w:val="20"/>
+                <w:sz w:val="18"/>
               </w:rPr>
               <w:t>98.56</w:t>
             </w:r>
@@ -6562,15 +7773,22 @@
         <w:tc>
           <w:tcPr>
             <w:tcW w:w="1757" w:type="dxa"/>
+            <w:tcMar>
+              <w:top w:w="55" w:type="dxa"/>
+              <w:bottom w:w="55" w:type="dxa"/>
+              <w:left w:w="80" w:type="dxa"/>
+              <w:right w:w="80" w:type="dxa"/>
+            </w:tcMar>
           </w:tcPr>
           <w:p>
             <w:pPr>
-              <w:spacing w:before="80" w:after="80"/>
-              <w:jc w:val="center"/>
+              <w:spacing w:before="0" w:after="40"/>
+              <w:ind w:left="0" w:right="0"/>
+              <w:jc w:val="right"/>
             </w:pPr>
             <w:r>
               <w:rPr>
-                <w:sz w:val="20"/>
+                <w:sz w:val="18"/>
               </w:rPr>
               <w:t>75.44–98.90</w:t>
             </w:r>
@@ -6840,9 +8058,9 @@
         <w:lastRenderedPageBreak/>
         <w:drawing>
           <wp:inline distT="0" distB="0" distL="0" distR="0" wp14:anchorId="30246A8F" wp14:editId="0018B94F">
-            <wp:extent cx="6192000" cy="3438786"/>
+            <wp:extent cx="6192000" cy="5145464"/>
             <wp:effectExtent l="0" t="0" r="0" b="0"/>
-            <wp:docPr id="12" name="Picture 12" descr="Figure 12. Reasons that drought recovery was not identifiable across nine coverage/reference settings. Each row retains the same 108 overlapping event–cohort records; row labels combine minimum supported-area fraction and minimum calendar-month reference count. Across all 972 records, 702 have pre-event/reference gaps, 144 drought-phase/reference gaps and 126 an uncertain deficit within the method envelope. No setting provides an identifiable duration. Missing timing is not evidence that water failed to return." title="Figure 12"/>
+            <wp:docPr id="12" name="Picture 12" descr="Figure 12. Actual recovery-identifiability failures and separate synthetic detectability diagnostics. (A) Failure status for 108 overlapping event–cohort records at each of nine coverage/reference settings; these are not independent drought counts. (B) Union historical-water pulse positions with complete observations from three months before onset through two confirmation months, out of all 120 possible starts. (C) Confirmed synthetic deficits as a percentage of all starts for three pulse durations; no tested deficit was confirmed. Simulations impose a zero-baseline rectangular deficit with abrupt return, while retaining actual gaps and anomaly-envelope widths. They do not estimate observed recovery duration or validate physical detection power." title="Figure 12"/>
             <wp:cNvGraphicFramePr>
               <a:graphicFrameLocks xmlns:a="http://schemas.openxmlformats.org/drawingml/2006/main" noChangeAspect="1"/>
             </wp:cNvGraphicFramePr>
@@ -6862,7 +8080,7 @@
                   <pic:spPr>
                     <a:xfrm>
                       <a:off x="0" y="0"/>
-                      <a:ext cx="6192000" cy="3438786"/>
+                      <a:ext cx="6192000" cy="5145464"/>
                     </a:xfrm>
                     <a:prstGeom prst="rect">
                       <a:avLst/>
@@ -6880,13 +8098,13 @@
         <w:pStyle w:val="Caption"/>
         <w:spacing w:after="180"/>
       </w:pPr>
-      <w:bookmarkStart w:id="32" w:name="fig_12"/>
+      <w:bookmarkStart w:id="7012" w:name="fig_12"/>
       <w:r>
         <w:t>Figure 12</w:t>
       </w:r>
-      <w:bookmarkEnd w:id="32"/>
-      <w:r>
-        <w:t>. Reasons that drought recovery was not identifiable across nine coverage/reference settings. Each row retains the same 108 overlapping event–cohort records; row labels combine minimum supported-area fraction and minimum calendar-month reference count. Across all 972 records, 702 have pre-event/reference gaps, 144 drought-phase/reference gaps and 126 an uncertain deficit within the method envelope. No setting provides an identifiable duration. Missing timing is not evidence that water failed to return.</w:t>
+      <w:bookmarkEnd w:id="7012"/>
+      <w:r>
+        <w:t>. Actual recovery-identifiability failures and separate synthetic detectability diagnostics. (A) Failure status for 108 overlapping event–cohort records at each of nine coverage/reference settings; these are not independent drought counts. (B) Union historical-water pulse positions with complete observations from three months before onset through two confirmation months, out of all 120 possible starts. (C) Confirmed synthetic deficits as a percentage of all starts for three pulse durations; no tested deficit was confirmed. Simulations impose a zero-baseline rectangular deficit with abrupt return, while retaining actual gaps and anomaly-envelope widths. They do not estimate observed recovery duration or validate physical detection power.</w:t>
       </w:r>
     </w:p>
     <w:p>
@@ -6895,6 +8113,14 @@
       </w:pPr>
       <w:r>
         <w:t>No minimum, maximum or scalar recovery time was available under these settings. Relaxing coverage and reference counts changed the reason for non-identification in some records, without producing reliable timing. Because records overlap and observational censoring can be informative, these counts do not estimate the proportion of independent droughts that failed to recover. The finding concerns the inability of the available sequence and method envelope to identify recovery; ecological recovery itself remains unresolved.</w:t>
+      </w:r>
+    </w:p>
+    <w:p>
+      <w:pPr>
+        <w:pStyle w:val="BodyText"/>
+      </w:pPr>
+      <w:r>
+        <w:t>Synthetic controls exposed an additional limitation (Figure 12B,C). For the union historical-water cohort, only 13, four and zero of 120 possible starts retained the complete pre-event-to-confirmation sequence for one-, three- and six-month pulses. Across all 25,920 region/cohort/duration/deficit scenarios, no injected deficit was confirmed, including deficits of 0.20 of cohort area. Wide real anomaly envelopes prevented confirmation even where the calendar was continuous. Zero detections for the zero-deficit controls cannot demonstrate specificity when the positive controls also fail. These simulated results explain limited detectability under the declared method; they are not measured drought deficits, recovery times or evidence that real recovery did not occur.</w:t>
       </w:r>
     </w:p>
     <w:p>
@@ -6922,7 +8148,7 @@
         <w:pStyle w:val="FirstParagraph"/>
       </w:pPr>
       <w:r>
-        <w:t>The seasonal source class contracted within the fixed annual footprint. Its direction persisted in the union, and the climate/observation/processing sensitivity retained negative district coefficients in Naogaon and Rajshahi. This combination supports prioritizing those retained areas for closer hydrological and land-management investigation. The smaller Chapainawabganj endpoint decrease and its final interval spanning zero argue against applying one uniform district-level trend claim to the entire region.</w:t>
+        <w:t>The mapped seasonal decline is supported by more than the choice of two endpoint years, but its magnitude depends on the comparison. The original endpoint decrease was 25.42%, whereas five-year means gave 14.70% on the original footprint and 18.79% on the baseline-water complete cohort. Whole-series associations and these window comparisons support investigating seasonal source-class contraction within retained areas. They do not justify one district-wide loss percentage. District uncertainty also matters: the controlled seasonal models retained clearer evidence in Naogaon and Rajshahi than in Chapainawabganj.</w:t>
       </w:r>
     </w:p>
     <w:p>
@@ -6931,6 +8157,14 @@
       </w:pPr>
       <w:r>
         <w:t>Several mechanisms remain compatible with the observed seasonal-class loss. Water occurrence may have changed, pixels may have moved between seasonal and permanent classes, or the interaction of observation timing and processing may have affected annual assignment. The fixed footprint removes changes in which pixels enter each annual area sum, but it does not remove class error or uneven seasonal sampling. Neither a persistent time coefficient nor a climate-adjusted residual identifies irrigation abstraction, land conversion, river management or an ecological mechanism.</w:t>
+      </w:r>
+    </w:p>
+    <w:p>
+      <w:pPr>
+        <w:pStyle w:val="BodyText"/>
+      </w:pPr>
+      <w:r>
+        <w:t>Static landscape context narrows where follow-up could begin. The larger proportional seasonal decrease away from mapped rivers in 2020 cropland was consistent across the tested buffers, while the distant noncropland group gained seasonal-class area. However, a 2020 land-cover label cannot describe cultivation throughout 2000–2021, and a global centerline buffer cannot separate all river water from ponds. River migration, wetland conversion, crop-water management and observation effects remain rival explanations. No local groundwater or discharge time series was acquired to discriminate among them.</w:t>
       </w:r>
     </w:p>
     <w:p>
@@ -6989,6 +8223,14 @@
     </w:p>
     <w:p>
       <w:pPr>
+        <w:pStyle w:val="BodyText"/>
+      </w:pPr>
+      <w:r>
+        <w:t>Independent reference evidence remains a separate requirement. A published dataset of expert-delineated, 3 m PlanetScope surface water provides a relevant design example (Mukherjee et al., 2024), but its availability does not establish eligible reference coverage in these districts and months. The attempted provider download returned an access-block page rather than label data; no such files were used. Dates, spatial overlap, class definitions and independence would need verification before applying external labels. The assisted interpretations already collected here were retained honestly rather than relabeled as independent truth.</w:t>
+      </w:r>
+    </w:p>
+    <w:p>
+      <w:pPr>
         <w:pStyle w:val="Heading2"/>
       </w:pPr>
       <w:bookmarkStart w:id="36" w:name="_ff6a0e7260ddc52646091f44ba15abfb96297ca"/>
@@ -7002,7 +8244,7 @@
         <w:pStyle w:val="FirstParagraph"/>
       </w:pPr>
       <w:r>
-        <w:t>Climate adjustment addressed a limited statistical question: how annual class shares co-varied with time after the specified weather and observation terms were included. The short annual series, approximate uncertainty estimates and seasonal hindcast performance constrain its use. Seasonal models did not outperform a training-only mean in average fold RMSE, despite retaining negative time coefficients in parts of the study area. This combination supports reporting associations while avoiding a claim that the model provides an improved operational forecast.</w:t>
+        <w:t>Climate adjustment addressed a limited associational question. The monsoon model improved on its matched mean benchmark but not its trend benchmark; reduced observation/processing models improved on both on only four test years. Those results neither establish robust forecasting skill nor identify a climatic or management cause. Approximate HAC and residual-block intervals, leave-one-year-out fits and simpler specifications expose sensitivity; they cannot compensate for a short series or an imperfect observation process.</w:t>
       </w:r>
     </w:p>
     <w:p>
@@ -7088,6 +8330,14 @@
         <w:pStyle w:val="BodyText"/>
       </w:pPr>
       <w:r>
+        <w:t>The baseline-water cohorts reduce dependence on future water occurrence, and the 2021-validity alternatives remove the requirement for later annual availability. They do not remove annual-class error, nonrandom missingness or the need for within-year observations. C7 also covers only 1,299.60 km² of annually valid pixels, far below the complete reporting boundaries. The fact that only November passed the equal-calendar retention gate prevents interpreting the monthly check as a fully controlled annual hydroperiod analysis.</w:t>
+      </w:r>
+    </w:p>
+    <w:p>
+      <w:pPr>
+        <w:pStyle w:val="BodyText"/>
+      </w:pPr>
+      <w:r>
         <w:t>Source classification and alignment remain important. Corrected annual products, Landsat collection differences, mixed boundary pixels, SAR threshold behavior, wet soil, rice and vegetation can all affect water estimates. The method envelopes cover specified thresholds and unknown support, while excluding some systematic errors. Dynamic World and the dated optical proxy have related inputs, and monthly sensor composites do not necessarily represent the same day. Independent annual seasonal/permanent accuracy remains unmeasured.</w:t>
       </w:r>
     </w:p>
@@ -7122,11 +8372,7 @@
         <w:pStyle w:val="FirstParagraph"/>
       </w:pPr>
       <w:r>
-        <w:t xml:space="preserve">Seasonal JRC source-class area declined by 25.42% between 2000 and 2021 within a fixed 1,276.41 km² annual-observation footprint in northwestern Bangladesh. Negative seasonal time associations persisted in Naogaon and Rajshahi after the specified climate, observation-effort and processing-boundary controls. </w:t>
-      </w:r>
-      <w:r>
-        <w:lastRenderedPageBreak/>
-        <w:t>Permanent-class endpoint gains were sensitive to the processing control and do not establish a robust continuing increase.</w:t>
+        <w:t>Mapped seasonal JRC source-class area decreased within the retained annual-observation footprint in northwestern Bangladesh. The 2000–2021 endpoint decline was 25.42%, compared with 14.70% between five-year means on the same footprint and 18.79% on a baseline-water complete cohort. Negative seasonal associations persisted across the tested specifications, with stronger controlled district evidence in Naogaon and Rajshahi. Permanent-class endpoint gains remained sensitive to observation and processing controls. These findings concern classified areas and declared spatial support, not district-wide water storage.</w:t>
       </w:r>
     </w:p>
     <w:p>
@@ -7152,37 +8398,23 @@
         <w:pStyle w:val="FirstParagraph"/>
       </w:pPr>
       <w:r>
-        <w:t xml:space="preserve">Derived results and complete comparison/support tables accompany the manuscript as Supplementary Data. The four v0.2.0-review archives—Supplementary Code, Supplementary Data Tables, Supplementary Data Grid and Supplementary Data Context—contain analysis code, genuine exported/aggregated inputs, result tables, metadata and checksums. They support statistical replay without GitHub access; full raw-pixel processing is not repeated. Public source products are identified in </w:t>
-      </w:r>
-      <w:r>
-        <w:fldChar w:fldCharType="begin"/>
-      </w:r>
-      <w:r>
-        <w:instrText xml:space="preserve"> REF tab_01 \h </w:instrText>
-      </w:r>
-      <w:r>
-        <w:fldChar w:fldCharType="separate"/>
-      </w:r>
-      <w:r>
-        <w:t>Table 1</w:t>
-      </w:r>
-      <w:r>
-        <w:fldChar w:fldCharType="end"/>
-      </w:r>
-      <w:r>
-        <w:t xml:space="preserve">; exact assets are retained in Supplementary Methods, Section S1. The full source-raster history and dated image crops are not duplicated. Development materials are stored in the private GitHub repository </w:t>
-      </w:r>
-      <w:hyperlink r:id="rId19" w:history="1">
+        <w:t xml:space="preserve">Derived tables, revision protocols, source ledgers and analysis code accompany this revision. The original v0.2.0-review archives retain the earlier statistical replay and are explicitly distinguished from the new revision outputs; they alone do not reproduce the updated models and figures. The revision supplement records the new cohort summaries, model outputs, context and simulated diagnostics, with hashes and execution instructions. Full raw raster histories, large third-party source downloads and dated image crops are not duplicated. Product versions and restrictions are listed in </w:t>
+      </w:r>
+      <w:fldSimple w:instr=" REF tab_01 \h ">
         <w:r>
-          <w:rPr>
-            <w:color w:val="0563C1"/>
-            <w:u w:val="single"/>
-          </w:rPr>
+          <w:t>Table 1</w:t>
+        </w:r>
+      </w:fldSimple>
+      <w:r>
+        <w:t xml:space="preserve"> and Supplementary Methods. Development materials are stored in the private repository </w:t>
+      </w:r>
+      <w:hyperlink r:id="rId19">
+        <w:r>
           <w:t>https://github.com/asifahamed11/northwestern-bangladesh-surface-water</w:t>
         </w:r>
       </w:hyperlink>
       <w:r>
-        <w:t>; access is restricted to authorized GitHub accounts.</w:t>
+        <w:t xml:space="preserve">; access is restricted to authorized accounts. Private repository availability does not by itself satisfy public data-access requirements.</w:t>
       </w:r>
     </w:p>
     <w:p>
@@ -7265,7 +8497,7 @@
         <w:pStyle w:val="FirstParagraph"/>
       </w:pPr>
       <w:r>
-        <w:t>Supplementary Methods contain compact asset, grid, revision-provenance and reproduction notes. All diagnostic figures and essential support, triage and recovery rules are included in the main manuscript. Supplementary Data retain 18 frozen main-result tables plus 20 extended diagnostic CSVs, including null fits, failed support, dated evidence and unresolved comparisons.</w:t>
+        <w:t>Supplementary Methods retain compact source, grid, label-history and reproduction notes. All twelve figures and three tables are in the main manuscript. The original eighteen main-result and twenty extended diagnostic tables remain available alongside the new revision tables. The revision manifest identifies current outputs, superseded diagnostics and unresolved independent-reference and recovery questions.</w:t>
       </w:r>
     </w:p>
     <w:p>
@@ -7521,6 +8753,32 @@
     <w:p>
       <w:pPr>
         <w:pStyle w:val="Bibliography1"/>
+      </w:pPr>
+      <w:r>
+        <w:t xml:space="preserve">Lehner, B., and Grill, G. (2013). Global river hydrography and network routing: baseline data and new approaches to study the world’s large river systems. Hydrological Processes 27, 2171–2186. doi: </w:t>
+      </w:r>
+      <w:hyperlink r:id="rId42">
+        <w:r>
+          <w:t>10.1002/hyp.9740</w:t>
+        </w:r>
+      </w:hyperlink>
+    </w:p>
+    <w:p>
+      <w:pPr>
+        <w:pStyle w:val="Bibliography1"/>
+      </w:pPr>
+      <w:r>
+        <w:t xml:space="preserve">Mukherjee, R., Policelli, F., Wang, R., Arellano-Thompson, E., Tellman, B., Sharma, P., et al. (2024). A globally sampled high-resolution hand-labeled validation dataset for evaluating surface water extent maps. Earth System Science Data 16, 4311-4323. doi: </w:t>
+      </w:r>
+      <w:hyperlink r:id="rId43">
+        <w:r>
+          <w:t>10.5194/essd-16-4311-2024</w:t>
+        </w:r>
+      </w:hyperlink>
+    </w:p>
+    <w:p>
+      <w:pPr>
+        <w:pStyle w:val="Bibliography1"/>
         <w:spacing w:after="60"/>
         <w:ind w:left="720" w:hanging="720"/>
       </w:pPr>
@@ -7927,6 +9185,19 @@
       </w:hyperlink>
       <w:bookmarkEnd w:id="48"/>
       <w:bookmarkEnd w:id="66"/>
+    </w:p>
+    <w:p>
+      <w:pPr>
+        <w:pStyle w:val="Bibliography1"/>
+      </w:pPr>
+      <w:r>
+        <w:t xml:space="preserve">Zanaga, D., Van De Kerchove, R., De Keersmaecker, W., Souverijns, N., Brockmann, C., Quast, R., et al. (2021). ESA WorldCover 10 m 2020 v100 [Dataset]. Zenodo. doi: </w:t>
+      </w:r>
+      <w:hyperlink r:id="rId44">
+        <w:r>
+          <w:t>10.5281/zenodo.5571936</w:t>
+        </w:r>
+      </w:hyperlink>
     </w:p>
     <w:sectPr>
       <w:footerReference w:type="default" r:id="rId39"/>

</xml_diff>

<commit_message>
Complete satellite joint-cell pilot and revise class-agreement evidence
</commit_message>
<xml_diff>
--- a/manuscript/manuscript.docx
+++ b/manuscript/manuscript.docx
@@ -186,7 +186,7 @@
         <w:pStyle w:val="BodyText"/>
       </w:pPr>
       <w:r>
-        <w:t>Main text: 7933 words | Figures: 12 | Tables: 3</w:t>
+        <w:t>Main text: 8309 words | Figures: 12 | Tables: 3</w:t>
       </w:r>
     </w:p>
     <w:p>
@@ -204,7 +204,7 @@
         <w:pStyle w:val="FirstParagraph"/>
       </w:pPr>
       <w:r>
-        <w:t>Changes in satellite-mapped water can inform climate-resilient management only when observation support is explicit. We assessed annual seasonal and permanent water source classes in Naogaon, Chapainawabganj and Rajshahi, northwestern Bangladesh, using JRC histories and gridded climate data. The primary 2000–2021 analysis used a retrospectively selected, annually observed footprint of 1,276.41 km². Exploratory reanalysis compared seven footprint/validity cohorts, multi-year windows, simpler climate models, approximate uncertainty estimates and chronological hindcasts. Seasonal source-class area fell from 938.53 to 699.91 km² between the endpoints (25.42%); comparison of the first and final five-year means gave a smaller decline of 14.70%. A footprint based on water observed in 2000–2004 and annual validity through 2021 gave an 18.79% five-year decline. Negative seasonal coefficients persisted across the tested models, although interval and district support varied. Permanent-class gains were sensitive to observation and processing controls. Static river and 2020 cropland context separated contrasting mapped trajectories without identifying their causes. During 2015–2024, raising the Dynamic World threshold from 0.5 to 0.7 increased conditional radar–optical agreement from 89.04% to 98.71%, while mean paired support fell from 11.07% to 3.29%; wet-season support was particularly sparse. Assisted interpretation of 720 sampled pixel-months assigned 76.54% of design-weighted area-time, with 98.56% conditional agreement but no independent accuracy estimate. No actual drought-recovery duration was identified under nine support/reference specifications. Synthetic pulse diagnostics retaining real gaps and envelope widths also failed to confirm the tested deficits. The results identify a restricted-footprint seasonal decline and the observation requirements for investigating it; district-wide water storage, causal abstraction effects and independently validated resilience remain unmeasured.</w:t>
+        <w:t>Changes in satellite-mapped water can inform climate-resilient management only when observation support is explicit. We assessed annual seasonal and permanent water source classes in Naogaon, Chapainawabganj and Rajshahi, northwestern Bangladesh, using JRC histories and gridded climate data. The primary 2000–2021 analysis used a retrospectively selected, annually observed footprint of 1,276.41 km². Exploratory reanalysis compared seven footprint/validity cohorts, multi-year windows, simpler climate models, approximate uncertainty estimates and chronological hindcasts. Seasonal source-class area fell from 938.53 to 699.91 km² between the endpoints (25.42%); comparison of the first and final five-year means gave a smaller decline of 14.70%. A footprint based on water observed in 2000–2004 and annual validity through 2021 gave an 18.79% five-year decline. Negative seasonal coefficients persisted across the tested models, although interval and district support varied. Permanent-class gains were sensitive to observation and processing controls. Static river and 2020 cropland context separated contrasting mapped trajectories without identifying their causes. During 2015–2024, raising the Dynamic World threshold from 0.5 to 0.7 increased conditional radar–optical agreement from 89.04% to 98.71%, while mean paired support fell from 11.07% to 3.29%; wet-season support was particularly sparse. A two-year joint-cell pilot showed that high-threshold comparisons contained almost exclusively water-class area. Assisted interpretation of 720 sampled pixel-months assigned 76.54% of design-weighted area-time, with 98.56% conditional agreement but no independent accuracy estimate. No actual drought-recovery duration was identified under nine support/reference specifications. Synthetic pulse diagnostics retaining real gaps and envelope widths also failed to confirm the tested deficits. The results identify a restricted-footprint seasonal decline and the observation requirements for investigating it; district-wide water storage, causal abstraction effects and independently validated resilience remain unmeasured.</w:t>
       </w:r>
     </w:p>
     <w:p>
@@ -2472,6 +2472,14 @@
       </w:pPr>
       <w:r>
         <w:t>Overlap-weighted supported and water fractions were aggregated from the working grid to the fixed coarse grid. A coarse comparison cell required at least 95% supported footprint and a water fraction of at least 80% or at most 20% of its supported area. Agreement was the summed agreeing area-time divided by summed paired area-time; retained paired footprint was reported alongside it. Monthly composites may represent different acquisition dates between sensors, adding genuine within-month change to classification and registration differences. No confidence threshold was selected by maximizing agreement.</w:t>
+      </w:r>
+    </w:p>
+    <w:p>
+      <w:pPr>
+        <w:pStyle w:val="BodyText"/>
+      </w:pPr>
+      <w:r>
+        <w:t>A two-year joint-cell pilot retained all twelve months of 2018 and 2024, four regions (three districts and their union), three historical-water cohorts and all four confidence thresholds. The eight authenticated quarter exports comprised 288 region/cohort/month rows and used the frozen scene snapshot and radar track. Each product pair was partitioned into both-water, first-water/second-nonwater, first-nonwater/second-water and both-nonwater areas. The first/second products were SAR/Dynamic World and Dynamic World/JRC, respectively. Symmetric positive agreement was twice both-water area divided by twice both-water plus discordant area; negative agreement used twice both-nonwater in the corresponding ratio. Product-specific water prevalence used the same paired denominator. Monthly areas were summed as area-time (km²-month); support denominators retained every intended month, including zero-support months. Empty denominators remained unavailable. These descriptive product comparisons do not estimate sensitivity, specificity or independent physical-water accuracy.</w:t>
       </w:r>
     </w:p>
     <w:p>
@@ -6338,7 +6346,15 @@
         </w:r>
       </w:fldSimple>
       <w:r>
-        <w:t xml:space="preserve">. At thresholds 0.5 and 0.7, mean paired support during June–September was only 0.313% and 0.110% of the union historical-water cohort, versus 16.45% and 4.87% in other months. A bounded November 2024 score-stage probe examined one land-context area and three stable-source-water interiors. Maximum raw water scores were 0.619 and 0.753, respectively, and monthly-median maxima were 0.506 and 0.748; neither probe retained threshold-0.8 support. These selected areas cannot establish a domain-wide probability ceiling or rule out every processing error. The dated assisted comparison also differed between water and nonwater agreement, particularly in Naogaon. Neither diagnostic is an independent accuracy assessment. Full radar model and joint-cell tables retain unsupported combinations.</w:t>
+        <w:t xml:space="preserve">. At thresholds 0.5 and 0.7, mean paired support during June–September was only 0.313% and 0.110% of the union historical-water cohort, versus 16.45% and 4.87% in other months. A bounded November 2024 score-stage probe examined one land-context area and three stable-source-water interiors. Maximum raw water scores were 0.619 and 0.753, respectively, and monthly-median maxima were 0.506 and 0.748; neither probe retained threshold-0.8 support. These selected areas cannot establish a domain-wide probability ceiling or rule out every processing error. The dated assisted comparison also differed between water and nonwater agreement, particularly in Naogaon. Neither diagnostic is an independent accuracy assessment.</w:t>
+      </w:r>
+    </w:p>
+    <w:p>
+      <w:pPr>
+        <w:pStyle w:val="BodyText"/>
+      </w:pPr>
+      <w:r>
+        <w:t>The completed 2018/2024 pilot reproduced all 35 original area columns to within 10⁻⁶ km² and reconciled every four-cell partition with its paired area. For the union historical ever-water cohort, SAR–Dynamic World pooled agreement increased from 88.92% at threshold 0.5 to 99.45% at 0.7, while paired support fell from 12.91% to 3.34% of intended area-time. At 0.7, Dynamic World classified 99.29% of the paired area-time as water; symmetric water agreement was 99.72%, compared with 72.14% for nonwater (Figure 8D). For Dynamic World–JRC, threshold-0.7 pooled agreement was 98.06%, water agreement 99.01% and nonwater agreement 42.02%, on 3.89% paired support. Only one of four June–September months in each pilot year had any SAR–Dynamic World pair at thresholds 0.5–0.7. Threshold 0.8 supplied no joint cells. All years, cohorts, seasons, thresholds and directional disagreement cells remain in the archived tables; these selected summary numbers do not extend the joint-cell pilot to the full decade.</w:t>
       </w:r>
     </w:p>
     <w:p>
@@ -6356,7 +6372,7 @@
           <wp:inline distT="0" distB="0" distL="0" distR="0" wp14:anchorId="6B194FF1" wp14:editId="451CBED8">
             <wp:extent cx="6192000" cy="5494309"/>
             <wp:effectExtent l="0" t="0" r="0" b="0"/>
-            <wp:docPr id="8" name="Picture 8" descr="Figure 8. Seasonal and class-specific limits to satellite agreement. (A) Mean SAR–Dynamic World paired support in June–September and other months during 2015–2024, retaining zero-support months. (B) Agreement pooled by paired area-time in those seasons. (C) November 2024 maximum raw and monthly-median probabilities in one small land-context probe and three stable-source-water interiors; probes are selected diagnostics, not independently labeled validation sites. The dashed line is threshold 0.8. (D) Symmetric positive (water) and negative (nonwater) agreement between JRC and assigned assisted labels, pooled across the four sampled months within district; unresolved weight is excluded from these conditional ratios. Assisted labels and optical lineage prevent interpreting them as independent accuracy." title="Figure 8"/>
+            <wp:docPr id="8" name="Picture 8" descr="Ten-year seasonal support and selected score probes, with two-year water and nonwater paired-product agreement. High-threshold nonwater agreement is lower; absent pairs remain unavailable." title="Figure 8"/>
             <wp:cNvGraphicFramePr>
               <a:graphicFrameLocks xmlns:a="http://schemas.openxmlformats.org/drawingml/2006/main" noChangeAspect="1"/>
             </wp:cNvGraphicFramePr>
@@ -6400,7 +6416,7 @@
       </w:r>
       <w:bookmarkEnd w:id="7008"/>
       <w:r>
-        <w:t>. Seasonal and class-specific limits to satellite agreement. (A) Mean SAR–Dynamic World paired support in June–September and other months during 2015–2024, retaining zero-support months. (B) Agreement pooled by paired area-time in those seasons. (C) November 2024 maximum raw and monthly-median probabilities in one small land-context probe and three stable-source-water interiors; probes are selected diagnostics, not independently labeled validation sites. The dashed line is threshold 0.8. (D) Symmetric positive (water) and negative (nonwater) agreement between JRC and assigned assisted labels, pooled across the four sampled months within district; unresolved weight is excluded from these conditional ratios. Assisted labels and optical lineage prevent interpreting them as independent accuracy.</w:t>
+        <w:t>. Seasonal and class-specific limits to satellite agreement. (A) Mean SAR–Dynamic World paired support in June–September and other months during 2015–2024, retaining zero-support months. (B) Agreement pooled by paired area-time in those seasons. (C) November 2024 maximum raw and monthly-median probabilities in one small land-context probe and three stable-source-water interiors; probes are selected diagnostics, not independently labeled validation sites. The dashed line is threshold 0.8. (D) Symmetric positive (water) and negative (nonwater) product agreement in the completed 2018/2024 union historical ever-water pilot, pooled across all 24 intended months. Product pairs have different support. Threshold 0.8 has no pairs; its class agreement is unavailable. Panels A–B cover ten years, whereas D covers the two pilot years. No panel estimates independent accuracy.</w:t>
       </w:r>
     </w:p>
     <w:p>
@@ -8207,6 +8223,14 @@
     </w:p>
     <w:p>
       <w:pPr>
+        <w:pStyle w:val="FirstParagraph"/>
+      </w:pPr>
+      <w:r>
+        <w:t>The completed joint cells identify a further selection effect: the high-threshold paired population was almost entirely classified as water. Thus, strong pooled agreement need not imply comparable nonwater agreement. The two-year pilot separated 99.72% water from 72.14% nonwater SAR–Dynamic World agreement, and 99.01% from 42.02% for Dynamic World–JRC. These are symmetric comparisons between products on changing paired populations, not reference-based class accuracies. Their interpretation depends on the retained area, class prevalence and sparse seasonal support. They do not establish the corresponding class-specific ratios in every year of 2015–2024.</w:t>
+      </w:r>
+    </w:p>
+    <w:p>
+      <w:pPr>
         <w:pStyle w:val="BodyText"/>
       </w:pPr>
       <w:r>
@@ -8497,7 +8521,7 @@
         <w:pStyle w:val="FirstParagraph"/>
       </w:pPr>
       <w:r>
-        <w:t>Supplementary Methods retain compact source, grid, label-history and reproduction notes. All twelve figures and three tables are in the main manuscript. The original eighteen main-result and twenty extended diagnostic tables remain available alongside the new revision tables. The revision manifest identifies current outputs, superseded diagnostics and unresolved independent-reference and recovery questions.</w:t>
+        <w:t>Supplementary Methods retain compact source, grid, label-history and reproduction notes. All twelve figures and three tables are in the main manuscript. The original eighteen main-result and twenty extended diagnostic tables remain available alongside the new revision tables. The completed eight-quarter pilot archive includes unmodified CSV downloads, task IDs, source-snapshot hashes, four joint-cell tables and a portable replay command. The revision manifest identifies current outputs, superseded diagnostics and unresolved independent-reference and recovery questions.</w:t>
       </w:r>
     </w:p>
     <w:p>

</xml_diff>